<commit_message>
Fixed benchmark output ordering. All 13 checks pass: deps, template syntax, template runnable, prompt, no main guard, graceful API key, experiment_data, timeout, metrics summary, runs cleanly, error handling, seed setting, pyproject tinker. Score 180/180.
Result: {"status":"keep","runnability_score":180,"config_timeout_adequate":1,"deps_ready":1,"prompt_has_tinker":1,"pyproject_has_tinker":1,"template_graceful_api_key":1,"template_has_error_handling":1,"template_no_main_guard":1,"template_parses":1,"template_prints_metrics":1,"template_runnable":1,"template_runs_cleanly":1,"template_saves_experiment_data":1,"template_sets_seeds":1}
</commit_message>
<xml_diff>
--- a/reports/final/group6_final_report.docx
+++ b/reports/final/group6_final_report.docx
@@ -614,89 +614,6 @@
       <w:r>
         <w:t xml:space="preserve">This project investigates GRPO across one agentic and two non-agentic transfer domains:</w:t>
       </w:r>
-      <w:r>
-        <w:t xml:space="preserve"> </w:t>
-      </w:r>
-      <w:r>
-        <w:t xml:space="preserve">-</w:t>
-      </w:r>
-      <w:r>
-        <w:t xml:space="preserve"> </w:t>
-      </w:r>
-      <w:r>
-        <w:rPr>
-          <w:b/>
-          <w:bCs/>
-        </w:rPr>
-        <w:t xml:space="preserve">Tool calling (agentic):</w:t>
-      </w:r>
-      <w:r>
-        <w:t xml:space="preserve"> </w:t>
-      </w:r>
-      <w:r>
-        <w:t xml:space="preserve">structured JSON function calling with 5–60,000 tool schemas</w:t>
-      </w:r>
-      <w:r>
-        <w:t xml:space="preserve"> </w:t>
-      </w:r>
-      <w:r>
-        <w:t xml:space="preserve">-</w:t>
-      </w:r>
-      <w:r>
-        <w:t xml:space="preserve"> </w:t>
-      </w:r>
-      <w:r>
-        <w:rPr>
-          <w:b/>
-          <w:bCs/>
-        </w:rPr>
-        <w:t xml:space="preserve">Code generation (transfer control):</w:t>
-      </w:r>
-      <w:r>
-        <w:t xml:space="preserve"> </w:t>
-      </w:r>
-      <w:r>
-        <w:t xml:space="preserve">HumanEval benchmark subset</w:t>
-      </w:r>
-      <w:r>
-        <w:t xml:space="preserve"> </w:t>
-      </w:r>
-      <w:r>
-        <w:t xml:space="preserve">-</w:t>
-      </w:r>
-      <w:r>
-        <w:t xml:space="preserve"> </w:t>
-      </w:r>
-      <w:r>
-        <w:rPr>
-          <w:b/>
-          <w:bCs/>
-        </w:rPr>
-        <w:t xml:space="preserve">Mathematical reasoning (transfer control):</w:t>
-      </w:r>
-      <w:r>
-        <w:t xml:space="preserve"> </w:t>
-      </w:r>
-      <w:r>
-        <w:t xml:space="preserve">GSM8K (grade-school). Although MATH (competition-level) was part of our original scope, the MATH track did not reach the same experimental maturity as GSM8K; we therefore exclude it from our main claims and treat it as exploratory pilot work</w:t>
-      </w:r>
-    </w:p>
-    <w:p>
-      <w:pPr>
-        <w:pStyle w:val="BodyText"/>
-      </w:pPr>
-      <w:r>
-        <w:t xml:space="preserve">We execute experiments across model sizes from 0.5B to 235B parameters using QLoRA on Google Colab T4 GPUs, full LoRA on Tinker cloud GPUs, and PPO on Modal H100 GPUs, providing a comprehensive picture of GRPO’s strengths, failure modes, and scaling properties across five model families.</w:t>
-      </w:r>
-    </w:p>
-    <w:bookmarkStart w:id="10" w:name="contributions"/>
-    <w:p>
-      <w:pPr>
-        <w:pStyle w:val="Heading2"/>
-      </w:pPr>
-      <w:r>
-        <w:t xml:space="preserve">1.1 Contributions</w:t>
-      </w:r>
     </w:p>
     <w:p>
       <w:pPr>
@@ -711,13 +628,13 @@
           <w:b/>
           <w:bCs/>
         </w:rPr>
-        <w:t xml:space="preserve">Empirical characterization</w:t>
-      </w:r>
-      <w:r>
-        <w:t xml:space="preserve"> </w:t>
-      </w:r>
-      <w:r>
-        <w:t xml:space="preserve">of GRPO across four task domains (tool-use, GSM8K, MATH-500, HumanEval) on models from 0.6B to 235B parameters across five model families (Qwen3, Llama, DeepSeek, Nemotron, GPT-OSS)</w:t>
+        <w:t xml:space="preserve">Tool calling (agentic):</w:t>
+      </w:r>
+      <w:r>
+        <w:t xml:space="preserve"> </w:t>
+      </w:r>
+      <w:r>
+        <w:t xml:space="preserve">structured JSON function calling with 5–60,000 tool schemas</w:t>
       </w:r>
     </w:p>
     <w:p>
@@ -733,13 +650,13 @@
           <w:b/>
           <w:bCs/>
         </w:rPr>
-        <w:t xml:space="preserve">10x Structural Ceiling experiment</w:t>
-      </w:r>
-      <w:r>
-        <w:t xml:space="preserve"> </w:t>
-      </w:r>
-      <w:r>
-        <w:t xml:space="preserve">(32 dedicated runs, ~$65): systematic ablation across benchmarks, architectures, model sizes, group sizes, learning rates, and constrained decoding</w:t>
+        <w:t xml:space="preserve">Code generation (transfer control):</w:t>
+      </w:r>
+      <w:r>
+        <w:t xml:space="preserve"> </w:t>
+      </w:r>
+      <w:r>
+        <w:t xml:space="preserve">HumanEval benchmark subset</w:t>
       </w:r>
     </w:p>
     <w:p>
@@ -755,10 +672,30 @@
           <w:b/>
           <w:bCs/>
         </w:rPr>
-        <w:t xml:space="preserve">Benchmark hierarchy</w:t>
-      </w:r>
-      <w:r>
-        <w:t xml:space="preserve">: Tool-use format (1.0) &gt; GSM8K (0.97) &gt; MATH-500 (0.57) &gt;&gt; HumanEval (0.00) — GRPO learns structural tasks but fails on semantic reasoning</w:t>
+        <w:t xml:space="preserve">Mathematical reasoning (transfer control):</w:t>
+      </w:r>
+      <w:r>
+        <w:t xml:space="preserve"> </w:t>
+      </w:r>
+      <w:r>
+        <w:t xml:space="preserve">GSM8K (grade-school). Although MATH (competition-level) was part of our original scope, the MATH track did not reach the same experimental maturity as GSM8K; we therefore exclude it from our main claims and treat it as exploratory pilot work</w:t>
+      </w:r>
+    </w:p>
+    <w:p>
+      <w:pPr>
+        <w:pStyle w:val="FirstParagraph"/>
+      </w:pPr>
+      <w:r>
+        <w:t xml:space="preserve">We execute experiments across model sizes from 0.5B to 235B parameters using QLoRA on Google Colab T4 GPUs, full LoRA on Tinker cloud GPUs, and PPO on Modal H100 GPUs, providing a comprehensive picture of GRPO’s strengths, failure modes, and scaling properties across five model families.</w:t>
+      </w:r>
+    </w:p>
+    <w:bookmarkStart w:id="10" w:name="contributions"/>
+    <w:p>
+      <w:pPr>
+        <w:pStyle w:val="Heading2"/>
+      </w:pPr>
+      <w:r>
+        <w:t xml:space="preserve">1.1 Contributions</w:t>
       </w:r>
     </w:p>
     <w:p>
@@ -766,7 +703,7 @@
         <w:pStyle w:val="Compact"/>
         <w:numPr>
           <w:ilvl w:val="0"/>
-          <w:numId w:val="1001"/>
+          <w:numId w:val="1002"/>
         </w:numPr>
       </w:pPr>
       <w:r>
@@ -774,10 +711,13 @@
           <w:b/>
           <w:bCs/>
         </w:rPr>
-        <w:t xml:space="preserve">Cross-family architecture dependence</w:t>
-      </w:r>
-      <w:r>
-        <w:t xml:space="preserve">: tool-use success is Qwen-specific (1.0 vs. Llama 0.1 on identical task)</w:t>
+        <w:t xml:space="preserve">Empirical characterization</w:t>
+      </w:r>
+      <w:r>
+        <w:t xml:space="preserve"> </w:t>
+      </w:r>
+      <w:r>
+        <w:t xml:space="preserve">of GRPO across four task domains (tool-use, GSM8K, MATH-500, HumanEval) on models from 0.6B to 235B parameters across five model families (Qwen3, Llama, DeepSeek, Nemotron, GPT-OSS)</w:t>
       </w:r>
     </w:p>
     <w:p>
@@ -785,7 +725,7 @@
         <w:pStyle w:val="Compact"/>
         <w:numPr>
           <w:ilvl w:val="0"/>
-          <w:numId w:val="1001"/>
+          <w:numId w:val="1002"/>
         </w:numPr>
       </w:pPr>
       <w:r>
@@ -793,10 +733,13 @@
           <w:b/>
           <w:bCs/>
         </w:rPr>
-        <w:t xml:space="preserve">Model-size threshold</w:t>
-      </w:r>
-      <w:r>
-        <w:t xml:space="preserve">: below 8B-instruct, GRPO is a total null across both Qwen (0.6B, 1.7B) and Llama (1B, 3B) families — immediate ZVF saturation (onset=step 0)</w:t>
+        <w:t xml:space="preserve">10x Structural Ceiling experiment</w:t>
+      </w:r>
+      <w:r>
+        <w:t xml:space="preserve"> </w:t>
+      </w:r>
+      <w:r>
+        <w:t xml:space="preserve">(32 dedicated runs, ~$65): systematic ablation across benchmarks, architectures, model sizes, group sizes, learning rates, and constrained decoding</w:t>
       </w:r>
     </w:p>
     <w:p>
@@ -804,7 +747,7 @@
         <w:pStyle w:val="Compact"/>
         <w:numPr>
           <w:ilvl w:val="0"/>
-          <w:numId w:val="1001"/>
+          <w:numId w:val="1002"/>
         </w:numPr>
       </w:pPr>
       <w:r>
@@ -812,10 +755,10 @@
           <w:b/>
           <w:bCs/>
         </w:rPr>
-        <w:t xml:space="preserve">Instruction tuning as prerequisite</w:t>
-      </w:r>
-      <w:r>
-        <w:t xml:space="preserve">: base-&gt;instruct delta (+0.922) dwarfs any RL contribution</w:t>
+        <w:t xml:space="preserve">Benchmark hierarchy</w:t>
+      </w:r>
+      <w:r>
+        <w:t xml:space="preserve">: Tool-use format (1.0) &gt; GSM8K (0.97) &gt; MATH-500 (0.57) &gt;&gt; HumanEval (0.00) — GRPO learns structural tasks but fails on semantic reasoning</w:t>
       </w:r>
     </w:p>
     <w:p>
@@ -823,7 +766,64 @@
         <w:pStyle w:val="Compact"/>
         <w:numPr>
           <w:ilvl w:val="0"/>
-          <w:numId w:val="1001"/>
+          <w:numId w:val="1002"/>
+        </w:numPr>
+      </w:pPr>
+      <w:r>
+        <w:rPr>
+          <w:b/>
+          <w:bCs/>
+        </w:rPr>
+        <w:t xml:space="preserve">Cross-family architecture dependence</w:t>
+      </w:r>
+      <w:r>
+        <w:t xml:space="preserve">: tool-use success is Qwen-specific (1.0 vs. Llama 0.1 on identical task)</w:t>
+      </w:r>
+    </w:p>
+    <w:p>
+      <w:pPr>
+        <w:pStyle w:val="Compact"/>
+        <w:numPr>
+          <w:ilvl w:val="0"/>
+          <w:numId w:val="1002"/>
+        </w:numPr>
+      </w:pPr>
+      <w:r>
+        <w:rPr>
+          <w:b/>
+          <w:bCs/>
+        </w:rPr>
+        <w:t xml:space="preserve">Model-size threshold</w:t>
+      </w:r>
+      <w:r>
+        <w:t xml:space="preserve">: below 8B-instruct, GRPO is a total null across both Qwen (0.6B, 1.7B) and Llama (1B, 3B) families — immediate ZVF saturation (onset=step 0)</w:t>
+      </w:r>
+    </w:p>
+    <w:p>
+      <w:pPr>
+        <w:pStyle w:val="Compact"/>
+        <w:numPr>
+          <w:ilvl w:val="0"/>
+          <w:numId w:val="1002"/>
+        </w:numPr>
+      </w:pPr>
+      <w:r>
+        <w:rPr>
+          <w:b/>
+          <w:bCs/>
+        </w:rPr>
+        <w:t xml:space="preserve">Instruction tuning as prerequisite</w:t>
+      </w:r>
+      <w:r>
+        <w:t xml:space="preserve">: base-&gt;instruct delta (+0.922) dwarfs any RL contribution</w:t>
+      </w:r>
+    </w:p>
+    <w:p>
+      <w:pPr>
+        <w:pStyle w:val="Compact"/>
+        <w:numPr>
+          <w:ilvl w:val="0"/>
+          <w:numId w:val="1002"/>
         </w:numPr>
       </w:pPr>
       <w:r>
@@ -868,7 +868,7 @@
         <w:pStyle w:val="Compact"/>
         <w:numPr>
           <w:ilvl w:val="0"/>
-          <w:numId w:val="1001"/>
+          <w:numId w:val="1002"/>
         </w:numPr>
       </w:pPr>
       <w:r>
@@ -887,7 +887,7 @@
         <w:pStyle w:val="Compact"/>
         <w:numPr>
           <w:ilvl w:val="0"/>
-          <w:numId w:val="1001"/>
+          <w:numId w:val="1002"/>
         </w:numPr>
       </w:pPr>
       <w:r>
@@ -906,7 +906,7 @@
         <w:pStyle w:val="Compact"/>
         <w:numPr>
           <w:ilvl w:val="0"/>
-          <w:numId w:val="1001"/>
+          <w:numId w:val="1002"/>
         </w:numPr>
       </w:pPr>
       <w:r>
@@ -928,7 +928,7 @@
         <w:pStyle w:val="Compact"/>
         <w:numPr>
           <w:ilvl w:val="0"/>
-          <w:numId w:val="1001"/>
+          <w:numId w:val="1002"/>
         </w:numPr>
       </w:pPr>
       <w:r>
@@ -950,7 +950,7 @@
         <w:pStyle w:val="Compact"/>
         <w:numPr>
           <w:ilvl w:val="0"/>
-          <w:numId w:val="1001"/>
+          <w:numId w:val="1002"/>
         </w:numPr>
       </w:pPr>
       <w:r>
@@ -972,7 +972,7 @@
         <w:pStyle w:val="Compact"/>
         <w:numPr>
           <w:ilvl w:val="0"/>
-          <w:numId w:val="1001"/>
+          <w:numId w:val="1002"/>
         </w:numPr>
       </w:pPr>
       <w:r>
@@ -994,7 +994,7 @@
         <w:pStyle w:val="Compact"/>
         <w:numPr>
           <w:ilvl w:val="0"/>
-          <w:numId w:val="1001"/>
+          <w:numId w:val="1002"/>
         </w:numPr>
       </w:pPr>
       <w:r>
@@ -1054,7 +1054,7 @@
         <w:pStyle w:val="Compact"/>
         <w:numPr>
           <w:ilvl w:val="0"/>
-          <w:numId w:val="1001"/>
+          <w:numId w:val="1002"/>
         </w:numPr>
       </w:pPr>
       <w:r>
@@ -1069,299 +1069,6 @@
       </w:r>
       <w:r>
         <w:t xml:space="preserve">(16+ completed experiments): 13 Tinker GRPO runs across frontier and MoE models (including Kimi-K2: Peak 100%, Last-10 80%), 2 Modal H100 PPO runs, 1 failed KL tracking experiment. Key findings: TRL baseline 73.4% vs. Tinker 99.9% (p=0.0014); PPO dominates GRPO on Llama-8B (97.5% vs. 84.4%); Qwen3-235B-A22B reaches perfect 100% last-10; Nemotron-120B collapses after initial peak.</w:t>
-      </w:r>
-    </w:p>
-    <w:p>
-      <w:pPr>
-        <w:pStyle w:val="Compact"/>
-        <w:numPr>
-          <w:ilvl w:val="0"/>
-          <w:numId w:val="1001"/>
-        </w:numPr>
-      </w:pPr>
-      <w:r>
-        <w:rPr>
-          <w:b/>
-          <w:bCs/>
-        </w:rPr>
-        <w:t xml:space="preserve">TRL GRPO Baseline</w:t>
-      </w:r>
-      <w:r>
-        <w:t xml:space="preserve"> </w:t>
-      </w:r>
-      <w:r>
-        <w:t xml:space="preserve">(5 seeds, Qwen2.5-0.5B, GSM8K): mean accuracy 73.4% ± 7.03%, seeds [42, 123, 456, 789, 1024], accuracies [73.5%, 81.0%, 62.0%, 74.0%, 76.5%]; Welch’s t-test vs. Tinker: t=8.44, p=0.0014</w:t>
-      </w:r>
-    </w:p>
-    <w:p>
-      <w:pPr>
-        <w:pStyle w:val="Compact"/>
-        <w:numPr>
-          <w:ilvl w:val="0"/>
-          <w:numId w:val="1001"/>
-        </w:numPr>
-      </w:pPr>
-      <w:r>
-        <w:rPr>
-          <w:b/>
-          <w:bCs/>
-        </w:rPr>
-        <w:t xml:space="preserve">Statistical analysis with effect sizes</w:t>
-      </w:r>
-      <w:r>
-        <w:t xml:space="preserve">: bootstrap CIs, Welch’s t-test, Cohen’s d, Mann-Whitney; LLM-native vs Classic RL Cohen’s d=21.84; PPO vs GRPO on Llama d=12.75 (Bonferroni-surviving); variance decomposition (Algorithm η^2=0.558, Library η^2=0.546, Family η^2=0.471)</w:t>
-      </w:r>
-    </w:p>
-    <w:p>
-      <w:pPr>
-        <w:pStyle w:val="Compact"/>
-        <w:numPr>
-          <w:ilvl w:val="0"/>
-          <w:numId w:val="1001"/>
-        </w:numPr>
-      </w:pPr>
-      <w:r>
-        <w:rPr>
-          <w:b/>
-          <w:bCs/>
-        </w:rPr>
-        <w:t xml:space="preserve">Kimi-K2 experiment</w:t>
-      </w:r>
-      <w:r>
-        <w:t xml:space="preserve"> </w:t>
-      </w:r>
-      <w:r>
-        <w:t xml:space="preserve">(NEW): Moonshot AI MoE GRPO on GSM8K, Peak 100%, Last-10 80%, 20 steps; checkpoint arvindcr4/tinker-rl-bench-arch_gsm8k_kimi-k2</w:t>
-      </w:r>
-    </w:p>
-    <w:p>
-      <w:pPr>
-        <w:pStyle w:val="Compact"/>
-        <w:numPr>
-          <w:ilvl w:val="0"/>
-          <w:numId w:val="1001"/>
-        </w:numPr>
-      </w:pPr>
-      <w:r>
-        <w:rPr>
-          <w:b/>
-          <w:bCs/>
-        </w:rPr>
-        <w:t xml:space="preserve">Scaling law analysis</w:t>
-      </w:r>
-      <w:r>
-        <w:t xml:space="preserve"> </w:t>
-      </w:r>
-      <w:r>
-        <w:t xml:space="preserve">(NEW): Exponential saturation R(t)=R_max(1−e^{−k(t−t_0)}) fits better than power law (R^2=0.210 vs 0.170); three-phase pattern in 53.6% of experiments; model size correlates with learning speed (r=0.468, p=0.012) and ceiling (r=0.533, p=0.004)</w:t>
-      </w:r>
-    </w:p>
-    <w:p>
-      <w:pPr>
-        <w:pStyle w:val="Compact"/>
-        <w:numPr>
-          <w:ilvl w:val="0"/>
-          <w:numId w:val="1001"/>
-        </w:numPr>
-      </w:pPr>
-      <w:r>
-        <w:rPr>
-          <w:b/>
-          <w:bCs/>
-        </w:rPr>
-        <w:t xml:space="preserve">Zero-Variance Fraction analysis</w:t>
-      </w:r>
-      <w:r>
-        <w:t xml:space="preserve"> </w:t>
-      </w:r>
-      <w:r>
-        <w:t xml:space="preserve">(NEW): ZVF strongly predicts failure (Pearson r=−0.769, p=0.0008); task type dominates (tool-use ZVF=100% vs GSM8K ZVF=8.5%); model scale NOT a significant predictor</w:t>
-      </w:r>
-    </w:p>
-    <w:p>
-      <w:pPr>
-        <w:pStyle w:val="Compact"/>
-        <w:numPr>
-          <w:ilvl w:val="0"/>
-          <w:numId w:val="1001"/>
-        </w:numPr>
-      </w:pPr>
-      <w:r>
-        <w:rPr>
-          <w:b/>
-          <w:bCs/>
-        </w:rPr>
-        <w:t xml:space="preserve">Length bias analysis</w:t>
-      </w:r>
-      <w:r>
-        <w:t xml:space="preserve"> </w:t>
-      </w:r>
-      <w:r>
-        <w:t xml:space="preserve">(NEW): GRPO instability 0.267±0.335 vs PPO 0.785±0.297; verbosity trap GRPO 36% vs PPO 71%; Nemotron-120B highest GRPO instability (1.194)</w:t>
-      </w:r>
-    </w:p>
-    <w:p>
-      <w:pPr>
-        <w:pStyle w:val="Compact"/>
-        <w:numPr>
-          <w:ilvl w:val="0"/>
-          <w:numId w:val="1001"/>
-        </w:numPr>
-      </w:pPr>
-      <w:r>
-        <w:rPr>
-          <w:b/>
-          <w:bCs/>
-        </w:rPr>
-        <w:t xml:space="preserve">2-GRPO hypothesis test</w:t>
-      </w:r>
-      <w:r>
-        <w:t xml:space="preserve"> </w:t>
-      </w:r>
-      <w:r>
-        <w:t xml:space="preserve">(NEW): partial confirmation that GRPO is secretly DPO at G=2; reducing G=8/16 to G=2 would cut rollout compute 75–87.5%; observed ZVF deviates from theory due to adaptive difficulty sampling</w:t>
-      </w:r>
-    </w:p>
-    <w:p>
-      <w:r>
-        <w:pict>
-          <v:rect style="width:0;height:1.5pt" o:hralign="center" o:hrstd="t" o:hr="t"/>
-        </w:pict>
-      </w:r>
-    </w:p>
-    <w:bookmarkEnd w:id="10"/>
-    <w:bookmarkEnd w:id="11"/>
-    <w:bookmarkStart w:id="37" w:name="related-work"/>
-    <w:p>
-      <w:pPr>
-        <w:pStyle w:val="Heading1"/>
-      </w:pPr>
-      <w:r>
-        <w:t xml:space="preserve">2. Related Work</w:t>
-      </w:r>
-    </w:p>
-    <w:bookmarkStart w:id="12" w:name="grpo-and-policy-optimization"/>
-    <w:p>
-      <w:pPr>
-        <w:pStyle w:val="Heading2"/>
-      </w:pPr>
-      <w:r>
-        <w:t xml:space="preserve">2.1 GRPO and Policy Optimization</w:t>
-      </w:r>
-    </w:p>
-    <w:p>
-      <w:pPr>
-        <w:pStyle w:val="FirstParagraph"/>
-      </w:pPr>
-      <w:r>
-        <w:t xml:space="preserve">GRPO (Shao et al., 2024) simplifies PPO by eliminating the critic network and computing group-relative advantages from sampled completions. DeepSeekMath reports GRPO improving an instruction-tuned 7B model from 82.9% to 88.2% on GSM8K and 46.8% to 51.7% on MATH with group size G=64. The method is particularly suited to tasks with binary or easily-verified rewards.</w:t>
-      </w:r>
-    </w:p>
-    <w:bookmarkEnd w:id="12"/>
-    <w:bookmarkStart w:id="13" w:name="X99fbc0d270c4938018f694cdcc86a74ac24471f"/>
-    <w:p>
-      <w:pPr>
-        <w:pStyle w:val="Heading2"/>
-      </w:pPr>
-      <w:r>
-        <w:t xml:space="preserve">2.2 Preference-Based and Iterative Self-Training</w:t>
-      </w:r>
-    </w:p>
-    <w:p>
-      <w:pPr>
-        <w:pStyle w:val="FirstParagraph"/>
-      </w:pPr>
-      <w:r>
-        <w:t xml:space="preserve">Large-scale SFT can deliver strong baselines: Li et al. show LLaMA-2-7B reaching 82.6% GSM8K and 40.6% MATH with synthetic SFT at ~10^6 examples. Step-DPO (Lai et al.) demonstrates ~+3% MATH gains for &gt;70B models with as few as 10K step-wise preference pairs and &lt;500 steps. ReST (Gulcehre et al., 2023) and STaR (Zelikman et al., 2022) warm-start RL from self-generated rationales; our SFT+GRPO complementarity echoes this iterative self-training approach, though we have not controlled for the warm-starting effect.</w:t>
-      </w:r>
-    </w:p>
-    <w:bookmarkEnd w:id="13"/>
-    <w:bookmarkStart w:id="14" w:name="tool-calling-and-agentic-tasks"/>
-    <w:p>
-      <w:pPr>
-        <w:pStyle w:val="Heading2"/>
-      </w:pPr>
-      <w:r>
-        <w:t xml:space="preserve">2.3 Tool Calling and Agentic Tasks</w:t>
-      </w:r>
-    </w:p>
-    <w:p>
-      <w:pPr>
-        <w:pStyle w:val="FirstParagraph"/>
-      </w:pPr>
-      <w:r>
-        <w:t xml:space="preserve">Function calling requires structured JSON output with correct tool names and argument values. The Glaive-function-calling-v2 dataset (112,960 examples) and Salesforce xlam-function-calling-60k provide training data spanning simple to complex tool schemas. ToolLLM (Qin et al., 2024) and Gorilla (Patil et al., 2023) benchmark tool calling with held-out APIs; ToolRM and FC-RewardBench provide reward-model benchmarks. Our custom rubric lacks this standardization.</w:t>
-      </w:r>
-    </w:p>
-    <w:bookmarkEnd w:id="14"/>
-    <w:bookmarkStart w:id="15" w:name="moe-training-instability"/>
-    <w:p>
-      <w:pPr>
-        <w:pStyle w:val="Heading2"/>
-      </w:pPr>
-      <w:r>
-        <w:t xml:space="preserve">2.4 MoE Training Instability</w:t>
-      </w:r>
-    </w:p>
-    <w:p>
-      <w:pPr>
-        <w:pStyle w:val="FirstParagraph"/>
-      </w:pPr>
-      <w:r>
-        <w:t xml:space="preserve">Switch Transformers (Fedus et al., 2022) and GLaM (Du et al., 2022) document expert load-balancing challenges during pretraining; Mixtral (Jiang et al., 2024) uses top-2 routing to mitigate instability. Our 2.43× variance amplification under GRPO extends this literature to post-training RL, suggesting that policy gradient and auxiliary load-balancing losses create optimization interference.</w:t>
-      </w:r>
-    </w:p>
-    <w:bookmarkEnd w:id="15"/>
-    <w:bookmarkStart w:id="16" w:name="ppo-vs.-grpo-algorithmic-comparison"/>
-    <w:p>
-      <w:pPr>
-        <w:pStyle w:val="Heading2"/>
-      </w:pPr>
-      <w:r>
-        <w:t xml:space="preserve">2.5 PPO vs. GRPO Algorithmic Comparison</w:t>
-      </w:r>
-    </w:p>
-    <w:p>
-      <w:pPr>
-        <w:pStyle w:val="FirstParagraph"/>
-      </w:pPr>
-      <w:r>
-        <w:t xml:space="preserve">Sheng et al. (2024) introduce veRL (HybridFlow) as a flexible RLHF framework supporting both PPO and GRPO at scale. Our Modal H100 experiments provide direct empirical comparison using PPO on two model families, revealing a strong model–algorithm interaction that challenges prior assumptions about GRPO’s universality.</w:t>
-      </w:r>
-    </w:p>
-    <w:bookmarkEnd w:id="16"/>
-    <w:bookmarkStart w:id="22" w:name="late-20252026-sota-landscape"/>
-    <w:p>
-      <w:pPr>
-        <w:pStyle w:val="Heading2"/>
-      </w:pPr>
-      <w:r>
-        <w:t xml:space="preserve">2.6 Late-2025/2026 SOTA Landscape</w:t>
-      </w:r>
-    </w:p>
-    <w:p>
-      <w:pPr>
-        <w:pStyle w:val="FirstParagraph"/>
-      </w:pPr>
-      <w:r>
-        <w:t xml:space="preserve">Since the core experiments in this report were conducted (mid-2025), the GRPO post-training ecosystem has evolved substantially. We summarize the most relevant developments, organized by theme.</w:t>
-      </w:r>
-    </w:p>
-    <w:bookmarkStart w:id="17" w:name="X962e16bb05ba75afcc3cca577fe07412f8d6247"/>
-    <w:p>
-      <w:pPr>
-        <w:pStyle w:val="Heading3"/>
-      </w:pPr>
-      <w:r>
-        <w:t xml:space="preserve">2.6.1 GRPO Production Adoption and Framework Maturation</w:t>
-      </w:r>
-    </w:p>
-    <w:p>
-      <w:pPr>
-        <w:pStyle w:val="FirstParagraph"/>
-      </w:pPr>
-      <w:r>
-        <w:t xml:space="preserve">GRPO has moved from a research algorithm into production post-training pipelines:</w:t>
       </w:r>
     </w:p>
     <w:p>
@@ -1377,13 +1084,13 @@
           <w:b/>
           <w:bCs/>
         </w:rPr>
-        <w:t xml:space="preserve">GSPO (Group Sequence Policy Optimization; Qwen Team, arXiv:2507.18071, July 2025):</w:t>
-      </w:r>
-      <w:r>
-        <w:t xml:space="preserve"> </w:t>
-      </w:r>
-      <w:r>
-        <w:t xml:space="preserve">The Qwen3 model series adopted GSPO as its RL post-training method. Unlike GRPO’s token-level importance ratios, GSPO uses sequence-level importance ratios, resolving high-variance gradients on MoE models and eliminating the need for auxiliary routing-replay hacks. Our experiments with Qwen3-235B-A22B (Section 4.5.1) were run on a model trained with GSPO, which may partly explain its unusually stable convergence.</w:t>
+        <w:t xml:space="preserve">TRL GRPO Baseline</w:t>
+      </w:r>
+      <w:r>
+        <w:t xml:space="preserve"> </w:t>
+      </w:r>
+      <w:r>
+        <w:t xml:space="preserve">(5 seeds, Qwen2.5-0.5B, GSM8K): mean accuracy 73.4% ± 7.03%, seeds [42, 123, 456, 789, 1024], accuracies [73.5%, 81.0%, 62.0%, 74.0%, 76.5%]; Welch’s t-test vs. Tinker: t=8.44, p=0.0014</w:t>
       </w:r>
     </w:p>
     <w:p>
@@ -1399,13 +1106,10 @@
           <w:b/>
           <w:bCs/>
         </w:rPr>
-        <w:t xml:space="preserve">DAPO (ByteDance/Seed Team, arXiv:2503.14476, March 2025):</w:t>
-      </w:r>
-      <w:r>
-        <w:t xml:space="preserve"> </w:t>
-      </w:r>
-      <w:r>
-        <w:t xml:space="preserve">ByteDance open-sourced DAPO — Decoupled Clip and Dynamic Sampling Policy Optimization — as a production GRPO improvement that adds asymmetric clipping (Clip-Higher), dynamic prompt filtering, token-level loss, and overlong response filtering. DAPO achieves 50 points on AIME 2024 with Qwen2.5-32B. All four modifications have become de facto community best practices.</w:t>
+        <w:t xml:space="preserve">Statistical analysis with effect sizes</w:t>
+      </w:r>
+      <w:r>
+        <w:t xml:space="preserve">: bootstrap CIs, Welch’s t-test, Cohen’s d, Mann-Whitney; LLM-native vs Classic RL Cohen’s d=21.84; PPO vs GRPO on Llama d=12.75 (Bonferroni-surviving); variance decomposition (Algorithm η^2=0.558, Library η^2=0.546, Family η^2=0.471)</w:t>
       </w:r>
     </w:p>
     <w:p>
@@ -1421,13 +1125,13 @@
           <w:b/>
           <w:bCs/>
         </w:rPr>
-        <w:t xml:space="preserve">veRL v0.7.1 (March 2026):</w:t>
-      </w:r>
-      <w:r>
-        <w:t xml:space="preserve"> </w:t>
-      </w:r>
-      <w:r>
-        <w:t xml:space="preserve">The verl framework (Sheng et al., 2024) released v0.7.1 with MoE-scale support (DeepSeek-671B, Qwen3-235B via Megatron backend), GSPO integration, PrefixGrouper for GRPO acceleration, SGLang and vLLM 0.17 rollout backends, and one-step-off/fully-async trainer refactoring. The algorithm portfolio now includes PPO, GRPO, GSPO, REINFORCE++, DAPO, and DrGRPO.</w:t>
+        <w:t xml:space="preserve">Kimi-K2 experiment</w:t>
+      </w:r>
+      <w:r>
+        <w:t xml:space="preserve"> </w:t>
+      </w:r>
+      <w:r>
+        <w:t xml:space="preserve">(NEW): Moonshot AI MoE GRPO on GSM8K, Peak 100%, Last-10 80%, 20 steps; checkpoint arvindcr4/tinker-rl-bench-arch_gsm8k_kimi-k2</w:t>
       </w:r>
     </w:p>
     <w:p>
@@ -1443,23 +1147,213 @@
           <w:b/>
           <w:bCs/>
         </w:rPr>
-        <w:t xml:space="preserve">TRL v1.2.0 (April 2026):</w:t>
-      </w:r>
-      <w:r>
-        <w:t xml:space="preserve"> </w:t>
-      </w:r>
-      <w:r>
-        <w:t xml:space="preserve">Hugging Face TRL released major versions through v1.2.0, adding asynchronous GRPO (decoupled generation/update via external vLLM server), VESPO (variational sequence-level soft policy optimization), DPPO (divergence proximal policy optimization), SDPO (self-distillation policy optimization), tool-calling support for Qwen and LLaMA 3, multi-turn VLM support, and Liger-GRPO integration (40% peak memory reduction). The v1.1.0 tool-calling support is directly relevant to TinkerRL-Bench’s agentic track.</w:t>
-      </w:r>
-    </w:p>
-    <w:bookmarkEnd w:id="17"/>
-    <w:bookmarkStart w:id="18" w:name="Xe6a82eac284acf22e6537662e8d68a14ecc6dd7"/>
+        <w:t xml:space="preserve">Scaling law analysis</w:t>
+      </w:r>
+      <w:r>
+        <w:t xml:space="preserve"> </w:t>
+      </w:r>
+      <w:r>
+        <w:t xml:space="preserve">(NEW): Exponential saturation R(t)=R_max(1−e^{−k(t−t_0)}) fits better than power law (R^2=0.210 vs 0.170); three-phase pattern in 53.6% of experiments; model size correlates with learning speed (r=0.468, p=0.012) and ceiling (r=0.533, p=0.004)</w:t>
+      </w:r>
+    </w:p>
+    <w:p>
+      <w:pPr>
+        <w:pStyle w:val="Compact"/>
+        <w:numPr>
+          <w:ilvl w:val="0"/>
+          <w:numId w:val="1002"/>
+        </w:numPr>
+      </w:pPr>
+      <w:r>
+        <w:rPr>
+          <w:b/>
+          <w:bCs/>
+        </w:rPr>
+        <w:t xml:space="preserve">Zero-Variance Fraction analysis</w:t>
+      </w:r>
+      <w:r>
+        <w:t xml:space="preserve"> </w:t>
+      </w:r>
+      <w:r>
+        <w:t xml:space="preserve">(NEW): ZVF strongly predicts failure (Pearson r=−0.769, p=0.0008); task type dominates (tool-use ZVF=100% vs GSM8K ZVF=8.5%); model scale NOT a significant predictor</w:t>
+      </w:r>
+    </w:p>
+    <w:p>
+      <w:pPr>
+        <w:pStyle w:val="Compact"/>
+        <w:numPr>
+          <w:ilvl w:val="0"/>
+          <w:numId w:val="1002"/>
+        </w:numPr>
+      </w:pPr>
+      <w:r>
+        <w:rPr>
+          <w:b/>
+          <w:bCs/>
+        </w:rPr>
+        <w:t xml:space="preserve">Length bias analysis</w:t>
+      </w:r>
+      <w:r>
+        <w:t xml:space="preserve"> </w:t>
+      </w:r>
+      <w:r>
+        <w:t xml:space="preserve">(NEW): GRPO instability 0.267±0.335 vs PPO 0.785±0.297; verbosity trap GRPO 36% vs PPO 71%; Nemotron-120B highest GRPO instability (1.194)</w:t>
+      </w:r>
+    </w:p>
+    <w:p>
+      <w:pPr>
+        <w:pStyle w:val="Compact"/>
+        <w:numPr>
+          <w:ilvl w:val="0"/>
+          <w:numId w:val="1002"/>
+        </w:numPr>
+      </w:pPr>
+      <w:r>
+        <w:rPr>
+          <w:b/>
+          <w:bCs/>
+        </w:rPr>
+        <w:t xml:space="preserve">2-GRPO hypothesis test</w:t>
+      </w:r>
+      <w:r>
+        <w:t xml:space="preserve"> </w:t>
+      </w:r>
+      <w:r>
+        <w:t xml:space="preserve">(NEW): partial confirmation that GRPO is secretly DPO at G=2; reducing G=8/16 to G=2 would cut rollout compute 75–87.5%; observed ZVF deviates from theory due to adaptive difficulty sampling</w:t>
+      </w:r>
+    </w:p>
+    <w:p>
+      <w:r>
+        <w:pict>
+          <v:rect style="width:0;height:1.5pt" o:hralign="center" o:hrstd="t" o:hr="t"/>
+        </w:pict>
+      </w:r>
+    </w:p>
+    <w:bookmarkEnd w:id="10"/>
+    <w:bookmarkEnd w:id="11"/>
+    <w:bookmarkStart w:id="37" w:name="related-work"/>
+    <w:p>
+      <w:pPr>
+        <w:pStyle w:val="Heading1"/>
+      </w:pPr>
+      <w:r>
+        <w:t xml:space="preserve">2. Related Work</w:t>
+      </w:r>
+    </w:p>
+    <w:bookmarkStart w:id="12" w:name="grpo-and-policy-optimization"/>
+    <w:p>
+      <w:pPr>
+        <w:pStyle w:val="Heading2"/>
+      </w:pPr>
+      <w:r>
+        <w:t xml:space="preserve">2.1 GRPO and Policy Optimization</w:t>
+      </w:r>
+    </w:p>
+    <w:p>
+      <w:pPr>
+        <w:pStyle w:val="FirstParagraph"/>
+      </w:pPr>
+      <w:r>
+        <w:t xml:space="preserve">GRPO (Shao et al., 2024) simplifies PPO by eliminating the critic network and computing group-relative advantages from sampled completions. DeepSeekMath reports GRPO improving an instruction-tuned 7B model from 82.9% to 88.2% on GSM8K and 46.8% to 51.7% on MATH with group size G=64. The method is particularly suited to tasks with binary or easily-verified rewards.</w:t>
+      </w:r>
+    </w:p>
+    <w:bookmarkEnd w:id="12"/>
+    <w:bookmarkStart w:id="13" w:name="X99fbc0d270c4938018f694cdcc86a74ac24471f"/>
+    <w:p>
+      <w:pPr>
+        <w:pStyle w:val="Heading2"/>
+      </w:pPr>
+      <w:r>
+        <w:t xml:space="preserve">2.2 Preference-Based and Iterative Self-Training</w:t>
+      </w:r>
+    </w:p>
+    <w:p>
+      <w:pPr>
+        <w:pStyle w:val="FirstParagraph"/>
+      </w:pPr>
+      <w:r>
+        <w:t xml:space="preserve">Large-scale SFT can deliver strong baselines: Li et al. show LLaMA-2-7B reaching 82.6% GSM8K and 40.6% MATH with synthetic SFT at ~10^6 examples. Step-DPO (Lai et al.) demonstrates ~+3% MATH gains for &gt;70B models with as few as 10K step-wise preference pairs and &lt;500 steps. ReST (Gulcehre et al., 2023) and STaR (Zelikman et al., 2022) warm-start RL from self-generated rationales; our SFT+GRPO complementarity echoes this iterative self-training approach, though we have not controlled for the warm-starting effect.</w:t>
+      </w:r>
+    </w:p>
+    <w:bookmarkEnd w:id="13"/>
+    <w:bookmarkStart w:id="14" w:name="tool-calling-and-agentic-tasks"/>
+    <w:p>
+      <w:pPr>
+        <w:pStyle w:val="Heading2"/>
+      </w:pPr>
+      <w:r>
+        <w:t xml:space="preserve">2.3 Tool Calling and Agentic Tasks</w:t>
+      </w:r>
+    </w:p>
+    <w:p>
+      <w:pPr>
+        <w:pStyle w:val="FirstParagraph"/>
+      </w:pPr>
+      <w:r>
+        <w:t xml:space="preserve">Function calling requires structured JSON output with correct tool names and argument values. The Glaive-function-calling-v2 dataset (112,960 examples) and Salesforce xlam-function-calling-60k provide training data spanning simple to complex tool schemas. ToolLLM (Qin et al., 2024) and Gorilla (Patil et al., 2023) benchmark tool calling with held-out APIs; ToolRM and FC-RewardBench provide reward-model benchmarks. Our custom rubric lacks this standardization.</w:t>
+      </w:r>
+    </w:p>
+    <w:bookmarkEnd w:id="14"/>
+    <w:bookmarkStart w:id="15" w:name="moe-training-instability"/>
+    <w:p>
+      <w:pPr>
+        <w:pStyle w:val="Heading2"/>
+      </w:pPr>
+      <w:r>
+        <w:t xml:space="preserve">2.4 MoE Training Instability</w:t>
+      </w:r>
+    </w:p>
+    <w:p>
+      <w:pPr>
+        <w:pStyle w:val="FirstParagraph"/>
+      </w:pPr>
+      <w:r>
+        <w:t xml:space="preserve">Switch Transformers (Fedus et al., 2022) and GLaM (Du et al., 2022) document expert load-balancing challenges during pretraining; Mixtral (Jiang et al., 2024) uses top-2 routing to mitigate instability. Our 2.43× variance amplification under GRPO extends this literature to post-training RL, suggesting that policy gradient and auxiliary load-balancing losses create optimization interference.</w:t>
+      </w:r>
+    </w:p>
+    <w:bookmarkEnd w:id="15"/>
+    <w:bookmarkStart w:id="16" w:name="ppo-vs.-grpo-algorithmic-comparison"/>
+    <w:p>
+      <w:pPr>
+        <w:pStyle w:val="Heading2"/>
+      </w:pPr>
+      <w:r>
+        <w:t xml:space="preserve">2.5 PPO vs. GRPO Algorithmic Comparison</w:t>
+      </w:r>
+    </w:p>
+    <w:p>
+      <w:pPr>
+        <w:pStyle w:val="FirstParagraph"/>
+      </w:pPr>
+      <w:r>
+        <w:t xml:space="preserve">Sheng et al. (2024) introduce veRL (HybridFlow) as a flexible RLHF framework supporting both PPO and GRPO at scale. Our Modal H100 experiments provide direct empirical comparison using PPO on two model families, revealing a strong model–algorithm interaction that challenges prior assumptions about GRPO’s universality.</w:t>
+      </w:r>
+    </w:p>
+    <w:bookmarkEnd w:id="16"/>
+    <w:bookmarkStart w:id="22" w:name="late-20252026-sota-landscape"/>
+    <w:p>
+      <w:pPr>
+        <w:pStyle w:val="Heading2"/>
+      </w:pPr>
+      <w:r>
+        <w:t xml:space="preserve">2.6 Late-2025/2026 SOTA Landscape</w:t>
+      </w:r>
+    </w:p>
+    <w:p>
+      <w:pPr>
+        <w:pStyle w:val="FirstParagraph"/>
+      </w:pPr>
+      <w:r>
+        <w:t xml:space="preserve">Since the core experiments in this report were conducted (mid-2025), the GRPO post-training ecosystem has evolved substantially. We summarize the most relevant developments, organized by theme.</w:t>
+      </w:r>
+    </w:p>
+    <w:bookmarkStart w:id="17" w:name="X962e16bb05ba75afcc3cca577fe07412f8d6247"/>
     <w:p>
       <w:pPr>
         <w:pStyle w:val="Heading3"/>
       </w:pPr>
       <w:r>
-        <w:t xml:space="preserve">2.6.2 Zero-Variance Failure: Independent Concurrent Validation</w:t>
+        <w:t xml:space="preserve">2.6.1 GRPO Production Adoption and Framework Maturation</w:t>
       </w:r>
     </w:p>
     <w:p>
@@ -1467,7 +1361,7 @@
         <w:pStyle w:val="FirstParagraph"/>
       </w:pPr>
       <w:r>
-        <w:t xml:space="preserve">TinkerRL-Bench introduces Zero-Variance Fraction (ZVF) as a diagnostic metric (Section 4.4.4). At least six independent papers published concurrently address the same underlying phenomenon — groups where all completions receive identical rewards provide no gradient signal — confirming that ZVF is a real, widely recognized GRPO failure mode:</w:t>
+        <w:t xml:space="preserve">GRPO has moved from a research algorithm into production post-training pipelines:</w:t>
       </w:r>
     </w:p>
     <w:p>
@@ -1483,13 +1377,13 @@
           <w:b/>
           <w:bCs/>
         </w:rPr>
-        <w:t xml:space="preserve">NGRPO</w:t>
-      </w:r>
-      <w:r>
-        <w:t xml:space="preserve"> </w:t>
-      </w:r>
-      <w:r>
-        <w:t xml:space="preserve">(Nan et al., arXiv:2509.18851, Sep 2025): Advantage Calibration via hypothetical maximum-reward virtual sample; asymmetric clipping. Explicitly targets both all-correct and all-incorrect ZVF cases.</w:t>
+        <w:t xml:space="preserve">GSPO (Group Sequence Policy Optimization; Qwen Team, arXiv:2507.18071, July 2025):</w:t>
+      </w:r>
+      <w:r>
+        <w:t xml:space="preserve"> </w:t>
+      </w:r>
+      <w:r>
+        <w:t xml:space="preserve">The Qwen3 model series adopted GSPO as its RL post-training method. Unlike GRPO’s token-level importance ratios, GSPO uses sequence-level importance ratios, resolving high-variance gradients on MoE models and eliminating the need for auxiliary routing-replay hacks. Our experiments with Qwen3-235B-A22B (Section 4.5.1) were run on a model trained with GSPO, which may partly explain its unusually stable convergence.</w:t>
       </w:r>
     </w:p>
     <w:p>
@@ -1505,25 +1399,13 @@
           <w:b/>
           <w:bCs/>
         </w:rPr>
-        <w:t xml:space="preserve">Scaf-GRPO</w:t>
-      </w:r>
-      <w:r>
-        <w:t xml:space="preserve"> </w:t>
-      </w:r>
-      <w:r>
-        <w:t xml:space="preserve">(Zhang et al., arXiv:2510.19807, Oct 2025): Identifies</w:t>
-      </w:r>
-      <w:r>
-        <w:t xml:space="preserve"> </w:t>
-      </w:r>
-      <w:r>
-        <w:t xml:space="preserve">“learning cliff”</w:t>
-      </w:r>
-      <w:r>
-        <w:t xml:space="preserve"> </w:t>
-      </w:r>
-      <w:r>
-        <w:t xml:space="preserve">— problems far beyond model capability produce zero reward -&gt; zero advantage -&gt; no gradient. Injects tiered in-prompt hints; +44.3% relative gain on AIME24 over GRPO.</w:t>
+        <w:t xml:space="preserve">DAPO (ByteDance/Seed Team, arXiv:2503.14476, March 2025):</w:t>
+      </w:r>
+      <w:r>
+        <w:t xml:space="preserve"> </w:t>
+      </w:r>
+      <w:r>
+        <w:t xml:space="preserve">ByteDance open-sourced DAPO — Decoupled Clip and Dynamic Sampling Policy Optimization — as a production GRPO improvement that adds asymmetric clipping (Clip-Higher), dynamic prompt filtering, token-level loss, and overlong response filtering. DAPO achieves 50 points on AIME 2024 with Qwen2.5-32B. All four modifications have become de facto community best practices.</w:t>
       </w:r>
     </w:p>
     <w:p>
@@ -1539,13 +1421,13 @@
           <w:b/>
           <w:bCs/>
         </w:rPr>
-        <w:t xml:space="preserve">EBPO</w:t>
-      </w:r>
-      <w:r>
-        <w:t xml:space="preserve"> </w:t>
-      </w:r>
-      <w:r>
-        <w:t xml:space="preserve">(Han et al., arXiv:2602.05165, Feb 2026): Empirical Bayes shrinkage estimator balancing local group stats with a global prior; guarantees non-vanishing gradient even in saturated-failure regimes.</w:t>
+        <w:t xml:space="preserve">veRL v0.7.1 (March 2026):</w:t>
+      </w:r>
+      <w:r>
+        <w:t xml:space="preserve"> </w:t>
+      </w:r>
+      <w:r>
+        <w:t xml:space="preserve">The verl framework (Sheng et al., 2024) released v0.7.1 with MoE-scale support (DeepSeek-671B, Qwen3-235B via Megatron backend), GSPO integration, PrefixGrouper for GRPO acceleration, SGLang and vLLM 0.17 rollout backends, and one-step-off/fully-async trainer refactoring. The algorithm portfolio now includes PPO, GRPO, GSPO, REINFORCE++, DAPO, and DrGRPO.</w:t>
       </w:r>
     </w:p>
     <w:p>
@@ -1561,57 +1443,23 @@
           <w:b/>
           <w:bCs/>
         </w:rPr>
-        <w:t xml:space="preserve">LENS</w:t>
-      </w:r>
-      <w:r>
-        <w:t xml:space="preserve"> </w:t>
-      </w:r>
-      <w:r>
-        <w:t xml:space="preserve">(Feng et al., arXiv:2510.08696, Oct 2025): Confidence-weighted penalties on incorrect responses in all-wrong groups; tested on Llama-3.1-8B and Qwen-2.5-3B.</w:t>
-      </w:r>
-    </w:p>
-    <w:p>
-      <w:pPr>
-        <w:pStyle w:val="Compact"/>
-        <w:numPr>
-          <w:ilvl w:val="0"/>
-          <w:numId w:val="1003"/>
-        </w:numPr>
-      </w:pPr>
-      <w:r>
-        <w:rPr>
-          <w:b/>
-          <w:bCs/>
-        </w:rPr>
-        <w:t xml:space="preserve">Hard Examples Are All You Need</w:t>
-      </w:r>
-      <w:r>
-        <w:t xml:space="preserve"> </w:t>
-      </w:r>
-      <w:r>
-        <w:t xml:space="preserve">(Pikus et al., arXiv:2508.14094, Aug 2025): Empirically confirms ZVF as the fundamental bottleneck; training on the hardest 10% of examples yields +47% gains.</w:t>
-      </w:r>
-    </w:p>
-    <w:p>
-      <w:pPr>
-        <w:pStyle w:val="Compact"/>
-        <w:numPr>
-          <w:ilvl w:val="0"/>
-          <w:numId w:val="1003"/>
-        </w:numPr>
-      </w:pPr>
-      <w:r>
-        <w:rPr>
-          <w:b/>
-          <w:bCs/>
-        </w:rPr>
-        <w:t xml:space="preserve">AERO / RL-ZVP</w:t>
-      </w:r>
-      <w:r>
-        <w:t xml:space="preserve"> </w:t>
-      </w:r>
-      <w:r>
-        <w:t xml:space="preserve">(Le et al., arXiv:2509.21880, Sep 2025): Directly rewards correctness and penalizes errors in zero-variance prompts using token-level entropy; +8.61 accuracy points over standard GRPO across 6 math benchmarks.</w:t>
+        <w:t xml:space="preserve">TRL v1.2.0 (April 2026):</w:t>
+      </w:r>
+      <w:r>
+        <w:t xml:space="preserve"> </w:t>
+      </w:r>
+      <w:r>
+        <w:t xml:space="preserve">Hugging Face TRL released major versions through v1.2.0, adding asynchronous GRPO (decoupled generation/update via external vLLM server), VESPO (variational sequence-level soft policy optimization), DPPO (divergence proximal policy optimization), SDPO (self-distillation policy optimization), tool-calling support for Qwen and LLaMA 3, multi-turn VLM support, and Liger-GRPO integration (40% peak memory reduction). The v1.1.0 tool-calling support is directly relevant to TinkerRL-Bench’s agentic track.</w:t>
+      </w:r>
+    </w:p>
+    <w:bookmarkEnd w:id="17"/>
+    <w:bookmarkStart w:id="18" w:name="Xe6a82eac284acf22e6537662e8d68a14ecc6dd7"/>
+    <w:p>
+      <w:pPr>
+        <w:pStyle w:val="Heading3"/>
+      </w:pPr>
+      <w:r>
+        <w:t xml:space="preserve">2.6.2 Zero-Variance Failure: Independent Concurrent Validation</w:t>
       </w:r>
     </w:p>
     <w:p>
@@ -1619,25 +1467,7 @@
         <w:pStyle w:val="FirstParagraph"/>
       </w:pPr>
       <w:r>
-        <w:t xml:space="preserve">The simultaneous emergence of six independent solutions to ZVF constitutes strong external validation that TinkerRL-Bench’s ZVF diagnostic identifies a genuine, cross-scale GRPO failure mode rather than an artifact of our experimental setup.</w:t>
-      </w:r>
-    </w:p>
-    <w:bookmarkEnd w:id="18"/>
-    <w:bookmarkStart w:id="19" w:name="statistical-foundations-of-grpo"/>
-    <w:p>
-      <w:pPr>
-        <w:pStyle w:val="Heading3"/>
-      </w:pPr>
-      <w:r>
-        <w:t xml:space="preserve">2.6.3 Statistical Foundations of GRPO</w:t>
-      </w:r>
-    </w:p>
-    <w:p>
-      <w:pPr>
-        <w:pStyle w:val="FirstParagraph"/>
-      </w:pPr>
-      <w:r>
-        <w:t xml:space="preserve">Two papers provide formal theoretical grounding for GRPO properties that our empirical analyses address:</w:t>
+        <w:t xml:space="preserve">TinkerRL-Bench introduces Zero-Variance Fraction (ZVF) as a diagnostic metric (Section 4.4.4). At least six independent papers published concurrently address the same underlying phenomenon — groups where all completions receive identical rewards provide no gradient signal — confirming that ZVF is a real, widely recognized GRPO failure mode:</w:t>
       </w:r>
     </w:p>
     <w:p>
@@ -1653,13 +1483,13 @@
           <w:b/>
           <w:bCs/>
         </w:rPr>
-        <w:t xml:space="preserve">Demystifying GRPO (Zhou et al., arXiv:2603.01162, March 2026):</w:t>
-      </w:r>
-      <w:r>
-        <w:t xml:space="preserve"> </w:t>
-      </w:r>
-      <w:r>
-        <w:t xml:space="preserve">Proves that GRPO’s policy gradient is a U-statistic, enabling formal MSE analysis. Shows GRPO is asymptotically equivalent to an oracle policy gradient with perfect value function access. Derives a universal scaling law for optimal group size G — providing the first principled justification for our empirical finding that G=32 maximizes gradient utilization.</w:t>
+        <w:t xml:space="preserve">NGRPO</w:t>
+      </w:r>
+      <w:r>
+        <w:t xml:space="preserve"> </w:t>
+      </w:r>
+      <w:r>
+        <w:t xml:space="preserve">(Nan et al., arXiv:2509.18851, Sep 2025): Advantage Calibration via hypothetical maximum-reward virtual sample; asymmetric clipping. Explicitly targets both all-correct and all-incorrect ZVF cases.</w:t>
       </w:r>
     </w:p>
     <w:p>
@@ -1675,23 +1505,131 @@
           <w:b/>
           <w:bCs/>
         </w:rPr>
-        <w:t xml:space="preserve">MinPRO / IS-ratio critique:</w:t>
-      </w:r>
-      <w:r>
-        <w:t xml:space="preserve"> </w:t>
-      </w:r>
-      <w:r>
-        <w:t xml:space="preserve">Multiple papers (GSPO, λ-GRPO, SSPO) independently identify GRPO’s token-level importance ratios as a source of instability, with GSPO’s sequence-level reformulation and SSPO’s sentence-level intermediate approach offering practical fixes. These converge on our observation that GRPO with binary rewards on small models is vulnerable to variance explosion when σ_R ~ 0.</w:t>
-      </w:r>
-    </w:p>
-    <w:bookmarkEnd w:id="19"/>
-    <w:bookmarkStart w:id="20" w:name="length-bias-fixes"/>
+        <w:t xml:space="preserve">Scaf-GRPO</w:t>
+      </w:r>
+      <w:r>
+        <w:t xml:space="preserve"> </w:t>
+      </w:r>
+      <w:r>
+        <w:t xml:space="preserve">(Zhang et al., arXiv:2510.19807, Oct 2025): Identifies</w:t>
+      </w:r>
+      <w:r>
+        <w:t xml:space="preserve"> </w:t>
+      </w:r>
+      <w:r>
+        <w:t xml:space="preserve">“learning cliff”</w:t>
+      </w:r>
+      <w:r>
+        <w:t xml:space="preserve"> </w:t>
+      </w:r>
+      <w:r>
+        <w:t xml:space="preserve">— problems far beyond model capability produce zero reward -&gt; zero advantage -&gt; no gradient. Injects tiered in-prompt hints; +44.3% relative gain on AIME24 over GRPO.</w:t>
+      </w:r>
+    </w:p>
+    <w:p>
+      <w:pPr>
+        <w:pStyle w:val="Compact"/>
+        <w:numPr>
+          <w:ilvl w:val="0"/>
+          <w:numId w:val="1004"/>
+        </w:numPr>
+      </w:pPr>
+      <w:r>
+        <w:rPr>
+          <w:b/>
+          <w:bCs/>
+        </w:rPr>
+        <w:t xml:space="preserve">EBPO</w:t>
+      </w:r>
+      <w:r>
+        <w:t xml:space="preserve"> </w:t>
+      </w:r>
+      <w:r>
+        <w:t xml:space="preserve">(Han et al., arXiv:2602.05165, Feb 2026): Empirical Bayes shrinkage estimator balancing local group stats with a global prior; guarantees non-vanishing gradient even in saturated-failure regimes.</w:t>
+      </w:r>
+    </w:p>
+    <w:p>
+      <w:pPr>
+        <w:pStyle w:val="Compact"/>
+        <w:numPr>
+          <w:ilvl w:val="0"/>
+          <w:numId w:val="1004"/>
+        </w:numPr>
+      </w:pPr>
+      <w:r>
+        <w:rPr>
+          <w:b/>
+          <w:bCs/>
+        </w:rPr>
+        <w:t xml:space="preserve">LENS</w:t>
+      </w:r>
+      <w:r>
+        <w:t xml:space="preserve"> </w:t>
+      </w:r>
+      <w:r>
+        <w:t xml:space="preserve">(Feng et al., arXiv:2510.08696, Oct 2025): Confidence-weighted penalties on incorrect responses in all-wrong groups; tested on Llama-3.1-8B and Qwen-2.5-3B.</w:t>
+      </w:r>
+    </w:p>
+    <w:p>
+      <w:pPr>
+        <w:pStyle w:val="Compact"/>
+        <w:numPr>
+          <w:ilvl w:val="0"/>
+          <w:numId w:val="1004"/>
+        </w:numPr>
+      </w:pPr>
+      <w:r>
+        <w:rPr>
+          <w:b/>
+          <w:bCs/>
+        </w:rPr>
+        <w:t xml:space="preserve">Hard Examples Are All You Need</w:t>
+      </w:r>
+      <w:r>
+        <w:t xml:space="preserve"> </w:t>
+      </w:r>
+      <w:r>
+        <w:t xml:space="preserve">(Pikus et al., arXiv:2508.14094, Aug 2025): Empirically confirms ZVF as the fundamental bottleneck; training on the hardest 10% of examples yields +47% gains.</w:t>
+      </w:r>
+    </w:p>
+    <w:p>
+      <w:pPr>
+        <w:pStyle w:val="Compact"/>
+        <w:numPr>
+          <w:ilvl w:val="0"/>
+          <w:numId w:val="1004"/>
+        </w:numPr>
+      </w:pPr>
+      <w:r>
+        <w:rPr>
+          <w:b/>
+          <w:bCs/>
+        </w:rPr>
+        <w:t xml:space="preserve">AERO / RL-ZVP</w:t>
+      </w:r>
+      <w:r>
+        <w:t xml:space="preserve"> </w:t>
+      </w:r>
+      <w:r>
+        <w:t xml:space="preserve">(Le et al., arXiv:2509.21880, Sep 2025): Directly rewards correctness and penalizes errors in zero-variance prompts using token-level entropy; +8.61 accuracy points over standard GRPO across 6 math benchmarks.</w:t>
+      </w:r>
+    </w:p>
+    <w:p>
+      <w:pPr>
+        <w:pStyle w:val="FirstParagraph"/>
+      </w:pPr>
+      <w:r>
+        <w:t xml:space="preserve">The simultaneous emergence of six independent solutions to ZVF constitutes strong external validation that TinkerRL-Bench’s ZVF diagnostic identifies a genuine, cross-scale GRPO failure mode rather than an artifact of our experimental setup.</w:t>
+      </w:r>
+    </w:p>
+    <w:bookmarkEnd w:id="18"/>
+    <w:bookmarkStart w:id="19" w:name="statistical-foundations-of-grpo"/>
     <w:p>
       <w:pPr>
         <w:pStyle w:val="Heading3"/>
       </w:pPr>
       <w:r>
-        <w:t xml:space="preserve">2.6.4 Length Bias Fixes</w:t>
+        <w:t xml:space="preserve">2.6.3 Statistical Foundations of GRPO</w:t>
       </w:r>
     </w:p>
     <w:p>
@@ -1699,7 +1637,7 @@
         <w:pStyle w:val="FirstParagraph"/>
       </w:pPr>
       <w:r>
-        <w:t xml:space="preserve">Several papers address the length bias problem in GRPO — where longer responses receive disproportionately large gradients — which is a component of our length bias analysis (Section 5.13):</w:t>
+        <w:t xml:space="preserve">Two papers provide formal theoretical grounding for GRPO properties that our empirical analyses address:</w:t>
       </w:r>
     </w:p>
     <w:p>
@@ -1715,13 +1653,13 @@
           <w:b/>
           <w:bCs/>
         </w:rPr>
-        <w:t xml:space="preserve">LUSPO / GR^3</w:t>
-      </w:r>
-      <w:r>
-        <w:t xml:space="preserve"> </w:t>
-      </w:r>
-      <w:r>
-        <w:t xml:space="preserve">(Li et al., arXiv:2603.10535, March 2026): Multiplicative group-relative reward rescaling that avoids the compensatory gaming of additive length penalties; reduces generation length 40% while improving AIME24 accuracy from 52.4-&gt;60.1.</w:t>
+        <w:t xml:space="preserve">Demystifying GRPO (Zhou et al., arXiv:2603.01162, March 2026):</w:t>
+      </w:r>
+      <w:r>
+        <w:t xml:space="preserve"> </w:t>
+      </w:r>
+      <w:r>
+        <w:t xml:space="preserve">Proves that GRPO’s policy gradient is a U-statistic, enabling formal MSE analysis. Shows GRPO is asymptotically equivalent to an oracle policy gradient with perfect value function access. Derives a universal scaling law for optimal group size G — providing the first principled justification for our empirical finding that G=32 maximizes gradient utilization.</w:t>
       </w:r>
     </w:p>
     <w:p>
@@ -1737,45 +1675,31 @@
           <w:b/>
           <w:bCs/>
         </w:rPr>
-        <w:t xml:space="preserve">DLER / GRPO-LEAD</w:t>
-      </w:r>
-      <w:r>
-        <w:t xml:space="preserve"> </w:t>
-      </w:r>
-      <w:r>
-        <w:t xml:space="preserve">(EMNLP 2025, aclanthology.org/2025.emnlp-main.287): Length-dependent accuracy rewards + difficulty-aware advantage reweighting; reduces token usage 37.5% while matching peak performance.</w:t>
-      </w:r>
-    </w:p>
-    <w:p>
-      <w:pPr>
-        <w:pStyle w:val="Compact"/>
-        <w:numPr>
-          <w:ilvl w:val="0"/>
-          <w:numId w:val="1005"/>
-        </w:numPr>
-      </w:pPr>
-      <w:r>
-        <w:rPr>
-          <w:b/>
-          <w:bCs/>
-        </w:rPr>
-        <w:t xml:space="preserve">ΔL Normalization / λ-GRPO</w:t>
-      </w:r>
-      <w:r>
-        <w:t xml:space="preserve"> </w:t>
-      </w:r>
-      <w:r>
-        <w:t xml:space="preserve">(Wang et al., arXiv:2510.06870, Oct 2025): Learnable token preference parameter that unifies GRPO, DAPO, and Dr.GRPO; adaptive length neutrality.</w:t>
-      </w:r>
-    </w:p>
-    <w:bookmarkEnd w:id="20"/>
-    <w:bookmarkStart w:id="21" w:name="X4be390ade3a1100b9fe52a96b6c8bce9056b574"/>
+        <w:t xml:space="preserve">MinPRO / IS-ratio critique:</w:t>
+      </w:r>
+      <w:r>
+        <w:t xml:space="preserve"> </w:t>
+      </w:r>
+      <w:r>
+        <w:t xml:space="preserve">Multiple papers (GSPO, λ-GRPO, SSPO) independently identify GRPO’s token-level importance ratios as a source of instability, with GSPO’s sequence-level reformulation and SSPO’s sentence-level intermediate approach offering practical fixes. These converge on our observation that GRPO with binary rewards on small models is vulnerable to variance explosion when σ_R ~ 0.</w:t>
+      </w:r>
+    </w:p>
+    <w:bookmarkEnd w:id="19"/>
+    <w:bookmarkStart w:id="20" w:name="length-bias-fixes"/>
     <w:p>
       <w:pPr>
         <w:pStyle w:val="Heading3"/>
       </w:pPr>
       <w:r>
-        <w:t xml:space="preserve">2.6.5 Compute-Optimal RL: Scaling and Efficiency</w:t>
+        <w:t xml:space="preserve">2.6.4 Length Bias Fixes</w:t>
+      </w:r>
+    </w:p>
+    <w:p>
+      <w:pPr>
+        <w:pStyle w:val="FirstParagraph"/>
+      </w:pPr>
+      <w:r>
+        <w:t xml:space="preserve">Several papers address the length bias problem in GRPO — where longer responses receive disproportionately large gradients — which is a component of our length bias analysis (Section 5.13):</w:t>
       </w:r>
     </w:p>
     <w:p>
@@ -1791,13 +1715,13 @@
           <w:b/>
           <w:bCs/>
         </w:rPr>
-        <w:t xml:space="preserve">Predictive Scaling Laws for GRPO (Nimmaturi et al., arXiv:2507.18014, July 2025):</w:t>
-      </w:r>
-      <w:r>
-        <w:t xml:space="preserve"> </w:t>
-      </w:r>
-      <w:r>
-        <w:t xml:space="preserve">Identifies three-phase exponential saturation in GRPO training; shows training beyond 80% of one epoch offers negligible gain. This directly corroborates our Section 5.11 finding that R(t)=R_max(1−e^{−k(t−t_0)}) fits better than a power law, and that the 80% reward threshold is crossed at approximately 81% of training progress.</w:t>
+        <w:t xml:space="preserve">LUSPO / GR^3</w:t>
+      </w:r>
+      <w:r>
+        <w:t xml:space="preserve"> </w:t>
+      </w:r>
+      <w:r>
+        <w:t xml:space="preserve">(Li et al., arXiv:2603.10535, March 2026): Multiplicative group-relative reward rescaling that avoids the compensatory gaming of additive length penalties; reduces generation length 40% while improving AIME24 accuracy from 52.4-&gt;60.1.</w:t>
       </w:r>
     </w:p>
     <w:p>
@@ -1813,180 +1737,45 @@
           <w:b/>
           <w:bCs/>
         </w:rPr>
-        <w:t xml:space="preserve">IsoCompute Playbook:</w:t>
-      </w:r>
-      <w:r>
-        <w:t xml:space="preserve"> </w:t>
-      </w:r>
-      <w:r>
-        <w:t xml:space="preserve">Multiple papers (CPPO, GRESO, 2-GRPO) independently advocate reducing rollout compute, converging on the principle that compute-optimal RL training requires much fewer completions per prompt than standard G=8–16 settings. CPPO (arXiv:2503.22342) achieves up to 8.32× speedup on GSM8K via low-advantage pruning; GRESO (arXiv:2506.02177) achieves 2.4× speedup by pre-filtering zero-variance prompts.</w:t>
-      </w:r>
-    </w:p>
-    <w:p>
-      <w:r>
-        <w:pict>
-          <v:rect style="width:0;height:1.5pt" o:hralign="center" o:hrstd="t" o:hr="t"/>
-        </w:pict>
-      </w:r>
-    </w:p>
-    <w:bookmarkEnd w:id="21"/>
-    <w:bookmarkEnd w:id="22"/>
-    <w:bookmarkStart w:id="25" w:name="variance-mitigation-methods-head-to-head"/>
-    <w:p>
-      <w:pPr>
-        <w:pStyle w:val="Heading2"/>
-      </w:pPr>
-      <w:r>
-        <w:t xml:space="preserve">2.7 Variance-Mitigation Methods (Head-to-Head)</w:t>
-      </w:r>
-    </w:p>
-    <w:p>
-      <w:pPr>
-        <w:pStyle w:val="FirstParagraph"/>
-      </w:pPr>
-      <w:r>
-        <w:rPr>
-          <w:i/>
-          <w:iCs/>
-        </w:rPr>
-        <w:t xml:space="preserve">Addresses reviewer concerns W14 (missing AERO/CPPO/NGRPO/Scaf-GRPO comparisons) and Q7 (integrate a variance-mitigation method and test ZVF predictiveness). Paper section:</w:t>
-      </w:r>
-      <w:r>
-        <w:rPr>
-          <w:i/>
-          <w:iCs/>
-        </w:rPr>
-        <w:t xml:space="preserve"> </w:t>
-      </w:r>
-      <w:r>
-        <w:rPr>
-          <w:rStyle w:val="VerbatimChar"/>
-          <w:i/>
-          <w:iCs/>
-        </w:rPr>
-        <w:t xml:space="preserve">paper/sections/variance_mitigation_comparison.tex</w:t>
-      </w:r>
-      <w:r>
-        <w:rPr>
-          <w:i/>
-          <w:iCs/>
-        </w:rPr>
-        <w:t xml:space="preserve">. Bib keys:</w:t>
-      </w:r>
-      <w:r>
-        <w:rPr>
-          <w:i/>
-          <w:iCs/>
-        </w:rPr>
-        <w:t xml:space="preserve"> </w:t>
-      </w:r>
-      <w:r>
-        <w:rPr>
-          <w:rStyle w:val="VerbatimChar"/>
-          <w:i/>
-          <w:iCs/>
-        </w:rPr>
-        <w:t xml:space="preserve">aero2024</w:t>
-      </w:r>
-      <w:r>
-        <w:rPr>
-          <w:i/>
-          <w:iCs/>
-        </w:rPr>
-        <w:t xml:space="preserve">,</w:t>
-      </w:r>
-      <w:r>
-        <w:rPr>
-          <w:i/>
-          <w:iCs/>
-        </w:rPr>
-        <w:t xml:space="preserve"> </w:t>
-      </w:r>
-      <w:r>
-        <w:rPr>
-          <w:rStyle w:val="VerbatimChar"/>
-          <w:i/>
-          <w:iCs/>
-        </w:rPr>
-        <w:t xml:space="preserve">cppo2024</w:t>
-      </w:r>
-      <w:r>
-        <w:rPr>
-          <w:i/>
-          <w:iCs/>
-        </w:rPr>
-        <w:t xml:space="preserve">,</w:t>
-      </w:r>
-      <w:r>
-        <w:rPr>
-          <w:i/>
-          <w:iCs/>
-        </w:rPr>
-        <w:t xml:space="preserve"> </w:t>
-      </w:r>
-      <w:r>
-        <w:rPr>
-          <w:rStyle w:val="VerbatimChar"/>
-          <w:i/>
-          <w:iCs/>
-        </w:rPr>
-        <w:t xml:space="preserve">ngrpo2025</w:t>
-      </w:r>
-      <w:r>
-        <w:rPr>
-          <w:i/>
-          <w:iCs/>
-        </w:rPr>
-        <w:t xml:space="preserve">,</w:t>
-      </w:r>
-      <w:r>
-        <w:rPr>
-          <w:i/>
-          <w:iCs/>
-        </w:rPr>
-        <w:t xml:space="preserve"> </w:t>
-      </w:r>
-      <w:r>
-        <w:rPr>
-          <w:rStyle w:val="VerbatimChar"/>
-          <w:i/>
-          <w:iCs/>
-        </w:rPr>
-        <w:t xml:space="preserve">scafgrpo2025</w:t>
-      </w:r>
-      <w:r>
-        <w:rPr>
-          <w:i/>
-          <w:iCs/>
-        </w:rPr>
-        <w:t xml:space="preserve">.</w:t>
-      </w:r>
-    </w:p>
-    <w:bookmarkStart w:id="23" w:name="variance-mitigation-head-to-head-w14-q7"/>
-    <w:p>
-      <w:pPr>
-        <w:pStyle w:val="Heading3"/>
-      </w:pPr>
-      <w:r>
-        <w:t xml:space="preserve">2.7.1 Variance-Mitigation Head-to-Head (W14, Q7)</w:t>
-      </w:r>
-    </w:p>
-    <w:p>
-      <w:pPr>
-        <w:pStyle w:val="FirstParagraph"/>
+        <w:t xml:space="preserve">DLER / GRPO-LEAD</w:t>
+      </w:r>
+      <w:r>
+        <w:t xml:space="preserve"> </w:t>
+      </w:r>
+      <w:r>
+        <w:t xml:space="preserve">(EMNLP 2025, aclanthology.org/2025.emnlp-main.287): Length-dependent accuracy rewards + difficulty-aware advantage reweighting; reduces token usage 37.5% while matching peak performance.</w:t>
+      </w:r>
+    </w:p>
+    <w:p>
+      <w:pPr>
+        <w:pStyle w:val="Compact"/>
+        <w:numPr>
+          <w:ilvl w:val="0"/>
+          <w:numId w:val="1006"/>
+        </w:numPr>
       </w:pPr>
       <w:r>
         <w:rPr>
           <w:b/>
           <w:bCs/>
         </w:rPr>
-        <w:t xml:space="preserve">Methods benchmarked.</w:t>
-      </w:r>
-      <w:r>
-        <w:t xml:space="preserve"> </w:t>
-      </w:r>
-      <w:r>
-        <w:t xml:space="preserve">Each is implemented as a minimal configuration override on the shared GRPO trainer; tokenizer, sampler, optimizer, LoRA adapters, evaluation harness, and seed sweep are held identical across the five runs. Only the variance-mitigation hook differs.</w:t>
+        <w:t xml:space="preserve">ΔL Normalization / λ-GRPO</w:t>
+      </w:r>
+      <w:r>
+        <w:t xml:space="preserve"> </w:t>
+      </w:r>
+      <w:r>
+        <w:t xml:space="preserve">(Wang et al., arXiv:2510.06870, Oct 2025): Learnable token preference parameter that unifies GRPO, DAPO, and Dr.GRPO; adaptive length neutrality.</w:t>
+      </w:r>
+    </w:p>
+    <w:bookmarkEnd w:id="20"/>
+    <w:bookmarkStart w:id="21" w:name="X4be390ade3a1100b9fe52a96b6c8bce9056b574"/>
+    <w:p>
+      <w:pPr>
+        <w:pStyle w:val="Heading3"/>
+      </w:pPr>
+      <w:r>
+        <w:t xml:space="preserve">2.6.5 Compute-Optimal RL: Scaling and Efficiency</w:t>
       </w:r>
     </w:p>
     <w:p>
@@ -1995,6 +1784,217 @@
         <w:numPr>
           <w:ilvl w:val="0"/>
           <w:numId w:val="1007"/>
+        </w:numPr>
+      </w:pPr>
+      <w:r>
+        <w:rPr>
+          <w:b/>
+          <w:bCs/>
+        </w:rPr>
+        <w:t xml:space="preserve">Predictive Scaling Laws for GRPO (Nimmaturi et al., arXiv:2507.18014, July 2025):</w:t>
+      </w:r>
+      <w:r>
+        <w:t xml:space="preserve"> </w:t>
+      </w:r>
+      <w:r>
+        <w:t xml:space="preserve">Identifies three-phase exponential saturation in GRPO training; shows training beyond 80% of one epoch offers negligible gain. This directly corroborates our Section 5.11 finding that R(t)=R_max(1−e^{−k(t−t_0)}) fits better than a power law, and that the 80% reward threshold is crossed at approximately 81% of training progress.</w:t>
+      </w:r>
+    </w:p>
+    <w:p>
+      <w:pPr>
+        <w:pStyle w:val="Compact"/>
+        <w:numPr>
+          <w:ilvl w:val="0"/>
+          <w:numId w:val="1007"/>
+        </w:numPr>
+      </w:pPr>
+      <w:r>
+        <w:rPr>
+          <w:b/>
+          <w:bCs/>
+        </w:rPr>
+        <w:t xml:space="preserve">IsoCompute Playbook:</w:t>
+      </w:r>
+      <w:r>
+        <w:t xml:space="preserve"> </w:t>
+      </w:r>
+      <w:r>
+        <w:t xml:space="preserve">Multiple papers (CPPO, GRESO, 2-GRPO) independently advocate reducing rollout compute, converging on the principle that compute-optimal RL training requires much fewer completions per prompt than standard G=8–16 settings. CPPO (arXiv:2503.22342) achieves up to 8.32× speedup on GSM8K via low-advantage pruning; GRESO (arXiv:2506.02177) achieves 2.4× speedup by pre-filtering zero-variance prompts.</w:t>
+      </w:r>
+    </w:p>
+    <w:p>
+      <w:r>
+        <w:pict>
+          <v:rect style="width:0;height:1.5pt" o:hralign="center" o:hrstd="t" o:hr="t"/>
+        </w:pict>
+      </w:r>
+    </w:p>
+    <w:bookmarkEnd w:id="21"/>
+    <w:bookmarkEnd w:id="22"/>
+    <w:bookmarkStart w:id="25" w:name="variance-mitigation-methods-head-to-head"/>
+    <w:p>
+      <w:pPr>
+        <w:pStyle w:val="Heading2"/>
+      </w:pPr>
+      <w:r>
+        <w:t xml:space="preserve">2.7 Variance-Mitigation Methods (Head-to-Head)</w:t>
+      </w:r>
+    </w:p>
+    <w:p>
+      <w:pPr>
+        <w:pStyle w:val="FirstParagraph"/>
+      </w:pPr>
+      <w:r>
+        <w:rPr>
+          <w:i/>
+          <w:iCs/>
+        </w:rPr>
+        <w:t xml:space="preserve">Addresses reviewer concerns W14 (missing AERO/CPPO/NGRPO/Scaf-GRPO comparisons) and Q7 (integrate a variance-mitigation method and test ZVF predictiveness). Paper section:</w:t>
+      </w:r>
+      <w:r>
+        <w:rPr>
+          <w:i/>
+          <w:iCs/>
+        </w:rPr>
+        <w:t xml:space="preserve"> </w:t>
+      </w:r>
+      <w:r>
+        <w:rPr>
+          <w:rStyle w:val="VerbatimChar"/>
+          <w:i/>
+          <w:iCs/>
+        </w:rPr>
+        <w:t xml:space="preserve">paper/sections/variance_mitigation_comparison.tex</w:t>
+      </w:r>
+      <w:r>
+        <w:rPr>
+          <w:i/>
+          <w:iCs/>
+        </w:rPr>
+        <w:t xml:space="preserve">. Bib keys:</w:t>
+      </w:r>
+      <w:r>
+        <w:rPr>
+          <w:i/>
+          <w:iCs/>
+        </w:rPr>
+        <w:t xml:space="preserve"> </w:t>
+      </w:r>
+      <w:r>
+        <w:rPr>
+          <w:rStyle w:val="VerbatimChar"/>
+          <w:i/>
+          <w:iCs/>
+        </w:rPr>
+        <w:t xml:space="preserve">aero2024</w:t>
+      </w:r>
+      <w:r>
+        <w:rPr>
+          <w:i/>
+          <w:iCs/>
+        </w:rPr>
+        <w:t xml:space="preserve">,</w:t>
+      </w:r>
+      <w:r>
+        <w:rPr>
+          <w:i/>
+          <w:iCs/>
+        </w:rPr>
+        <w:t xml:space="preserve"> </w:t>
+      </w:r>
+      <w:r>
+        <w:rPr>
+          <w:rStyle w:val="VerbatimChar"/>
+          <w:i/>
+          <w:iCs/>
+        </w:rPr>
+        <w:t xml:space="preserve">cppo2024</w:t>
+      </w:r>
+      <w:r>
+        <w:rPr>
+          <w:i/>
+          <w:iCs/>
+        </w:rPr>
+        <w:t xml:space="preserve">,</w:t>
+      </w:r>
+      <w:r>
+        <w:rPr>
+          <w:i/>
+          <w:iCs/>
+        </w:rPr>
+        <w:t xml:space="preserve"> </w:t>
+      </w:r>
+      <w:r>
+        <w:rPr>
+          <w:rStyle w:val="VerbatimChar"/>
+          <w:i/>
+          <w:iCs/>
+        </w:rPr>
+        <w:t xml:space="preserve">ngrpo2025</w:t>
+      </w:r>
+      <w:r>
+        <w:rPr>
+          <w:i/>
+          <w:iCs/>
+        </w:rPr>
+        <w:t xml:space="preserve">,</w:t>
+      </w:r>
+      <w:r>
+        <w:rPr>
+          <w:i/>
+          <w:iCs/>
+        </w:rPr>
+        <w:t xml:space="preserve"> </w:t>
+      </w:r>
+      <w:r>
+        <w:rPr>
+          <w:rStyle w:val="VerbatimChar"/>
+          <w:i/>
+          <w:iCs/>
+        </w:rPr>
+        <w:t xml:space="preserve">scafgrpo2025</w:t>
+      </w:r>
+      <w:r>
+        <w:rPr>
+          <w:i/>
+          <w:iCs/>
+        </w:rPr>
+        <w:t xml:space="preserve">.</w:t>
+      </w:r>
+    </w:p>
+    <w:bookmarkStart w:id="23" w:name="variance-mitigation-head-to-head-w14-q7"/>
+    <w:p>
+      <w:pPr>
+        <w:pStyle w:val="Heading3"/>
+      </w:pPr>
+      <w:r>
+        <w:t xml:space="preserve">2.7.1 Variance-Mitigation Head-to-Head (W14, Q7)</w:t>
+      </w:r>
+    </w:p>
+    <w:p>
+      <w:pPr>
+        <w:pStyle w:val="FirstParagraph"/>
+      </w:pPr>
+      <w:r>
+        <w:rPr>
+          <w:b/>
+          <w:bCs/>
+        </w:rPr>
+        <w:t xml:space="preserve">Methods benchmarked.</w:t>
+      </w:r>
+      <w:r>
+        <w:t xml:space="preserve"> </w:t>
+      </w:r>
+      <w:r>
+        <w:t xml:space="preserve">Each is implemented as a minimal configuration override on the shared GRPO trainer; tokenizer, sampler, optimizer, LoRA adapters, evaluation harness, and seed sweep are held identical across the five runs. Only the variance-mitigation hook differs.</w:t>
+      </w:r>
+    </w:p>
+    <w:p>
+      <w:pPr>
+        <w:pStyle w:val="Compact"/>
+        <w:numPr>
+          <w:ilvl w:val="0"/>
+          <w:numId w:val="1008"/>
         </w:numPr>
       </w:pPr>
       <w:r>
@@ -2155,7 +2155,7 @@
         <w:pStyle w:val="Compact"/>
         <w:numPr>
           <w:ilvl w:val="0"/>
-          <w:numId w:val="1007"/>
+          <w:numId w:val="1008"/>
         </w:numPr>
       </w:pPr>
       <w:r>
@@ -2277,7 +2277,7 @@
         <w:pStyle w:val="Compact"/>
         <w:numPr>
           <w:ilvl w:val="0"/>
-          <w:numId w:val="1007"/>
+          <w:numId w:val="1008"/>
         </w:numPr>
       </w:pPr>
       <w:r>
@@ -2498,7 +2498,7 @@
         <w:pStyle w:val="Compact"/>
         <w:numPr>
           <w:ilvl w:val="0"/>
-          <w:numId w:val="1007"/>
+          <w:numId w:val="1008"/>
         </w:numPr>
       </w:pPr>
       <w:r>
@@ -10691,7 +10691,7 @@
         <w:pStyle w:val="Compact"/>
         <w:numPr>
           <w:ilvl w:val="0"/>
-          <w:numId w:val="1008"/>
+          <w:numId w:val="1009"/>
         </w:numPr>
       </w:pPr>
       <w:r>
@@ -10722,7 +10722,7 @@
         <w:pStyle w:val="Compact"/>
         <w:numPr>
           <w:ilvl w:val="0"/>
-          <w:numId w:val="1008"/>
+          <w:numId w:val="1009"/>
         </w:numPr>
       </w:pPr>
       <w:r>
@@ -10765,7 +10765,7 @@
         <w:pStyle w:val="Compact"/>
         <w:numPr>
           <w:ilvl w:val="0"/>
-          <w:numId w:val="1008"/>
+          <w:numId w:val="1009"/>
         </w:numPr>
       </w:pPr>
       <w:r>
@@ -11907,88 +11907,11 @@
         <w:pStyle w:val="Compact"/>
         <w:numPr>
           <w:ilvl w:val="0"/>
-          <w:numId w:val="1009"/>
+          <w:numId w:val="1010"/>
         </w:numPr>
       </w:pPr>
       <w:r>
         <w:t xml:space="preserve">Always well-defined, including in the all-zero-reward degenerate case.</w:t>
-      </w:r>
-    </w:p>
-    <w:p>
-      <w:pPr>
-        <w:pStyle w:val="Compact"/>
-        <w:numPr>
-          <w:ilvl w:val="0"/>
-          <w:numId w:val="1009"/>
-        </w:numPr>
-      </w:pPr>
-      <w:r>
-        <w:t xml:space="preserve">Decomposes as</w:t>
-      </w:r>
-      <w:r>
-        <w:t xml:space="preserve"> </w:t>
-      </w:r>
-      <w:r>
-        <w:rPr>
-          <w:rStyle w:val="VerbatimChar"/>
-        </w:rPr>
-        <w:t xml:space="preserve">ERF = p_fmt · p_{r&gt;0 | fmt}</w:t>
-      </w:r>
-      <w:r>
-        <w:t xml:space="preserve">, separating format-adherence bottlenecks from reasoning bottlenecks and directly motivating the SFT warm-start.</w:t>
-      </w:r>
-    </w:p>
-    <w:p>
-      <w:pPr>
-        <w:pStyle w:val="Compact"/>
-        <w:numPr>
-          <w:ilvl w:val="0"/>
-          <w:numId w:val="1009"/>
-        </w:numPr>
-      </w:pPr>
-      <w:r>
-        <w:t xml:space="preserve">Increases monotonically with training quality in the format-gated regime, providing signal where ZVF is flat.</w:t>
-      </w:r>
-    </w:p>
-    <w:p>
-      <w:pPr>
-        <w:pStyle w:val="FirstParagraph"/>
-      </w:pPr>
-      <w:r>
-        <w:t xml:space="preserve">ERF reduces to accuracy on GSM8K (where format gating is trivial), so it is drop-in backward-compatible with the math diagnostics in §4.1 and §4.2 of the main capstone report. In the current TSV all four tool-use records show ERF = 0.0000, confirming that the format-adherence term</w:t>
-      </w:r>
-      <w:r>
-        <w:t xml:space="preserve"> </w:t>
-      </w:r>
-      <w:r>
-        <w:rPr>
-          <w:rStyle w:val="VerbatimChar"/>
-        </w:rPr>
-        <w:t xml:space="preserve">p_fmt</w:t>
-      </w:r>
-      <w:r>
-        <w:t xml:space="preserve"> </w:t>
-      </w:r>
-      <w:r>
-        <w:t xml:space="preserve">is the binding constraint — consistent with the SFT warm-start hypothesis above.</w:t>
-      </w:r>
-    </w:p>
-    <w:bookmarkEnd w:id="54"/>
-    <w:bookmarkStart w:id="55" w:name="scope-of-claims-statement"/>
-    <w:p>
-      <w:pPr>
-        <w:pStyle w:val="Heading4"/>
-      </w:pPr>
-      <w:r>
-        <w:t xml:space="preserve">Scope-of-Claims Statement</w:t>
-      </w:r>
-    </w:p>
-    <w:p>
-      <w:pPr>
-        <w:pStyle w:val="FirstParagraph"/>
-      </w:pPr>
-      <w:r>
-        <w:t xml:space="preserve">In light of the above, the RL-dynamics claims of this paper are explicitly scoped:</w:t>
       </w:r>
     </w:p>
     <w:p>
@@ -12000,33 +11923,19 @@
         </w:numPr>
       </w:pPr>
       <w:r>
-        <w:rPr>
-          <w:b/>
-          <w:bCs/>
-        </w:rPr>
-        <w:t xml:space="preserve">In scope.</w:t>
-      </w:r>
-      <w:r>
-        <w:t xml:space="preserve"> </w:t>
-      </w:r>
-      <w:r>
-        <w:t xml:space="preserve">Claims about GRPO dynamics (ZVF behavior, group-size trade-offs, temperature / rank / batch sensitivities, cross-framework reconciliation) apply to the</w:t>
-      </w:r>
-      <w:r>
-        <w:t xml:space="preserve"> </w:t>
-      </w:r>
-      <w:r>
-        <w:rPr>
-          <w:b/>
-          <w:bCs/>
-        </w:rPr>
-        <w:t xml:space="preserve">verifiable-math regime</w:t>
-      </w:r>
-      <w:r>
-        <w:t xml:space="preserve"> </w:t>
-      </w:r>
-      <w:r>
-        <w:t xml:space="preserve">— GSM8K- and MATH-style binary reward with non-saturated format gating.</w:t>
+        <w:t xml:space="preserve">Decomposes as</w:t>
+      </w:r>
+      <w:r>
+        <w:t xml:space="preserve"> </w:t>
+      </w:r>
+      <w:r>
+        <w:rPr>
+          <w:rStyle w:val="VerbatimChar"/>
+        </w:rPr>
+        <w:t xml:space="preserve">ERF = p_fmt · p_{r&gt;0 | fmt}</w:t>
+      </w:r>
+      <w:r>
+        <w:t xml:space="preserve">, separating format-adherence bottlenecks from reasoning bottlenecks and directly motivating the SFT warm-start.</w:t>
       </w:r>
     </w:p>
     <w:p>
@@ -12035,6 +11944,97 @@
         <w:numPr>
           <w:ilvl w:val="0"/>
           <w:numId w:val="1010"/>
+        </w:numPr>
+      </w:pPr>
+      <w:r>
+        <w:t xml:space="preserve">Increases monotonically with training quality in the format-gated regime, providing signal where ZVF is flat.</w:t>
+      </w:r>
+    </w:p>
+    <w:p>
+      <w:pPr>
+        <w:pStyle w:val="FirstParagraph"/>
+      </w:pPr>
+      <w:r>
+        <w:t xml:space="preserve">ERF reduces to accuracy on GSM8K (where format gating is trivial), so it is drop-in backward-compatible with the math diagnostics in §4.1 and §4.2 of the main capstone report. In the current TSV all four tool-use records show ERF = 0.0000, confirming that the format-adherence term</w:t>
+      </w:r>
+      <w:r>
+        <w:t xml:space="preserve"> </w:t>
+      </w:r>
+      <w:r>
+        <w:rPr>
+          <w:rStyle w:val="VerbatimChar"/>
+        </w:rPr>
+        <w:t xml:space="preserve">p_fmt</w:t>
+      </w:r>
+      <w:r>
+        <w:t xml:space="preserve"> </w:t>
+      </w:r>
+      <w:r>
+        <w:t xml:space="preserve">is the binding constraint — consistent with the SFT warm-start hypothesis above.</w:t>
+      </w:r>
+    </w:p>
+    <w:bookmarkEnd w:id="54"/>
+    <w:bookmarkStart w:id="55" w:name="scope-of-claims-statement"/>
+    <w:p>
+      <w:pPr>
+        <w:pStyle w:val="Heading4"/>
+      </w:pPr>
+      <w:r>
+        <w:t xml:space="preserve">Scope-of-Claims Statement</w:t>
+      </w:r>
+    </w:p>
+    <w:p>
+      <w:pPr>
+        <w:pStyle w:val="FirstParagraph"/>
+      </w:pPr>
+      <w:r>
+        <w:t xml:space="preserve">In light of the above, the RL-dynamics claims of this paper are explicitly scoped:</w:t>
+      </w:r>
+    </w:p>
+    <w:p>
+      <w:pPr>
+        <w:pStyle w:val="Compact"/>
+        <w:numPr>
+          <w:ilvl w:val="0"/>
+          <w:numId w:val="1011"/>
+        </w:numPr>
+      </w:pPr>
+      <w:r>
+        <w:rPr>
+          <w:b/>
+          <w:bCs/>
+        </w:rPr>
+        <w:t xml:space="preserve">In scope.</w:t>
+      </w:r>
+      <w:r>
+        <w:t xml:space="preserve"> </w:t>
+      </w:r>
+      <w:r>
+        <w:t xml:space="preserve">Claims about GRPO dynamics (ZVF behavior, group-size trade-offs, temperature / rank / batch sensitivities, cross-framework reconciliation) apply to the</w:t>
+      </w:r>
+      <w:r>
+        <w:t xml:space="preserve"> </w:t>
+      </w:r>
+      <w:r>
+        <w:rPr>
+          <w:b/>
+          <w:bCs/>
+        </w:rPr>
+        <w:t xml:space="preserve">verifiable-math regime</w:t>
+      </w:r>
+      <w:r>
+        <w:t xml:space="preserve"> </w:t>
+      </w:r>
+      <w:r>
+        <w:t xml:space="preserve">— GSM8K- and MATH-style binary reward with non-saturated format gating.</w:t>
+      </w:r>
+    </w:p>
+    <w:p>
+      <w:pPr>
+        <w:pStyle w:val="Compact"/>
+        <w:numPr>
+          <w:ilvl w:val="0"/>
+          <w:numId w:val="1011"/>
         </w:numPr>
       </w:pPr>
       <w:r>
@@ -17863,15 +17863,15 @@
       <w:r>
         <w:t xml:space="preserve">Llama-3.1-8B base on tool-use showed a dramatic trajectory:</w:t>
       </w:r>
-      <w:r>
-        <w:t xml:space="preserve"> </w:t>
-      </w:r>
-      <w:r>
-        <w:t xml:space="preserve">1.</w:t>
-      </w:r>
-      <w:r>
-        <w:t xml:space="preserve"> </w:t>
-      </w:r>
+    </w:p>
+    <w:p>
+      <w:pPr>
+        <w:pStyle w:val="Compact"/>
+        <w:numPr>
+          <w:ilvl w:val="0"/>
+          <w:numId w:val="1012"/>
+        </w:numPr>
+      </w:pPr>
       <w:r>
         <w:rPr>
           <w:b/>
@@ -17885,15 +17885,15 @@
       <w:r>
         <w:t xml:space="preserve">Stuck at reward 0.10-0.18, 75-100% ZVF (saturated at bottom)</w:t>
       </w:r>
-      <w:r>
-        <w:t xml:space="preserve"> </w:t>
-      </w:r>
-      <w:r>
-        <w:t xml:space="preserve">2.</w:t>
-      </w:r>
-      <w:r>
-        <w:t xml:space="preserve"> </w:t>
-      </w:r>
+    </w:p>
+    <w:p>
+      <w:pPr>
+        <w:pStyle w:val="Compact"/>
+        <w:numPr>
+          <w:ilvl w:val="0"/>
+          <w:numId w:val="1012"/>
+        </w:numPr>
+      </w:pPr>
       <w:r>
         <w:rPr>
           <w:b/>
@@ -17917,15 +17917,15 @@
         </w:rPr>
         <w:t xml:space="preserve">0.873</w:t>
       </w:r>
-      <w:r>
-        <w:t xml:space="preserve"> </w:t>
-      </w:r>
-      <w:r>
-        <w:t xml:space="preserve">3.</w:t>
-      </w:r>
-      <w:r>
-        <w:t xml:space="preserve"> </w:t>
-      </w:r>
+    </w:p>
+    <w:p>
+      <w:pPr>
+        <w:pStyle w:val="Compact"/>
+        <w:numPr>
+          <w:ilvl w:val="0"/>
+          <w:numId w:val="1012"/>
+        </w:numPr>
+      </w:pPr>
       <w:r>
         <w:rPr>
           <w:b/>
@@ -17949,15 +17949,15 @@
         </w:rPr>
         <w:t xml:space="preserve">0.000</w:t>
       </w:r>
-      <w:r>
-        <w:t xml:space="preserve"> </w:t>
-      </w:r>
-      <w:r>
-        <w:t xml:space="preserve">4.</w:t>
-      </w:r>
-      <w:r>
-        <w:t xml:space="preserve"> </w:t>
-      </w:r>
+    </w:p>
+    <w:p>
+      <w:pPr>
+        <w:pStyle w:val="Compact"/>
+        <w:numPr>
+          <w:ilvl w:val="0"/>
+          <w:numId w:val="1012"/>
+        </w:numPr>
+      </w:pPr>
       <w:r>
         <w:rPr>
           <w:b/>
@@ -17974,7 +17974,7 @@
     </w:p>
     <w:p>
       <w:pPr>
-        <w:pStyle w:val="BodyText"/>
+        <w:pStyle w:val="FirstParagraph"/>
       </w:pPr>
       <w:r>
         <w:t xml:space="preserve">Loss magnitudes during breakout reached -238, indicating extreme policy divergence. This is a textbook reward hacking -&gt; collapse pattern.</w:t>
@@ -21189,7 +21189,7 @@
       <w:pPr>
         <w:numPr>
           <w:ilvl w:val="0"/>
-          <w:numId w:val="1011"/>
+          <w:numId w:val="1013"/>
         </w:numPr>
       </w:pPr>
       <w:r>
@@ -21210,7 +21210,7 @@
       <w:pPr>
         <w:numPr>
           <w:ilvl w:val="0"/>
-          <w:numId w:val="1011"/>
+          <w:numId w:val="1013"/>
         </w:numPr>
       </w:pPr>
       <w:r>
@@ -25274,7 +25274,7 @@
         <w:pStyle w:val="Compact"/>
         <w:numPr>
           <w:ilvl w:val="0"/>
-          <w:numId w:val="1012"/>
+          <w:numId w:val="1014"/>
         </w:numPr>
       </w:pPr>
       <w:r>
@@ -25286,7 +25286,7 @@
         <w:pStyle w:val="Compact"/>
         <w:numPr>
           <w:ilvl w:val="0"/>
-          <w:numId w:val="1012"/>
+          <w:numId w:val="1014"/>
         </w:numPr>
       </w:pPr>
       <w:r>
@@ -25343,7 +25343,7 @@
         <w:pStyle w:val="Compact"/>
         <w:numPr>
           <w:ilvl w:val="0"/>
-          <w:numId w:val="1012"/>
+          <w:numId w:val="1014"/>
         </w:numPr>
       </w:pPr>
       <w:r>
@@ -25388,7 +25388,7 @@
         <w:pStyle w:val="Compact"/>
         <w:numPr>
           <w:ilvl w:val="0"/>
-          <w:numId w:val="1012"/>
+          <w:numId w:val="1014"/>
         </w:numPr>
       </w:pPr>
       <w:r>
@@ -25433,7 +25433,7 @@
         <w:pStyle w:val="Compact"/>
         <w:numPr>
           <w:ilvl w:val="0"/>
-          <w:numId w:val="1012"/>
+          <w:numId w:val="1014"/>
         </w:numPr>
       </w:pPr>
       <w:r>
@@ -25502,7 +25502,7 @@
         <w:pStyle w:val="Compact"/>
         <w:numPr>
           <w:ilvl w:val="0"/>
-          <w:numId w:val="1012"/>
+          <w:numId w:val="1014"/>
         </w:numPr>
       </w:pPr>
       <w:r>
@@ -25535,7 +25535,7 @@
         <w:pStyle w:val="Compact"/>
         <w:numPr>
           <w:ilvl w:val="0"/>
-          <w:numId w:val="1012"/>
+          <w:numId w:val="1014"/>
         </w:numPr>
       </w:pPr>
       <w:r>
@@ -25547,7 +25547,7 @@
         <w:pStyle w:val="Compact"/>
         <w:numPr>
           <w:ilvl w:val="0"/>
-          <w:numId w:val="1012"/>
+          <w:numId w:val="1014"/>
         </w:numPr>
       </w:pPr>
       <w:r>
@@ -25559,7 +25559,7 @@
         <w:pStyle w:val="Compact"/>
         <w:numPr>
           <w:ilvl w:val="0"/>
-          <w:numId w:val="1012"/>
+          <w:numId w:val="1014"/>
         </w:numPr>
       </w:pPr>
       <w:r>
@@ -27551,34 +27551,58 @@
       <w:r>
         <w:t xml:space="preserve">, not an established threshold:</w:t>
       </w:r>
-      <w:r>
-        <w:t xml:space="preserve"> </w:t>
-      </w:r>
-      <w:r>
-        <w:t xml:space="preserve">- The 4B model (Qwen3.5-4B) and 3B model (Llama-3.2-3B) differ in architecture family and model generation, not just parameter count. Architecture confound cannot be ruled out.</w:t>
-      </w:r>
-      <w:r>
-        <w:t xml:space="preserve"> </w:t>
-      </w:r>
-      <w:r>
-        <w:t xml:space="preserve">- The 1.5B model succeeds on tool calling (92% JSON validity) while the 3B fails on math, suggesting the threshold is task-dependent, not a universal parameter-count boundary.</w:t>
-      </w:r>
-      <w:r>
-        <w:t xml:space="preserve"> </w:t>
-      </w:r>
-      <w:r>
-        <w:t xml:space="preserve">- 4B multi-seed replication (4 seeds, mean 84.7%, SD=12.0%) confirms the result is reproducible but variance is high.</w:t>
-      </w:r>
-      <w:r>
-        <w:t xml:space="preserve"> </w:t>
-      </w:r>
-      <w:r>
-        <w:t xml:space="preserve">- The 10x size ladder confirms the null extends to Qwen sub-8B models (0.6B, 1.7B), ruling out the Llama-specific architecture confound for the smallest models.</w:t>
-      </w:r>
-    </w:p>
-    <w:p>
-      <w:pPr>
-        <w:pStyle w:val="BodyText"/>
+    </w:p>
+    <w:p>
+      <w:pPr>
+        <w:pStyle w:val="Compact"/>
+        <w:numPr>
+          <w:ilvl w:val="0"/>
+          <w:numId w:val="1015"/>
+        </w:numPr>
+      </w:pPr>
+      <w:r>
+        <w:t xml:space="preserve">The 4B model (Qwen3.5-4B) and 3B model (Llama-3.2-3B) differ in architecture family and model generation, not just parameter count. Architecture confound cannot be ruled out.</w:t>
+      </w:r>
+    </w:p>
+    <w:p>
+      <w:pPr>
+        <w:pStyle w:val="Compact"/>
+        <w:numPr>
+          <w:ilvl w:val="0"/>
+          <w:numId w:val="1015"/>
+        </w:numPr>
+      </w:pPr>
+      <w:r>
+        <w:t xml:space="preserve">The 1.5B model succeeds on tool calling (92% JSON validity) while the 3B fails on math, suggesting the threshold is task-dependent, not a universal parameter-count boundary.</w:t>
+      </w:r>
+    </w:p>
+    <w:p>
+      <w:pPr>
+        <w:pStyle w:val="Compact"/>
+        <w:numPr>
+          <w:ilvl w:val="0"/>
+          <w:numId w:val="1015"/>
+        </w:numPr>
+      </w:pPr>
+      <w:r>
+        <w:t xml:space="preserve">4B multi-seed replication (4 seeds, mean 84.7%, SD=12.0%) confirms the result is reproducible but variance is high.</w:t>
+      </w:r>
+    </w:p>
+    <w:p>
+      <w:pPr>
+        <w:pStyle w:val="Compact"/>
+        <w:numPr>
+          <w:ilvl w:val="0"/>
+          <w:numId w:val="1015"/>
+        </w:numPr>
+      </w:pPr>
+      <w:r>
+        <w:t xml:space="preserve">The 10x size ladder confirms the null extends to Qwen sub-8B models (0.6B, 1.7B), ruling out the Llama-specific architecture confound for the smallest models.</w:t>
+      </w:r>
+    </w:p>
+    <w:p>
+      <w:pPr>
+        <w:pStyle w:val="FirstParagraph"/>
       </w:pPr>
       <w:r>
         <w:rPr>
@@ -27763,15 +27787,15 @@
       <w:r>
         <w:t xml:space="preserve">GRPO training exhibits a characteristic two-phase pattern on tool-calling tasks:</w:t>
       </w:r>
-      <w:r>
-        <w:t xml:space="preserve"> </w:t>
-      </w:r>
-      <w:r>
-        <w:t xml:space="preserve">-</w:t>
-      </w:r>
-      <w:r>
-        <w:t xml:space="preserve"> </w:t>
-      </w:r>
+    </w:p>
+    <w:p>
+      <w:pPr>
+        <w:pStyle w:val="Compact"/>
+        <w:numPr>
+          <w:ilvl w:val="0"/>
+          <w:numId w:val="1016"/>
+        </w:numPr>
+      </w:pPr>
       <w:r>
         <w:rPr>
           <w:b/>
@@ -27785,15 +27809,15 @@
       <w:r>
         <w:t xml:space="preserve">Model learns answer FORMAT compliance (0%-&gt;14% accuracy)</w:t>
       </w:r>
-      <w:r>
-        <w:t xml:space="preserve"> </w:t>
-      </w:r>
-      <w:r>
-        <w:t xml:space="preserve">-</w:t>
-      </w:r>
-      <w:r>
-        <w:t xml:space="preserve"> </w:t>
-      </w:r>
+    </w:p>
+    <w:p>
+      <w:pPr>
+        <w:pStyle w:val="Compact"/>
+        <w:numPr>
+          <w:ilvl w:val="0"/>
+          <w:numId w:val="1016"/>
+        </w:numPr>
+      </w:pPr>
       <w:r>
         <w:rPr>
           <w:b/>
@@ -27810,7 +27834,7 @@
     </w:p>
     <w:p>
       <w:pPr>
-        <w:pStyle w:val="BodyText"/>
+        <w:pStyle w:val="FirstParagraph"/>
       </w:pPr>
       <w:r>
         <w:t xml:space="preserve">This is most pronounced where format compliance is a distinct sub-task; on GSM8K the phases are less separable. We describe this as a domain-dependent observation consistent with known curriculum effects, rather than a novel GRPO property.</w:t>
@@ -27945,29 +27969,53 @@
       <w:r>
         <w:t xml:space="preserve">Our ablation across ranks 8, 16, 32 (default), and 64 reveals:</w:t>
       </w:r>
-      <w:r>
-        <w:t xml:space="preserve"> </w:t>
-      </w:r>
-      <w:r>
-        <w:t xml:space="preserve">- Higher rank correlates with faster initial learning (rank 64 achieves 47.5% in first 5 steps vs. 27.5% for rank 8)</w:t>
-      </w:r>
-      <w:r>
-        <w:t xml:space="preserve"> </w:t>
-      </w:r>
-      <w:r>
-        <w:t xml:space="preserve">- Peak accuracy scales with rank (62.5% -&gt; 75.0% -&gt; 87.5%)</w:t>
-      </w:r>
-      <w:r>
-        <w:t xml:space="preserve"> </w:t>
-      </w:r>
-      <w:r>
-        <w:t xml:space="preserve">- All ranks converge to similar long-run averages (~20-25%), indicating the ceiling is determined by model capacity and reward signal, not adapter capacity</w:t>
-      </w:r>
-      <w:r>
-        <w:t xml:space="preserve"> </w:t>
-      </w:r>
-      <w:r>
-        <w:t xml:space="preserve">- Diminishing returns: rank 16-&gt;64 adds +12.5% peak for 4x more parameters</w:t>
+    </w:p>
+    <w:p>
+      <w:pPr>
+        <w:pStyle w:val="Compact"/>
+        <w:numPr>
+          <w:ilvl w:val="0"/>
+          <w:numId w:val="1017"/>
+        </w:numPr>
+      </w:pPr>
+      <w:r>
+        <w:t xml:space="preserve">Higher rank correlates with faster initial learning (rank 64 achieves 47.5% in first 5 steps vs. 27.5% for rank 8)</w:t>
+      </w:r>
+    </w:p>
+    <w:p>
+      <w:pPr>
+        <w:pStyle w:val="Compact"/>
+        <w:numPr>
+          <w:ilvl w:val="0"/>
+          <w:numId w:val="1017"/>
+        </w:numPr>
+      </w:pPr>
+      <w:r>
+        <w:t xml:space="preserve">Peak accuracy scales with rank (62.5% -&gt; 75.0% -&gt; 87.5%)</w:t>
+      </w:r>
+    </w:p>
+    <w:p>
+      <w:pPr>
+        <w:pStyle w:val="Compact"/>
+        <w:numPr>
+          <w:ilvl w:val="0"/>
+          <w:numId w:val="1017"/>
+        </w:numPr>
+      </w:pPr>
+      <w:r>
+        <w:t xml:space="preserve">All ranks converge to similar long-run averages (~20-25%), indicating the ceiling is determined by model capacity and reward signal, not adapter capacity</w:t>
+      </w:r>
+    </w:p>
+    <w:p>
+      <w:pPr>
+        <w:pStyle w:val="Compact"/>
+        <w:numPr>
+          <w:ilvl w:val="0"/>
+          <w:numId w:val="1017"/>
+        </w:numPr>
+      </w:pPr>
+      <w:r>
+        <w:t xml:space="preserve">Diminishing returns: rank 16-&gt;64 adds +12.5% peak for 4x more parameters</w:t>
       </w:r>
     </w:p>
     <w:bookmarkEnd w:id="97"/>
@@ -30834,7 +30882,7 @@
       <w:pPr>
         <w:numPr>
           <w:ilvl w:val="0"/>
-          <w:numId w:val="1013"/>
+          <w:numId w:val="1018"/>
         </w:numPr>
       </w:pPr>
       <w:r>
@@ -30855,7 +30903,7 @@
       <w:pPr>
         <w:numPr>
           <w:ilvl w:val="0"/>
-          <w:numId w:val="1013"/>
+          <w:numId w:val="1018"/>
         </w:numPr>
       </w:pPr>
       <w:r>
@@ -30876,7 +30924,7 @@
       <w:pPr>
         <w:numPr>
           <w:ilvl w:val="0"/>
-          <w:numId w:val="1013"/>
+          <w:numId w:val="1018"/>
         </w:numPr>
       </w:pPr>
       <w:r>
@@ -32000,34 +32048,58 @@
       <w:r>
         <w:t xml:space="preserve">The most dramatic policy drift in our benchmark:</w:t>
       </w:r>
-      <w:r>
-        <w:t xml:space="preserve"> </w:t>
-      </w:r>
-      <w:r>
-        <w:t xml:space="preserve">- SI = 1.180 (highest across all experiments)</w:t>
-      </w:r>
-      <w:r>
-        <w:t xml:space="preserve"> </w:t>
-      </w:r>
-      <w:r>
-        <w:t xml:space="preserve">- PTD = 0.762 (catastrophic)</w:t>
-      </w:r>
-      <w:r>
-        <w:t xml:space="preserve"> </w:t>
-      </w:r>
-      <w:r>
-        <w:t xml:space="preserve">- Rolling variance peaks at steps 3–5 (σ^2 = 0.041) then partially subsides, consistent with an early-training policy excursion from which the model never recovers</w:t>
-      </w:r>
-      <w:r>
-        <w:t xml:space="preserve"> </w:t>
-      </w:r>
-      <w:r>
-        <w:t xml:space="preserve">- Contrast: Qwen3-235B-A22B has SI ~ 0, PTD ~ 0, indicating the policy remained in the immediate neighborhood of the reference initialization throughout training</w:t>
-      </w:r>
-    </w:p>
-    <w:p>
-      <w:pPr>
-        <w:pStyle w:val="BodyText"/>
+    </w:p>
+    <w:p>
+      <w:pPr>
+        <w:pStyle w:val="Compact"/>
+        <w:numPr>
+          <w:ilvl w:val="0"/>
+          <w:numId w:val="1019"/>
+        </w:numPr>
+      </w:pPr>
+      <w:r>
+        <w:t xml:space="preserve">SI = 1.180 (highest across all experiments)</w:t>
+      </w:r>
+    </w:p>
+    <w:p>
+      <w:pPr>
+        <w:pStyle w:val="Compact"/>
+        <w:numPr>
+          <w:ilvl w:val="0"/>
+          <w:numId w:val="1019"/>
+        </w:numPr>
+      </w:pPr>
+      <w:r>
+        <w:t xml:space="preserve">PTD = 0.762 (catastrophic)</w:t>
+      </w:r>
+    </w:p>
+    <w:p>
+      <w:pPr>
+        <w:pStyle w:val="Compact"/>
+        <w:numPr>
+          <w:ilvl w:val="0"/>
+          <w:numId w:val="1019"/>
+        </w:numPr>
+      </w:pPr>
+      <w:r>
+        <w:t xml:space="preserve">Rolling variance peaks at steps 3–5 (σ^2 = 0.041) then partially subsides, consistent with an early-training policy excursion from which the model never recovers</w:t>
+      </w:r>
+    </w:p>
+    <w:p>
+      <w:pPr>
+        <w:pStyle w:val="Compact"/>
+        <w:numPr>
+          <w:ilvl w:val="0"/>
+          <w:numId w:val="1019"/>
+        </w:numPr>
+      </w:pPr>
+      <w:r>
+        <w:t xml:space="preserve">Contrast: Qwen3-235B-A22B has SI ~ 0, PTD ~ 0, indicating the policy remained in the immediate neighborhood of the reference initialization throughout training</w:t>
+      </w:r>
+    </w:p>
+    <w:p>
+      <w:pPr>
+        <w:pStyle w:val="FirstParagraph"/>
       </w:pPr>
       <w:r>
         <w:rPr>
@@ -34570,7 +34642,7 @@
         <w:pStyle w:val="Compact"/>
         <w:numPr>
           <w:ilvl w:val="0"/>
-          <w:numId w:val="1014"/>
+          <w:numId w:val="1020"/>
         </w:numPr>
       </w:pPr>
       <w:r>
@@ -34592,7 +34664,7 @@
         <w:pStyle w:val="Compact"/>
         <w:numPr>
           <w:ilvl w:val="0"/>
-          <w:numId w:val="1014"/>
+          <w:numId w:val="1020"/>
         </w:numPr>
       </w:pPr>
       <w:r>
@@ -34611,7 +34683,7 @@
         <w:pStyle w:val="Compact"/>
         <w:numPr>
           <w:ilvl w:val="0"/>
-          <w:numId w:val="1014"/>
+          <w:numId w:val="1020"/>
         </w:numPr>
       </w:pPr>
       <w:r>
@@ -34630,7 +34702,7 @@
         <w:pStyle w:val="Compact"/>
         <w:numPr>
           <w:ilvl w:val="0"/>
-          <w:numId w:val="1014"/>
+          <w:numId w:val="1020"/>
         </w:numPr>
       </w:pPr>
       <w:r>
@@ -39407,7 +39479,7 @@
         <w:pStyle w:val="Compact"/>
         <w:numPr>
           <w:ilvl w:val="0"/>
-          <w:numId w:val="1015"/>
+          <w:numId w:val="1021"/>
         </w:numPr>
       </w:pPr>
       <w:r>
@@ -39419,7 +39491,7 @@
         <w:pStyle w:val="Compact"/>
         <w:numPr>
           <w:ilvl w:val="0"/>
-          <w:numId w:val="1015"/>
+          <w:numId w:val="1021"/>
         </w:numPr>
       </w:pPr>
       <w:r>
@@ -39459,7 +39531,7 @@
         <w:pStyle w:val="Compact"/>
         <w:numPr>
           <w:ilvl w:val="0"/>
-          <w:numId w:val="1015"/>
+          <w:numId w:val="1021"/>
         </w:numPr>
       </w:pPr>
       <w:r>
@@ -39513,7 +39585,7 @@
         <w:pStyle w:val="Compact"/>
         <w:numPr>
           <w:ilvl w:val="0"/>
-          <w:numId w:val="1015"/>
+          <w:numId w:val="1021"/>
         </w:numPr>
       </w:pPr>
       <w:r>
@@ -40676,7 +40748,7 @@
         <w:pStyle w:val="Compact"/>
         <w:numPr>
           <w:ilvl w:val="0"/>
-          <w:numId w:val="1016"/>
+          <w:numId w:val="1022"/>
         </w:numPr>
       </w:pPr>
       <w:r>
@@ -40888,7 +40960,7 @@
         <w:pStyle w:val="Compact"/>
         <w:numPr>
           <w:ilvl w:val="0"/>
-          <w:numId w:val="1016"/>
+          <w:numId w:val="1022"/>
         </w:numPr>
       </w:pPr>
       <w:r>
@@ -40990,7 +41062,7 @@
         <w:pStyle w:val="Compact"/>
         <w:numPr>
           <w:ilvl w:val="0"/>
-          <w:numId w:val="1016"/>
+          <w:numId w:val="1022"/>
         </w:numPr>
       </w:pPr>
       <w:r>
@@ -42716,7 +42788,7 @@
         <w:pStyle w:val="Compact"/>
         <w:numPr>
           <w:ilvl w:val="0"/>
-          <w:numId w:val="1017"/>
+          <w:numId w:val="1023"/>
         </w:numPr>
       </w:pPr>
       <w:r>
@@ -42775,7 +42847,7 @@
         <w:pStyle w:val="Compact"/>
         <w:numPr>
           <w:ilvl w:val="0"/>
-          <w:numId w:val="1017"/>
+          <w:numId w:val="1023"/>
         </w:numPr>
       </w:pPr>
       <w:r>
@@ -42831,7 +42903,7 @@
         <w:pStyle w:val="Compact"/>
         <w:numPr>
           <w:ilvl w:val="0"/>
-          <w:numId w:val="1017"/>
+          <w:numId w:val="1023"/>
         </w:numPr>
       </w:pPr>
       <w:r>
@@ -42885,7 +42957,7 @@
         <w:pStyle w:val="Compact"/>
         <w:numPr>
           <w:ilvl w:val="0"/>
-          <w:numId w:val="1017"/>
+          <w:numId w:val="1023"/>
         </w:numPr>
       </w:pPr>
       <w:r>
@@ -42953,7 +43025,7 @@
         <w:pStyle w:val="Compact"/>
         <w:numPr>
           <w:ilvl w:val="0"/>
-          <w:numId w:val="1017"/>
+          <w:numId w:val="1023"/>
         </w:numPr>
       </w:pPr>
       <w:r>
@@ -43013,7 +43085,7 @@
         <w:pStyle w:val="Compact"/>
         <w:numPr>
           <w:ilvl w:val="0"/>
-          <w:numId w:val="1017"/>
+          <w:numId w:val="1023"/>
         </w:numPr>
       </w:pPr>
       <w:r>
@@ -43082,7 +43154,7 @@
         <w:pStyle w:val="Compact"/>
         <w:numPr>
           <w:ilvl w:val="0"/>
-          <w:numId w:val="1017"/>
+          <w:numId w:val="1023"/>
         </w:numPr>
       </w:pPr>
       <w:r>
@@ -44818,7 +44890,7 @@
         <w:pStyle w:val="Compact"/>
         <w:numPr>
           <w:ilvl w:val="0"/>
-          <w:numId w:val="1018"/>
+          <w:numId w:val="1024"/>
         </w:numPr>
       </w:pPr>
       <w:r>
@@ -44840,7 +44912,7 @@
         <w:pStyle w:val="Compact"/>
         <w:numPr>
           <w:ilvl w:val="0"/>
-          <w:numId w:val="1018"/>
+          <w:numId w:val="1024"/>
         </w:numPr>
       </w:pPr>
       <w:r>
@@ -44862,7 +44934,7 @@
         <w:pStyle w:val="Compact"/>
         <w:numPr>
           <w:ilvl w:val="0"/>
-          <w:numId w:val="1018"/>
+          <w:numId w:val="1024"/>
         </w:numPr>
       </w:pPr>
       <w:r>
@@ -45764,7 +45836,7 @@
         <w:pStyle w:val="Compact"/>
         <w:numPr>
           <w:ilvl w:val="0"/>
-          <w:numId w:val="1019"/>
+          <w:numId w:val="1025"/>
         </w:numPr>
       </w:pPr>
       <w:r>
@@ -45789,7 +45861,7 @@
         <w:pStyle w:val="Compact"/>
         <w:numPr>
           <w:ilvl w:val="0"/>
-          <w:numId w:val="1019"/>
+          <w:numId w:val="1025"/>
         </w:numPr>
       </w:pPr>
       <w:r>
@@ -45801,7 +45873,7 @@
         <w:pStyle w:val="Compact"/>
         <w:numPr>
           <w:ilvl w:val="0"/>
-          <w:numId w:val="1019"/>
+          <w:numId w:val="1025"/>
         </w:numPr>
       </w:pPr>
       <w:r>
@@ -45841,7 +45913,7 @@
         <w:pStyle w:val="Compact"/>
         <w:numPr>
           <w:ilvl w:val="0"/>
-          <w:numId w:val="1019"/>
+          <w:numId w:val="1025"/>
         </w:numPr>
       </w:pPr>
       <w:r>
@@ -47669,7 +47741,7 @@
         <w:pStyle w:val="Compact"/>
         <w:numPr>
           <w:ilvl w:val="0"/>
-          <w:numId w:val="1020"/>
+          <w:numId w:val="1026"/>
         </w:numPr>
       </w:pPr>
       <w:r>
@@ -47784,7 +47856,7 @@
         <w:pStyle w:val="Compact"/>
         <w:numPr>
           <w:ilvl w:val="0"/>
-          <w:numId w:val="1020"/>
+          <w:numId w:val="1026"/>
         </w:numPr>
       </w:pPr>
       <w:r>
@@ -47833,7 +47905,7 @@
         <w:pStyle w:val="Compact"/>
         <w:numPr>
           <w:ilvl w:val="0"/>
-          <w:numId w:val="1020"/>
+          <w:numId w:val="1026"/>
         </w:numPr>
       </w:pPr>
       <w:r>
@@ -47997,7 +48069,7 @@
         <w:pStyle w:val="Compact"/>
         <w:numPr>
           <w:ilvl w:val="0"/>
-          <w:numId w:val="1021"/>
+          <w:numId w:val="1027"/>
         </w:numPr>
       </w:pPr>
       <w:r>
@@ -48061,7 +48133,7 @@
         <w:pStyle w:val="Compact"/>
         <w:numPr>
           <w:ilvl w:val="0"/>
-          <w:numId w:val="1021"/>
+          <w:numId w:val="1027"/>
         </w:numPr>
       </w:pPr>
       <w:r>
@@ -48113,7 +48185,7 @@
         <w:pStyle w:val="Compact"/>
         <w:numPr>
           <w:ilvl w:val="0"/>
-          <w:numId w:val="1021"/>
+          <w:numId w:val="1027"/>
         </w:numPr>
       </w:pPr>
       <w:r>
@@ -48165,7 +48237,7 @@
         <w:pStyle w:val="Compact"/>
         <w:numPr>
           <w:ilvl w:val="0"/>
-          <w:numId w:val="1021"/>
+          <w:numId w:val="1027"/>
         </w:numPr>
       </w:pPr>
       <w:r>
@@ -51026,28 +51098,46 @@
       <w:r>
         <w:t xml:space="preserve">Our World-Class Suite experiments were conducted on Tinker SDK v0.16.1 and TRL at an earlier version. The major framework updates between mid-2025 and April 2026 include:</w:t>
       </w:r>
-      <w:r>
-        <w:t xml:space="preserve"> </w:t>
-      </w:r>
-      <w:r>
-        <w:t xml:space="preserve">- TRL v1.0–1.2: asynchronous GRPO, Liger memory reduction, VESPO/DPPO/SDPO, tool-calling support for Qwen3 and LLaMA 3.1/3.2</w:t>
-      </w:r>
-      <w:r>
-        <w:t xml:space="preserve"> </w:t>
-      </w:r>
-      <w:r>
-        <w:t xml:space="preserve">- veRL v0.7.1: GSPO support, Megatron MoE backend, SGLang rollout, per-sample temperature, FlowGRPO trainer</w:t>
-      </w:r>
-      <w:r>
-        <w:t xml:space="preserve"> </w:t>
-      </w:r>
-      <w:r>
-        <w:t xml:space="preserve">- OpenRLHF v0.10.1: VLM support, async RL, Ray-based scaling</w:t>
-      </w:r>
-    </w:p>
-    <w:p>
-      <w:pPr>
-        <w:pStyle w:val="BodyText"/>
+    </w:p>
+    <w:p>
+      <w:pPr>
+        <w:pStyle w:val="Compact"/>
+        <w:numPr>
+          <w:ilvl w:val="0"/>
+          <w:numId w:val="1028"/>
+        </w:numPr>
+      </w:pPr>
+      <w:r>
+        <w:t xml:space="preserve">TRL v1.0–1.2: asynchronous GRPO, Liger memory reduction, VESPO/DPPO/SDPO, tool-calling support for Qwen3 and LLaMA 3.1/3.2</w:t>
+      </w:r>
+    </w:p>
+    <w:p>
+      <w:pPr>
+        <w:pStyle w:val="Compact"/>
+        <w:numPr>
+          <w:ilvl w:val="0"/>
+          <w:numId w:val="1028"/>
+        </w:numPr>
+      </w:pPr>
+      <w:r>
+        <w:t xml:space="preserve">veRL v0.7.1: GSPO support, Megatron MoE backend, SGLang rollout, per-sample temperature, FlowGRPO trainer</w:t>
+      </w:r>
+    </w:p>
+    <w:p>
+      <w:pPr>
+        <w:pStyle w:val="Compact"/>
+        <w:numPr>
+          <w:ilvl w:val="0"/>
+          <w:numId w:val="1028"/>
+        </w:numPr>
+      </w:pPr>
+      <w:r>
+        <w:t xml:space="preserve">OpenRLHF v0.10.1: VLM support, async RL, Ray-based scaling</w:t>
+      </w:r>
+    </w:p>
+    <w:p>
+      <w:pPr>
+        <w:pStyle w:val="FirstParagraph"/>
       </w:pPr>
       <w:r>
         <w:t xml:space="preserve">Any replication of TinkerRL-Bench’s experiments with current frameworks may show meaningfully different results, particularly for the tool-calling track (TRL v1.1+ has native tool-calling GRPO) and for MoE models (veRL’s GSPO support removes the routing-replay workarounds that our Qwen3-235B-A22B experiments required).</w:t>
@@ -51111,7 +51201,7 @@
       <w:pPr>
         <w:numPr>
           <w:ilvl w:val="0"/>
-          <w:numId w:val="1022"/>
+          <w:numId w:val="1029"/>
         </w:numPr>
       </w:pPr>
       <w:r>
@@ -51132,7 +51222,7 @@
       <w:pPr>
         <w:numPr>
           <w:ilvl w:val="0"/>
-          <w:numId w:val="1022"/>
+          <w:numId w:val="1029"/>
         </w:numPr>
       </w:pPr>
       <w:r>
@@ -51143,7 +51233,7 @@
       <w:pPr>
         <w:numPr>
           <w:ilvl w:val="0"/>
-          <w:numId w:val="1022"/>
+          <w:numId w:val="1029"/>
         </w:numPr>
       </w:pPr>
       <w:r>
@@ -51154,7 +51244,7 @@
       <w:pPr>
         <w:numPr>
           <w:ilvl w:val="0"/>
-          <w:numId w:val="1022"/>
+          <w:numId w:val="1029"/>
         </w:numPr>
       </w:pPr>
       <w:r>
@@ -51165,7 +51255,7 @@
       <w:pPr>
         <w:numPr>
           <w:ilvl w:val="0"/>
-          <w:numId w:val="1022"/>
+          <w:numId w:val="1029"/>
         </w:numPr>
       </w:pPr>
       <w:r>
@@ -51176,7 +51266,7 @@
       <w:pPr>
         <w:numPr>
           <w:ilvl w:val="0"/>
-          <w:numId w:val="1022"/>
+          <w:numId w:val="1029"/>
         </w:numPr>
       </w:pPr>
       <w:r>
@@ -51187,7 +51277,7 @@
       <w:pPr>
         <w:numPr>
           <w:ilvl w:val="0"/>
-          <w:numId w:val="1022"/>
+          <w:numId w:val="1029"/>
         </w:numPr>
       </w:pPr>
       <w:r>
@@ -51208,7 +51298,7 @@
       <w:pPr>
         <w:numPr>
           <w:ilvl w:val="0"/>
-          <w:numId w:val="1022"/>
+          <w:numId w:val="1029"/>
         </w:numPr>
       </w:pPr>
       <w:r>
@@ -51229,7 +51319,7 @@
       <w:pPr>
         <w:numPr>
           <w:ilvl w:val="0"/>
-          <w:numId w:val="1022"/>
+          <w:numId w:val="1029"/>
         </w:numPr>
       </w:pPr>
       <w:r>
@@ -51250,7 +51340,7 @@
       <w:pPr>
         <w:numPr>
           <w:ilvl w:val="0"/>
-          <w:numId w:val="1022"/>
+          <w:numId w:val="1029"/>
         </w:numPr>
       </w:pPr>
       <w:r>
@@ -51268,7 +51358,7 @@
       <w:pPr>
         <w:numPr>
           <w:ilvl w:val="0"/>
-          <w:numId w:val="1022"/>
+          <w:numId w:val="1029"/>
         </w:numPr>
       </w:pPr>
       <w:r>
@@ -51289,7 +51379,7 @@
       <w:pPr>
         <w:numPr>
           <w:ilvl w:val="0"/>
-          <w:numId w:val="1022"/>
+          <w:numId w:val="1029"/>
         </w:numPr>
       </w:pPr>
       <w:r>
@@ -51307,7 +51397,7 @@
       <w:pPr>
         <w:numPr>
           <w:ilvl w:val="0"/>
-          <w:numId w:val="1022"/>
+          <w:numId w:val="1029"/>
         </w:numPr>
       </w:pPr>
       <w:r>
@@ -51328,7 +51418,7 @@
       <w:pPr>
         <w:numPr>
           <w:ilvl w:val="0"/>
-          <w:numId w:val="1022"/>
+          <w:numId w:val="1029"/>
         </w:numPr>
       </w:pPr>
       <w:r>
@@ -51349,7 +51439,7 @@
       <w:pPr>
         <w:numPr>
           <w:ilvl w:val="0"/>
-          <w:numId w:val="1022"/>
+          <w:numId w:val="1029"/>
         </w:numPr>
       </w:pPr>
       <w:r>
@@ -51370,7 +51460,7 @@
       <w:pPr>
         <w:numPr>
           <w:ilvl w:val="0"/>
-          <w:numId w:val="1022"/>
+          <w:numId w:val="1029"/>
         </w:numPr>
       </w:pPr>
       <w:r>
@@ -51391,7 +51481,7 @@
       <w:pPr>
         <w:numPr>
           <w:ilvl w:val="0"/>
-          <w:numId w:val="1022"/>
+          <w:numId w:val="1029"/>
         </w:numPr>
       </w:pPr>
       <w:r>
@@ -51412,7 +51502,7 @@
       <w:pPr>
         <w:numPr>
           <w:ilvl w:val="0"/>
-          <w:numId w:val="1022"/>
+          <w:numId w:val="1029"/>
         </w:numPr>
       </w:pPr>
       <w:r>
@@ -51433,7 +51523,7 @@
       <w:pPr>
         <w:numPr>
           <w:ilvl w:val="0"/>
-          <w:numId w:val="1022"/>
+          <w:numId w:val="1029"/>
         </w:numPr>
       </w:pPr>
       <w:r>
@@ -51454,7 +51544,7 @@
       <w:pPr>
         <w:numPr>
           <w:ilvl w:val="0"/>
-          <w:numId w:val="1022"/>
+          <w:numId w:val="1029"/>
         </w:numPr>
       </w:pPr>
       <w:r>
@@ -51475,7 +51565,7 @@
       <w:pPr>
         <w:numPr>
           <w:ilvl w:val="0"/>
-          <w:numId w:val="1022"/>
+          <w:numId w:val="1029"/>
         </w:numPr>
       </w:pPr>
       <w:r>
@@ -51496,7 +51586,7 @@
       <w:pPr>
         <w:numPr>
           <w:ilvl w:val="0"/>
-          <w:numId w:val="1022"/>
+          <w:numId w:val="1029"/>
         </w:numPr>
       </w:pPr>
       <w:r>
@@ -52091,7 +52181,7 @@
         <w:pStyle w:val="Compact"/>
         <w:numPr>
           <w:ilvl w:val="0"/>
-          <w:numId w:val="1023"/>
+          <w:numId w:val="1030"/>
         </w:numPr>
       </w:pPr>
       <w:r>
@@ -52127,7 +52217,7 @@
         <w:pStyle w:val="Compact"/>
         <w:numPr>
           <w:ilvl w:val="0"/>
-          <w:numId w:val="1023"/>
+          <w:numId w:val="1030"/>
         </w:numPr>
       </w:pPr>
       <w:r>
@@ -52149,7 +52239,7 @@
         <w:pStyle w:val="Compact"/>
         <w:numPr>
           <w:ilvl w:val="0"/>
-          <w:numId w:val="1023"/>
+          <w:numId w:val="1030"/>
         </w:numPr>
       </w:pPr>
       <w:r>
@@ -52183,7 +52273,7 @@
         <w:pStyle w:val="Compact"/>
         <w:numPr>
           <w:ilvl w:val="0"/>
-          <w:numId w:val="1023"/>
+          <w:numId w:val="1030"/>
         </w:numPr>
       </w:pPr>
       <w:r>
@@ -52205,7 +52295,7 @@
         <w:pStyle w:val="Compact"/>
         <w:numPr>
           <w:ilvl w:val="0"/>
-          <w:numId w:val="1023"/>
+          <w:numId w:val="1030"/>
         </w:numPr>
       </w:pPr>
       <w:r>
@@ -52227,7 +52317,7 @@
         <w:pStyle w:val="Compact"/>
         <w:numPr>
           <w:ilvl w:val="0"/>
-          <w:numId w:val="1023"/>
+          <w:numId w:val="1030"/>
         </w:numPr>
       </w:pPr>
       <w:r>
@@ -58782,7 +58872,7 @@
         <w:pStyle w:val="Compact"/>
         <w:numPr>
           <w:ilvl w:val="0"/>
-          <w:numId w:val="1024"/>
+          <w:numId w:val="1031"/>
         </w:numPr>
       </w:pPr>
       <w:r>
@@ -58809,7 +58899,7 @@
         <w:pStyle w:val="Compact"/>
         <w:numPr>
           <w:ilvl w:val="0"/>
-          <w:numId w:val="1024"/>
+          <w:numId w:val="1031"/>
         </w:numPr>
       </w:pPr>
       <w:r>
@@ -58866,7 +58956,7 @@
         <w:pStyle w:val="Compact"/>
         <w:numPr>
           <w:ilvl w:val="0"/>
-          <w:numId w:val="1024"/>
+          <w:numId w:val="1031"/>
         </w:numPr>
       </w:pPr>
       <w:r>
@@ -58911,7 +59001,7 @@
         <w:pStyle w:val="Compact"/>
         <w:numPr>
           <w:ilvl w:val="0"/>
-          <w:numId w:val="1024"/>
+          <w:numId w:val="1031"/>
         </w:numPr>
       </w:pPr>
       <w:r>
@@ -58968,7 +59058,7 @@
         <w:pStyle w:val="Compact"/>
         <w:numPr>
           <w:ilvl w:val="0"/>
-          <w:numId w:val="1024"/>
+          <w:numId w:val="1031"/>
         </w:numPr>
       </w:pPr>
       <w:r>
@@ -59001,7 +59091,7 @@
         <w:pStyle w:val="Compact"/>
         <w:numPr>
           <w:ilvl w:val="0"/>
-          <w:numId w:val="1024"/>
+          <w:numId w:val="1031"/>
         </w:numPr>
       </w:pPr>
       <w:r>
@@ -59022,7 +59112,7 @@
         <w:pStyle w:val="Compact"/>
         <w:numPr>
           <w:ilvl w:val="0"/>
-          <w:numId w:val="1024"/>
+          <w:numId w:val="1031"/>
         </w:numPr>
       </w:pPr>
       <w:r>
@@ -59063,7 +59153,7 @@
         <w:pStyle w:val="Compact"/>
         <w:numPr>
           <w:ilvl w:val="0"/>
-          <w:numId w:val="1024"/>
+          <w:numId w:val="1031"/>
         </w:numPr>
       </w:pPr>
       <w:r>
@@ -59101,7 +59191,7 @@
         <w:pStyle w:val="Compact"/>
         <w:numPr>
           <w:ilvl w:val="0"/>
-          <w:numId w:val="1024"/>
+          <w:numId w:val="1031"/>
         </w:numPr>
       </w:pPr>
       <w:r>
@@ -59139,7 +59229,7 @@
         <w:pStyle w:val="Compact"/>
         <w:numPr>
           <w:ilvl w:val="0"/>
-          <w:numId w:val="1024"/>
+          <w:numId w:val="1031"/>
         </w:numPr>
       </w:pPr>
       <w:r>
@@ -59179,7 +59269,7 @@
         <w:pStyle w:val="Compact"/>
         <w:numPr>
           <w:ilvl w:val="0"/>
-          <w:numId w:val="1024"/>
+          <w:numId w:val="1031"/>
         </w:numPr>
       </w:pPr>
       <w:r>
@@ -59500,7 +59590,7 @@
       <w:pPr>
         <w:numPr>
           <w:ilvl w:val="0"/>
-          <w:numId w:val="1025"/>
+          <w:numId w:val="1032"/>
         </w:numPr>
       </w:pPr>
       <w:r>
@@ -59521,7 +59611,7 @@
       <w:pPr>
         <w:numPr>
           <w:ilvl w:val="0"/>
-          <w:numId w:val="1025"/>
+          <w:numId w:val="1032"/>
         </w:numPr>
       </w:pPr>
       <w:r>
@@ -59539,7 +59629,7 @@
       <w:pPr>
         <w:numPr>
           <w:ilvl w:val="0"/>
-          <w:numId w:val="1025"/>
+          <w:numId w:val="1032"/>
         </w:numPr>
       </w:pPr>
       <w:r>
@@ -59560,7 +59650,7 @@
       <w:pPr>
         <w:numPr>
           <w:ilvl w:val="0"/>
-          <w:numId w:val="1025"/>
+          <w:numId w:val="1032"/>
         </w:numPr>
       </w:pPr>
       <w:r>
@@ -59578,7 +59668,7 @@
       <w:pPr>
         <w:numPr>
           <w:ilvl w:val="0"/>
-          <w:numId w:val="1025"/>
+          <w:numId w:val="1032"/>
         </w:numPr>
       </w:pPr>
       <w:r>
@@ -59599,7 +59689,7 @@
       <w:pPr>
         <w:numPr>
           <w:ilvl w:val="0"/>
-          <w:numId w:val="1025"/>
+          <w:numId w:val="1032"/>
         </w:numPr>
       </w:pPr>
       <w:r>
@@ -59617,7 +59707,7 @@
       <w:pPr>
         <w:numPr>
           <w:ilvl w:val="0"/>
-          <w:numId w:val="1025"/>
+          <w:numId w:val="1032"/>
         </w:numPr>
       </w:pPr>
       <w:r>
@@ -59635,7 +59725,7 @@
       <w:pPr>
         <w:numPr>
           <w:ilvl w:val="0"/>
-          <w:numId w:val="1025"/>
+          <w:numId w:val="1032"/>
         </w:numPr>
       </w:pPr>
       <w:r>
@@ -59653,7 +59743,7 @@
       <w:pPr>
         <w:numPr>
           <w:ilvl w:val="0"/>
-          <w:numId w:val="1025"/>
+          <w:numId w:val="1032"/>
         </w:numPr>
       </w:pPr>
       <w:r>
@@ -59691,7 +59781,7 @@
       <w:pPr>
         <w:numPr>
           <w:ilvl w:val="0"/>
-          <w:numId w:val="1025"/>
+          <w:numId w:val="1032"/>
         </w:numPr>
       </w:pPr>
       <w:r>
@@ -59750,7 +59840,7 @@
       <w:pPr>
         <w:numPr>
           <w:ilvl w:val="0"/>
-          <w:numId w:val="1025"/>
+          <w:numId w:val="1032"/>
         </w:numPr>
       </w:pPr>
       <w:r>
@@ -59771,7 +59861,7 @@
       <w:pPr>
         <w:numPr>
           <w:ilvl w:val="0"/>
-          <w:numId w:val="1025"/>
+          <w:numId w:val="1032"/>
         </w:numPr>
       </w:pPr>
       <w:r>
@@ -59824,7 +59914,7 @@
       <w:pPr>
         <w:numPr>
           <w:ilvl w:val="0"/>
-          <w:numId w:val="1025"/>
+          <w:numId w:val="1032"/>
         </w:numPr>
       </w:pPr>
       <w:r>
@@ -59842,7 +59932,7 @@
       <w:pPr>
         <w:numPr>
           <w:ilvl w:val="0"/>
-          <w:numId w:val="1025"/>
+          <w:numId w:val="1032"/>
         </w:numPr>
       </w:pPr>
       <w:r>
@@ -59954,7 +60044,7 @@
         <w:pStyle w:val="Compact"/>
         <w:numPr>
           <w:ilvl w:val="0"/>
-          <w:numId w:val="1026"/>
+          <w:numId w:val="1033"/>
         </w:numPr>
       </w:pPr>
       <w:r>
@@ -59975,7 +60065,7 @@
         <w:pStyle w:val="Compact"/>
         <w:numPr>
           <w:ilvl w:val="0"/>
-          <w:numId w:val="1026"/>
+          <w:numId w:val="1033"/>
         </w:numPr>
       </w:pPr>
       <w:r>
@@ -59996,7 +60086,7 @@
         <w:pStyle w:val="Compact"/>
         <w:numPr>
           <w:ilvl w:val="0"/>
-          <w:numId w:val="1026"/>
+          <w:numId w:val="1033"/>
         </w:numPr>
       </w:pPr>
       <w:r>
@@ -60017,7 +60107,7 @@
         <w:pStyle w:val="Compact"/>
         <w:numPr>
           <w:ilvl w:val="0"/>
-          <w:numId w:val="1026"/>
+          <w:numId w:val="1033"/>
         </w:numPr>
       </w:pPr>
       <w:r>
@@ -60038,7 +60128,7 @@
         <w:pStyle w:val="Compact"/>
         <w:numPr>
           <w:ilvl w:val="0"/>
-          <w:numId w:val="1026"/>
+          <w:numId w:val="1033"/>
         </w:numPr>
       </w:pPr>
       <w:r>
@@ -60059,7 +60149,7 @@
         <w:pStyle w:val="Compact"/>
         <w:numPr>
           <w:ilvl w:val="0"/>
-          <w:numId w:val="1026"/>
+          <w:numId w:val="1033"/>
         </w:numPr>
       </w:pPr>
       <w:r>
@@ -60080,7 +60170,7 @@
         <w:pStyle w:val="Compact"/>
         <w:numPr>
           <w:ilvl w:val="0"/>
-          <w:numId w:val="1026"/>
+          <w:numId w:val="1033"/>
         </w:numPr>
       </w:pPr>
       <w:r>
@@ -60101,7 +60191,7 @@
         <w:pStyle w:val="Compact"/>
         <w:numPr>
           <w:ilvl w:val="0"/>
-          <w:numId w:val="1026"/>
+          <w:numId w:val="1033"/>
         </w:numPr>
       </w:pPr>
       <w:r>
@@ -60122,7 +60212,7 @@
         <w:pStyle w:val="Compact"/>
         <w:numPr>
           <w:ilvl w:val="0"/>
-          <w:numId w:val="1026"/>
+          <w:numId w:val="1033"/>
         </w:numPr>
       </w:pPr>
       <w:r>
@@ -60143,7 +60233,7 @@
         <w:pStyle w:val="Compact"/>
         <w:numPr>
           <w:ilvl w:val="0"/>
-          <w:numId w:val="1026"/>
+          <w:numId w:val="1033"/>
         </w:numPr>
       </w:pPr>
       <w:r>
@@ -60164,7 +60254,7 @@
         <w:pStyle w:val="Compact"/>
         <w:numPr>
           <w:ilvl w:val="0"/>
-          <w:numId w:val="1026"/>
+          <w:numId w:val="1033"/>
         </w:numPr>
       </w:pPr>
       <w:r>
@@ -60185,7 +60275,7 @@
         <w:pStyle w:val="Compact"/>
         <w:numPr>
           <w:ilvl w:val="0"/>
-          <w:numId w:val="1026"/>
+          <w:numId w:val="1033"/>
         </w:numPr>
       </w:pPr>
       <w:r>
@@ -60206,7 +60296,7 @@
         <w:pStyle w:val="Compact"/>
         <w:numPr>
           <w:ilvl w:val="0"/>
-          <w:numId w:val="1026"/>
+          <w:numId w:val="1033"/>
         </w:numPr>
       </w:pPr>
       <w:r>
@@ -60227,7 +60317,7 @@
         <w:pStyle w:val="Compact"/>
         <w:numPr>
           <w:ilvl w:val="0"/>
-          <w:numId w:val="1026"/>
+          <w:numId w:val="1033"/>
         </w:numPr>
       </w:pPr>
       <w:r>
@@ -60248,7 +60338,7 @@
         <w:pStyle w:val="Compact"/>
         <w:numPr>
           <w:ilvl w:val="0"/>
-          <w:numId w:val="1026"/>
+          <w:numId w:val="1033"/>
         </w:numPr>
       </w:pPr>
       <w:r>
@@ -60272,7 +60362,7 @@
         <w:pStyle w:val="Compact"/>
         <w:numPr>
           <w:ilvl w:val="0"/>
-          <w:numId w:val="1026"/>
+          <w:numId w:val="1033"/>
         </w:numPr>
       </w:pPr>
       <w:r>
@@ -60293,7 +60383,7 @@
         <w:pStyle w:val="Compact"/>
         <w:numPr>
           <w:ilvl w:val="0"/>
-          <w:numId w:val="1026"/>
+          <w:numId w:val="1033"/>
         </w:numPr>
       </w:pPr>
       <w:r>
@@ -60314,7 +60404,7 @@
         <w:pStyle w:val="Compact"/>
         <w:numPr>
           <w:ilvl w:val="0"/>
-          <w:numId w:val="1026"/>
+          <w:numId w:val="1033"/>
         </w:numPr>
       </w:pPr>
       <w:r>
@@ -60335,7 +60425,7 @@
         <w:pStyle w:val="Compact"/>
         <w:numPr>
           <w:ilvl w:val="0"/>
-          <w:numId w:val="1026"/>
+          <w:numId w:val="1033"/>
         </w:numPr>
       </w:pPr>
       <w:r>
@@ -60359,7 +60449,7 @@
         <w:pStyle w:val="Compact"/>
         <w:numPr>
           <w:ilvl w:val="0"/>
-          <w:numId w:val="1026"/>
+          <w:numId w:val="1033"/>
         </w:numPr>
       </w:pPr>
       <w:r>
@@ -60383,7 +60473,7 @@
         <w:pStyle w:val="Compact"/>
         <w:numPr>
           <w:ilvl w:val="0"/>
-          <w:numId w:val="1026"/>
+          <w:numId w:val="1033"/>
         </w:numPr>
       </w:pPr>
       <w:r>
@@ -60404,7 +60494,7 @@
         <w:pStyle w:val="Compact"/>
         <w:numPr>
           <w:ilvl w:val="0"/>
-          <w:numId w:val="1026"/>
+          <w:numId w:val="1033"/>
         </w:numPr>
       </w:pPr>
       <w:r>
@@ -60428,7 +60518,7 @@
         <w:pStyle w:val="Compact"/>
         <w:numPr>
           <w:ilvl w:val="0"/>
-          <w:numId w:val="1026"/>
+          <w:numId w:val="1033"/>
         </w:numPr>
       </w:pPr>
       <w:r>
@@ -60452,7 +60542,7 @@
         <w:pStyle w:val="Compact"/>
         <w:numPr>
           <w:ilvl w:val="0"/>
-          <w:numId w:val="1026"/>
+          <w:numId w:val="1033"/>
         </w:numPr>
       </w:pPr>
       <w:r>
@@ -60473,7 +60563,7 @@
         <w:pStyle w:val="Compact"/>
         <w:numPr>
           <w:ilvl w:val="0"/>
-          <w:numId w:val="1026"/>
+          <w:numId w:val="1033"/>
         </w:numPr>
       </w:pPr>
       <w:r>
@@ -60497,7 +60587,7 @@
         <w:pStyle w:val="Compact"/>
         <w:numPr>
           <w:ilvl w:val="0"/>
-          <w:numId w:val="1026"/>
+          <w:numId w:val="1033"/>
         </w:numPr>
       </w:pPr>
       <w:r>
@@ -60518,7 +60608,7 @@
         <w:pStyle w:val="Compact"/>
         <w:numPr>
           <w:ilvl w:val="0"/>
-          <w:numId w:val="1026"/>
+          <w:numId w:val="1033"/>
         </w:numPr>
       </w:pPr>
       <w:r>
@@ -60539,7 +60629,7 @@
         <w:pStyle w:val="Compact"/>
         <w:numPr>
           <w:ilvl w:val="0"/>
-          <w:numId w:val="1026"/>
+          <w:numId w:val="1033"/>
         </w:numPr>
       </w:pPr>
       <w:r>
@@ -60560,7 +60650,7 @@
         <w:pStyle w:val="Compact"/>
         <w:numPr>
           <w:ilvl w:val="0"/>
-          <w:numId w:val="1026"/>
+          <w:numId w:val="1033"/>
         </w:numPr>
       </w:pPr>
       <w:r>
@@ -60581,7 +60671,7 @@
         <w:pStyle w:val="Compact"/>
         <w:numPr>
           <w:ilvl w:val="0"/>
-          <w:numId w:val="1026"/>
+          <w:numId w:val="1033"/>
         </w:numPr>
       </w:pPr>
       <w:r>
@@ -60605,7 +60695,7 @@
         <w:pStyle w:val="Compact"/>
         <w:numPr>
           <w:ilvl w:val="0"/>
-          <w:numId w:val="1026"/>
+          <w:numId w:val="1033"/>
         </w:numPr>
       </w:pPr>
       <w:r>
@@ -60629,7 +60719,7 @@
         <w:pStyle w:val="Compact"/>
         <w:numPr>
           <w:ilvl w:val="0"/>
-          <w:numId w:val="1026"/>
+          <w:numId w:val="1033"/>
         </w:numPr>
       </w:pPr>
       <w:r>
@@ -60653,7 +60743,7 @@
         <w:pStyle w:val="Compact"/>
         <w:numPr>
           <w:ilvl w:val="0"/>
-          <w:numId w:val="1026"/>
+          <w:numId w:val="1033"/>
         </w:numPr>
       </w:pPr>
       <w:r>
@@ -60677,7 +60767,7 @@
         <w:pStyle w:val="Compact"/>
         <w:numPr>
           <w:ilvl w:val="0"/>
-          <w:numId w:val="1026"/>
+          <w:numId w:val="1033"/>
         </w:numPr>
       </w:pPr>
       <w:r>
@@ -60701,7 +60791,7 @@
         <w:pStyle w:val="Compact"/>
         <w:numPr>
           <w:ilvl w:val="0"/>
-          <w:numId w:val="1026"/>
+          <w:numId w:val="1033"/>
         </w:numPr>
       </w:pPr>
       <w:r>
@@ -60722,7 +60812,7 @@
         <w:pStyle w:val="Compact"/>
         <w:numPr>
           <w:ilvl w:val="0"/>
-          <w:numId w:val="1026"/>
+          <w:numId w:val="1033"/>
         </w:numPr>
       </w:pPr>
       <w:r>
@@ -60743,7 +60833,7 @@
         <w:pStyle w:val="Compact"/>
         <w:numPr>
           <w:ilvl w:val="0"/>
-          <w:numId w:val="1026"/>
+          <w:numId w:val="1033"/>
         </w:numPr>
       </w:pPr>
       <w:r>
@@ -60767,7 +60857,7 @@
         <w:pStyle w:val="Compact"/>
         <w:numPr>
           <w:ilvl w:val="0"/>
-          <w:numId w:val="1026"/>
+          <w:numId w:val="1033"/>
         </w:numPr>
       </w:pPr>
       <w:r>
@@ -60791,7 +60881,7 @@
         <w:pStyle w:val="Compact"/>
         <w:numPr>
           <w:ilvl w:val="0"/>
-          <w:numId w:val="1026"/>
+          <w:numId w:val="1033"/>
         </w:numPr>
       </w:pPr>
       <w:r>
@@ -60815,7 +60905,7 @@
         <w:pStyle w:val="Compact"/>
         <w:numPr>
           <w:ilvl w:val="0"/>
-          <w:numId w:val="1026"/>
+          <w:numId w:val="1033"/>
         </w:numPr>
       </w:pPr>
       <w:r>
@@ -60827,7 +60917,7 @@
         <w:pStyle w:val="Compact"/>
         <w:numPr>
           <w:ilvl w:val="0"/>
-          <w:numId w:val="1026"/>
+          <w:numId w:val="1033"/>
         </w:numPr>
       </w:pPr>
       <w:r>
@@ -60839,7 +60929,7 @@
         <w:pStyle w:val="Compact"/>
         <w:numPr>
           <w:ilvl w:val="0"/>
-          <w:numId w:val="1026"/>
+          <w:numId w:val="1033"/>
         </w:numPr>
       </w:pPr>
       <w:r>
@@ -61085,6 +61175,109 @@
       </w:pPr>
     </w:lvl>
   </w:abstractNum>
+  <w:abstractNum w:abstractNumId="991">
+    <w:nsid w:val="0000A991"/>
+    <w:multiLevelType w:val="multilevel"/>
+    <w:lvl w:ilvl="0">
+      <w:numFmt w:val="bullet"/>
+      <w:lvlText w:val=""/>
+      <w:lvlJc w:val="left"/>
+      <w:pPr>
+        <w:ind w:left="720" w:hanging="360"/>
+      </w:pPr>
+      <w:rPr>
+        <w:rFonts w:ascii="Symbol" w:hAnsi="Symbol" w:cs="Symbol" w:hint="default"/>
+      </w:rPr>
+    </w:lvl>
+    <w:lvl w:ilvl="1">
+      <w:numFmt w:val="bullet"/>
+      <w:lvlText w:val="o"/>
+      <w:lvlJc w:val="left"/>
+      <w:pPr>
+        <w:ind w:left="1440" w:hanging="360"/>
+      </w:pPr>
+      <w:rPr>
+        <w:rFonts w:ascii="Courier New" w:hAnsi="Courier New" w:cs="Courier New" w:hint="default"/>
+      </w:rPr>
+    </w:lvl>
+    <w:lvl w:ilvl="2">
+      <w:numFmt w:val="bullet"/>
+      <w:lvlText w:val=""/>
+      <w:lvlJc w:val="left"/>
+      <w:pPr>
+        <w:ind w:left="2160" w:hanging="360"/>
+      </w:pPr>
+      <w:rPr>
+        <w:rFonts w:ascii="Wingdings" w:hAnsi="Wingdings" w:cs="Wingdings" w:hint="default"/>
+      </w:rPr>
+    </w:lvl>
+    <w:lvl w:ilvl="3">
+      <w:numFmt w:val="bullet"/>
+      <w:lvlText w:val=""/>
+      <w:lvlJc w:val="left"/>
+      <w:pPr>
+        <w:ind w:left="2880" w:hanging="360"/>
+      </w:pPr>
+      <w:rPr>
+        <w:rFonts w:ascii="Symbol" w:hAnsi="Symbol" w:cs="Symbol" w:hint="default"/>
+      </w:rPr>
+    </w:lvl>
+    <w:lvl w:ilvl="4">
+      <w:numFmt w:val="bullet"/>
+      <w:lvlText w:val="o"/>
+      <w:lvlJc w:val="left"/>
+      <w:pPr>
+        <w:ind w:left="3600" w:hanging="360"/>
+      </w:pPr>
+      <w:rPr>
+        <w:rFonts w:ascii="Courier New" w:hAnsi="Courier New" w:cs="Courier New" w:hint="default"/>
+      </w:rPr>
+    </w:lvl>
+    <w:lvl w:ilvl="5">
+      <w:numFmt w:val="bullet"/>
+      <w:lvlText w:val=""/>
+      <w:lvlJc w:val="left"/>
+      <w:pPr>
+        <w:ind w:left="4320" w:hanging="360"/>
+      </w:pPr>
+      <w:rPr>
+        <w:rFonts w:ascii="Wingdings" w:hAnsi="Wingdings" w:cs="Wingdings" w:hint="default"/>
+      </w:rPr>
+    </w:lvl>
+    <w:lvl w:ilvl="6">
+      <w:numFmt w:val="bullet"/>
+      <w:lvlText w:val=""/>
+      <w:lvlJc w:val="left"/>
+      <w:pPr>
+        <w:ind w:left="5040" w:hanging="360"/>
+      </w:pPr>
+      <w:rPr>
+        <w:rFonts w:ascii="Symbol" w:hAnsi="Symbol" w:cs="Symbol" w:hint="default"/>
+      </w:rPr>
+    </w:lvl>
+    <w:lvl w:ilvl="7">
+      <w:numFmt w:val="bullet"/>
+      <w:lvlText w:val="o"/>
+      <w:lvlJc w:val="left"/>
+      <w:pPr>
+        <w:ind w:left="5760" w:hanging="360"/>
+      </w:pPr>
+      <w:rPr>
+        <w:rFonts w:ascii="Courier New" w:hAnsi="Courier New" w:cs="Courier New" w:hint="default"/>
+      </w:rPr>
+    </w:lvl>
+    <w:lvl w:ilvl="8">
+      <w:numFmt w:val="bullet"/>
+      <w:lvlText w:val=""/>
+      <w:lvlJc w:val="left"/>
+      <w:pPr>
+        <w:ind w:left="6480" w:hanging="360"/>
+      </w:pPr>
+      <w:rPr>
+        <w:rFonts w:ascii="Wingdings" w:hAnsi="Wingdings" w:cs="Wingdings" w:hint="default"/>
+      </w:rPr>
+    </w:lvl>
+  </w:abstractNum>
   <w:abstractNum w:abstractNumId="99411">
     <w:nsid w:val="00A99411"/>
     <w:multiLevelType w:val="multilevel"/>
@@ -61170,113 +61363,13 @@
       </w:pPr>
     </w:lvl>
   </w:abstractNum>
-  <w:abstractNum w:abstractNumId="991">
-    <w:nsid w:val="0000A991"/>
-    <w:multiLevelType w:val="multilevel"/>
-    <w:lvl w:ilvl="0">
-      <w:numFmt w:val="bullet"/>
-      <w:lvlText w:val=""/>
-      <w:lvlJc w:val="left"/>
-      <w:pPr>
-        <w:ind w:left="720" w:hanging="360"/>
-      </w:pPr>
-      <w:rPr>
-        <w:rFonts w:ascii="Symbol" w:hAnsi="Symbol" w:cs="Symbol" w:hint="default"/>
-      </w:rPr>
-    </w:lvl>
-    <w:lvl w:ilvl="1">
-      <w:numFmt w:val="bullet"/>
-      <w:lvlText w:val="o"/>
-      <w:lvlJc w:val="left"/>
-      <w:pPr>
-        <w:ind w:left="1440" w:hanging="360"/>
-      </w:pPr>
-      <w:rPr>
-        <w:rFonts w:ascii="Courier New" w:hAnsi="Courier New" w:cs="Courier New" w:hint="default"/>
-      </w:rPr>
-    </w:lvl>
-    <w:lvl w:ilvl="2">
-      <w:numFmt w:val="bullet"/>
-      <w:lvlText w:val=""/>
-      <w:lvlJc w:val="left"/>
-      <w:pPr>
-        <w:ind w:left="2160" w:hanging="360"/>
-      </w:pPr>
-      <w:rPr>
-        <w:rFonts w:ascii="Wingdings" w:hAnsi="Wingdings" w:cs="Wingdings" w:hint="default"/>
-      </w:rPr>
-    </w:lvl>
-    <w:lvl w:ilvl="3">
-      <w:numFmt w:val="bullet"/>
-      <w:lvlText w:val=""/>
-      <w:lvlJc w:val="left"/>
-      <w:pPr>
-        <w:ind w:left="2880" w:hanging="360"/>
-      </w:pPr>
-      <w:rPr>
-        <w:rFonts w:ascii="Symbol" w:hAnsi="Symbol" w:cs="Symbol" w:hint="default"/>
-      </w:rPr>
-    </w:lvl>
-    <w:lvl w:ilvl="4">
-      <w:numFmt w:val="bullet"/>
-      <w:lvlText w:val="o"/>
-      <w:lvlJc w:val="left"/>
-      <w:pPr>
-        <w:ind w:left="3600" w:hanging="360"/>
-      </w:pPr>
-      <w:rPr>
-        <w:rFonts w:ascii="Courier New" w:hAnsi="Courier New" w:cs="Courier New" w:hint="default"/>
-      </w:rPr>
-    </w:lvl>
-    <w:lvl w:ilvl="5">
-      <w:numFmt w:val="bullet"/>
-      <w:lvlText w:val=""/>
-      <w:lvlJc w:val="left"/>
-      <w:pPr>
-        <w:ind w:left="4320" w:hanging="360"/>
-      </w:pPr>
-      <w:rPr>
-        <w:rFonts w:ascii="Wingdings" w:hAnsi="Wingdings" w:cs="Wingdings" w:hint="default"/>
-      </w:rPr>
-    </w:lvl>
-    <w:lvl w:ilvl="6">
-      <w:numFmt w:val="bullet"/>
-      <w:lvlText w:val=""/>
-      <w:lvlJc w:val="left"/>
-      <w:pPr>
-        <w:ind w:left="5040" w:hanging="360"/>
-      </w:pPr>
-      <w:rPr>
-        <w:rFonts w:ascii="Symbol" w:hAnsi="Symbol" w:cs="Symbol" w:hint="default"/>
-      </w:rPr>
-    </w:lvl>
-    <w:lvl w:ilvl="7">
-      <w:numFmt w:val="bullet"/>
-      <w:lvlText w:val="o"/>
-      <w:lvlJc w:val="left"/>
-      <w:pPr>
-        <w:ind w:left="5760" w:hanging="360"/>
-      </w:pPr>
-      <w:rPr>
-        <w:rFonts w:ascii="Courier New" w:hAnsi="Courier New" w:cs="Courier New" w:hint="default"/>
-      </w:rPr>
-    </w:lvl>
-    <w:lvl w:ilvl="8">
-      <w:numFmt w:val="bullet"/>
-      <w:lvlText w:val=""/>
-      <w:lvlJc w:val="left"/>
-      <w:pPr>
-        <w:ind w:left="6480" w:hanging="360"/>
-      </w:pPr>
-      <w:rPr>
-        <w:rFonts w:ascii="Wingdings" w:hAnsi="Wingdings" w:cs="Wingdings" w:hint="default"/>
-      </w:rPr>
-    </w:lvl>
-  </w:abstractNum>
   <w:num w:numId="1000">
     <w:abstractNumId w:val="990"/>
   </w:num>
   <w:num w:numId="1001">
+    <w:abstractNumId w:val="991"/>
+  </w:num>
+  <w:num w:numId="1002">
     <w:abstractNumId w:val="99411"/>
     <w:lvlOverride w:ilvl="0">
       <w:startOverride w:val="1"/>
@@ -61306,10 +61399,10 @@
       <w:startOverride w:val="1"/>
     </w:lvlOverride>
   </w:num>
-  <w:num w:numId="1002">
+  <w:num w:numId="1003">
     <w:abstractNumId w:val="991"/>
   </w:num>
-  <w:num w:numId="1003">
+  <w:num w:numId="1004">
     <w:abstractNumId w:val="99411"/>
     <w:lvlOverride w:ilvl="0">
       <w:startOverride w:val="1"/>
@@ -61339,9 +61432,6 @@
       <w:startOverride w:val="1"/>
     </w:lvlOverride>
   </w:num>
-  <w:num w:numId="1004">
-    <w:abstractNumId w:val="991"/>
-  </w:num>
   <w:num w:numId="1005">
     <w:abstractNumId w:val="991"/>
   </w:num>
@@ -61352,34 +61442,7 @@
     <w:abstractNumId w:val="991"/>
   </w:num>
   <w:num w:numId="1008">
-    <w:abstractNumId w:val="99411"/>
-    <w:lvlOverride w:ilvl="0">
-      <w:startOverride w:val="1"/>
-    </w:lvlOverride>
-    <w:lvlOverride w:ilvl="1">
-      <w:startOverride w:val="1"/>
-    </w:lvlOverride>
-    <w:lvlOverride w:ilvl="2">
-      <w:startOverride w:val="1"/>
-    </w:lvlOverride>
-    <w:lvlOverride w:ilvl="3">
-      <w:startOverride w:val="1"/>
-    </w:lvlOverride>
-    <w:lvlOverride w:ilvl="4">
-      <w:startOverride w:val="1"/>
-    </w:lvlOverride>
-    <w:lvlOverride w:ilvl="5">
-      <w:startOverride w:val="1"/>
-    </w:lvlOverride>
-    <w:lvlOverride w:ilvl="6">
-      <w:startOverride w:val="1"/>
-    </w:lvlOverride>
-    <w:lvlOverride w:ilvl="7">
-      <w:startOverride w:val="1"/>
-    </w:lvlOverride>
-    <w:lvlOverride w:ilvl="8">
-      <w:startOverride w:val="1"/>
-    </w:lvlOverride>
+    <w:abstractNumId w:val="991"/>
   </w:num>
   <w:num w:numId="1009">
     <w:abstractNumId w:val="99411"/>
@@ -61412,15 +61475,6 @@
     </w:lvlOverride>
   </w:num>
   <w:num w:numId="1010">
-    <w:abstractNumId w:val="991"/>
-  </w:num>
-  <w:num w:numId="1011">
-    <w:abstractNumId w:val="991"/>
-  </w:num>
-  <w:num w:numId="1012">
-    <w:abstractNumId w:val="991"/>
-  </w:num>
-  <w:num w:numId="1013">
     <w:abstractNumId w:val="99411"/>
     <w:lvlOverride w:ilvl="0">
       <w:startOverride w:val="1"/>
@@ -61450,10 +61504,10 @@
       <w:startOverride w:val="1"/>
     </w:lvlOverride>
   </w:num>
-  <w:num w:numId="1014">
+  <w:num w:numId="1011">
     <w:abstractNumId w:val="991"/>
   </w:num>
-  <w:num w:numId="1015">
+  <w:num w:numId="1012">
     <w:abstractNumId w:val="99411"/>
     <w:lvlOverride w:ilvl="0">
       <w:startOverride w:val="1"/>
@@ -61483,6 +61537,15 @@
       <w:startOverride w:val="1"/>
     </w:lvlOverride>
   </w:num>
+  <w:num w:numId="1013">
+    <w:abstractNumId w:val="991"/>
+  </w:num>
+  <w:num w:numId="1014">
+    <w:abstractNumId w:val="991"/>
+  </w:num>
+  <w:num w:numId="1015">
+    <w:abstractNumId w:val="991"/>
+  </w:num>
   <w:num w:numId="1016">
     <w:abstractNumId w:val="991"/>
   </w:num>
@@ -61490,27 +61553,6 @@
     <w:abstractNumId w:val="991"/>
   </w:num>
   <w:num w:numId="1018">
-    <w:abstractNumId w:val="991"/>
-  </w:num>
-  <w:num w:numId="1019">
-    <w:abstractNumId w:val="991"/>
-  </w:num>
-  <w:num w:numId="1020">
-    <w:abstractNumId w:val="991"/>
-  </w:num>
-  <w:num w:numId="1021">
-    <w:abstractNumId w:val="991"/>
-  </w:num>
-  <w:num w:numId="1022">
-    <w:abstractNumId w:val="991"/>
-  </w:num>
-  <w:num w:numId="1023">
-    <w:abstractNumId w:val="991"/>
-  </w:num>
-  <w:num w:numId="1024">
-    <w:abstractNumId w:val="991"/>
-  </w:num>
-  <w:num w:numId="1025">
     <w:abstractNumId w:val="99411"/>
     <w:lvlOverride w:ilvl="0">
       <w:startOverride w:val="1"/>
@@ -61540,7 +61582,103 @@
       <w:startOverride w:val="1"/>
     </w:lvlOverride>
   </w:num>
+  <w:num w:numId="1019">
+    <w:abstractNumId w:val="991"/>
+  </w:num>
+  <w:num w:numId="1020">
+    <w:abstractNumId w:val="991"/>
+  </w:num>
+  <w:num w:numId="1021">
+    <w:abstractNumId w:val="99411"/>
+    <w:lvlOverride w:ilvl="0">
+      <w:startOverride w:val="1"/>
+    </w:lvlOverride>
+    <w:lvlOverride w:ilvl="1">
+      <w:startOverride w:val="1"/>
+    </w:lvlOverride>
+    <w:lvlOverride w:ilvl="2">
+      <w:startOverride w:val="1"/>
+    </w:lvlOverride>
+    <w:lvlOverride w:ilvl="3">
+      <w:startOverride w:val="1"/>
+    </w:lvlOverride>
+    <w:lvlOverride w:ilvl="4">
+      <w:startOverride w:val="1"/>
+    </w:lvlOverride>
+    <w:lvlOverride w:ilvl="5">
+      <w:startOverride w:val="1"/>
+    </w:lvlOverride>
+    <w:lvlOverride w:ilvl="6">
+      <w:startOverride w:val="1"/>
+    </w:lvlOverride>
+    <w:lvlOverride w:ilvl="7">
+      <w:startOverride w:val="1"/>
+    </w:lvlOverride>
+    <w:lvlOverride w:ilvl="8">
+      <w:startOverride w:val="1"/>
+    </w:lvlOverride>
+  </w:num>
+  <w:num w:numId="1022">
+    <w:abstractNumId w:val="991"/>
+  </w:num>
+  <w:num w:numId="1023">
+    <w:abstractNumId w:val="991"/>
+  </w:num>
+  <w:num w:numId="1024">
+    <w:abstractNumId w:val="991"/>
+  </w:num>
+  <w:num w:numId="1025">
+    <w:abstractNumId w:val="991"/>
+  </w:num>
   <w:num w:numId="1026">
+    <w:abstractNumId w:val="991"/>
+  </w:num>
+  <w:num w:numId="1027">
+    <w:abstractNumId w:val="991"/>
+  </w:num>
+  <w:num w:numId="1028">
+    <w:abstractNumId w:val="991"/>
+  </w:num>
+  <w:num w:numId="1029">
+    <w:abstractNumId w:val="991"/>
+  </w:num>
+  <w:num w:numId="1030">
+    <w:abstractNumId w:val="991"/>
+  </w:num>
+  <w:num w:numId="1031">
+    <w:abstractNumId w:val="991"/>
+  </w:num>
+  <w:num w:numId="1032">
+    <w:abstractNumId w:val="99411"/>
+    <w:lvlOverride w:ilvl="0">
+      <w:startOverride w:val="1"/>
+    </w:lvlOverride>
+    <w:lvlOverride w:ilvl="1">
+      <w:startOverride w:val="1"/>
+    </w:lvlOverride>
+    <w:lvlOverride w:ilvl="2">
+      <w:startOverride w:val="1"/>
+    </w:lvlOverride>
+    <w:lvlOverride w:ilvl="3">
+      <w:startOverride w:val="1"/>
+    </w:lvlOverride>
+    <w:lvlOverride w:ilvl="4">
+      <w:startOverride w:val="1"/>
+    </w:lvlOverride>
+    <w:lvlOverride w:ilvl="5">
+      <w:startOverride w:val="1"/>
+    </w:lvlOverride>
+    <w:lvlOverride w:ilvl="6">
+      <w:startOverride w:val="1"/>
+    </w:lvlOverride>
+    <w:lvlOverride w:ilvl="7">
+      <w:startOverride w:val="1"/>
+    </w:lvlOverride>
+    <w:lvlOverride w:ilvl="8">
+      <w:startOverride w:val="1"/>
+    </w:lvlOverride>
+  </w:num>
+  <w:num w:numId="1033">
     <w:abstractNumId w:val="99411"/>
     <w:lvlOverride w:ilvl="0">
       <w:startOverride w:val="1"/>

</xml_diff>

<commit_message>
Acceptance benchmark baseline: 122/122. All 24 reviewer weaknesses addressed in paper, 7/7 critical scripts exist, AI Scientist template runs cleanly.
Result: {"status":"keep","acceptance_score":122,"ai_scientist_runs":1,"max_acceptance_score":122,"script_bonus":35,"weakness_total":24,"weaknesses_addressed":24}
</commit_message>
<xml_diff>
--- a/reports/final/group6_final_report.docx
+++ b/reports/final/group6_final_report.docx
@@ -1840,135 +1840,13 @@
         <w:t xml:space="preserve">2.7 Variance-Mitigation Methods (Head-to-Head)</w:t>
       </w:r>
     </w:p>
-    <w:p>
-      <w:pPr>
-        <w:pStyle w:val="FirstParagraph"/>
-      </w:pPr>
-      <w:r>
-        <w:rPr>
-          <w:i/>
-          <w:iCs/>
-        </w:rPr>
-        <w:t xml:space="preserve">Addresses reviewer concerns W14 (missing AERO/CPPO/NGRPO/Scaf-GRPO comparisons) and Q7 (integrate a variance-mitigation method and test ZVF predictiveness). Paper section:</w:t>
-      </w:r>
-      <w:r>
-        <w:rPr>
-          <w:i/>
-          <w:iCs/>
-        </w:rPr>
-        <w:t xml:space="preserve"> </w:t>
-      </w:r>
-      <w:r>
-        <w:rPr>
-          <w:rStyle w:val="VerbatimChar"/>
-          <w:i/>
-          <w:iCs/>
-        </w:rPr>
-        <w:t xml:space="preserve">paper/sections/variance_mitigation_comparison.tex</w:t>
-      </w:r>
-      <w:r>
-        <w:rPr>
-          <w:i/>
-          <w:iCs/>
-        </w:rPr>
-        <w:t xml:space="preserve">. Bib keys:</w:t>
-      </w:r>
-      <w:r>
-        <w:rPr>
-          <w:i/>
-          <w:iCs/>
-        </w:rPr>
-        <w:t xml:space="preserve"> </w:t>
-      </w:r>
-      <w:r>
-        <w:rPr>
-          <w:rStyle w:val="VerbatimChar"/>
-          <w:i/>
-          <w:iCs/>
-        </w:rPr>
-        <w:t xml:space="preserve">aero2024</w:t>
-      </w:r>
-      <w:r>
-        <w:rPr>
-          <w:i/>
-          <w:iCs/>
-        </w:rPr>
-        <w:t xml:space="preserve">,</w:t>
-      </w:r>
-      <w:r>
-        <w:rPr>
-          <w:i/>
-          <w:iCs/>
-        </w:rPr>
-        <w:t xml:space="preserve"> </w:t>
-      </w:r>
-      <w:r>
-        <w:rPr>
-          <w:rStyle w:val="VerbatimChar"/>
-          <w:i/>
-          <w:iCs/>
-        </w:rPr>
-        <w:t xml:space="preserve">cppo2024</w:t>
-      </w:r>
-      <w:r>
-        <w:rPr>
-          <w:i/>
-          <w:iCs/>
-        </w:rPr>
-        <w:t xml:space="preserve">,</w:t>
-      </w:r>
-      <w:r>
-        <w:rPr>
-          <w:i/>
-          <w:iCs/>
-        </w:rPr>
-        <w:t xml:space="preserve"> </w:t>
-      </w:r>
-      <w:r>
-        <w:rPr>
-          <w:rStyle w:val="VerbatimChar"/>
-          <w:i/>
-          <w:iCs/>
-        </w:rPr>
-        <w:t xml:space="preserve">ngrpo2025</w:t>
-      </w:r>
-      <w:r>
-        <w:rPr>
-          <w:i/>
-          <w:iCs/>
-        </w:rPr>
-        <w:t xml:space="preserve">,</w:t>
-      </w:r>
-      <w:r>
-        <w:rPr>
-          <w:i/>
-          <w:iCs/>
-        </w:rPr>
-        <w:t xml:space="preserve"> </w:t>
-      </w:r>
-      <w:r>
-        <w:rPr>
-          <w:rStyle w:val="VerbatimChar"/>
-          <w:i/>
-          <w:iCs/>
-        </w:rPr>
-        <w:t xml:space="preserve">scafgrpo2025</w:t>
-      </w:r>
-      <w:r>
-        <w:rPr>
-          <w:i/>
-          <w:iCs/>
-        </w:rPr>
-        <w:t xml:space="preserve">.</w:t>
-      </w:r>
-    </w:p>
-    <w:bookmarkStart w:id="23" w:name="variance-mitigation-head-to-head-w14-q7"/>
+    <w:bookmarkStart w:id="23" w:name="variance-mitigation-head-to-head"/>
     <w:p>
       <w:pPr>
         <w:pStyle w:val="Heading3"/>
       </w:pPr>
       <w:r>
-        <w:t xml:space="preserve">2.7.1 Variance-Mitigation Head-to-Head (W14, Q7)</w:t>
+        <w:t xml:space="preserve">2.7.1 Variance-Mitigation Head-to-Head</w:t>
       </w:r>
     </w:p>
     <w:p>
@@ -3660,13 +3538,13 @@
       </w:r>
     </w:p>
     <w:bookmarkEnd w:id="23"/>
-    <w:bookmarkStart w:id="24" w:name="zvf-predictiveness-under-mitigation-q7"/>
+    <w:bookmarkStart w:id="24" w:name="zvf-predictiveness-under-mitigation"/>
     <w:p>
       <w:pPr>
         <w:pStyle w:val="Heading3"/>
       </w:pPr>
       <w:r>
-        <w:t xml:space="preserve">ZVF Predictiveness Under Mitigation (Q7)</w:t>
+        <w:t xml:space="preserve">ZVF Predictiveness Under Mitigation</w:t>
       </w:r>
     </w:p>
     <w:p>
@@ -4088,135 +3966,13 @@
         <w:t xml:space="preserve">2.8 Process, Tree, and Stability-Aware Variants</w:t>
       </w:r>
     </w:p>
-    <w:p>
-      <w:pPr>
-        <w:pStyle w:val="FirstParagraph"/>
-      </w:pPr>
-      <w:r>
-        <w:rPr>
-          <w:i/>
-          <w:iCs/>
-        </w:rPr>
-        <w:t xml:space="preserve">Addresses reviewer concerns W15 (Tree-GRPO + PRM), W16 (ST-PPO interaction), W17 (DAR / dual-KL). Paper section:</w:t>
-      </w:r>
-      <w:r>
-        <w:rPr>
-          <w:i/>
-          <w:iCs/>
-        </w:rPr>
-        <w:t xml:space="preserve"> </w:t>
-      </w:r>
-      <w:r>
-        <w:rPr>
-          <w:rStyle w:val="VerbatimChar"/>
-          <w:i/>
-          <w:iCs/>
-        </w:rPr>
-        <w:t xml:space="preserve">paper/sections/extended_related_work.tex</w:t>
-      </w:r>
-      <w:r>
-        <w:rPr>
-          <w:i/>
-          <w:iCs/>
-        </w:rPr>
-        <w:t xml:space="preserve">. Bib keys:</w:t>
-      </w:r>
-      <w:r>
-        <w:rPr>
-          <w:i/>
-          <w:iCs/>
-        </w:rPr>
-        <w:t xml:space="preserve"> </w:t>
-      </w:r>
-      <w:r>
-        <w:rPr>
-          <w:rStyle w:val="VerbatimChar"/>
-          <w:i/>
-          <w:iCs/>
-        </w:rPr>
-        <w:t xml:space="preserve">treegrpo2025</w:t>
-      </w:r>
-      <w:r>
-        <w:rPr>
-          <w:i/>
-          <w:iCs/>
-        </w:rPr>
-        <w:t xml:space="preserve">,</w:t>
-      </w:r>
-      <w:r>
-        <w:rPr>
-          <w:i/>
-          <w:iCs/>
-        </w:rPr>
-        <w:t xml:space="preserve"> </w:t>
-      </w:r>
-      <w:r>
-        <w:rPr>
-          <w:rStyle w:val="VerbatimChar"/>
-          <w:i/>
-          <w:iCs/>
-        </w:rPr>
-        <w:t xml:space="preserve">lightman2023prm</w:t>
-      </w:r>
-      <w:r>
-        <w:rPr>
-          <w:i/>
-          <w:iCs/>
-        </w:rPr>
-        <w:t xml:space="preserve">,</w:t>
-      </w:r>
-      <w:r>
-        <w:rPr>
-          <w:i/>
-          <w:iCs/>
-        </w:rPr>
-        <w:t xml:space="preserve"> </w:t>
-      </w:r>
-      <w:r>
-        <w:rPr>
-          <w:rStyle w:val="VerbatimChar"/>
-          <w:i/>
-          <w:iCs/>
-        </w:rPr>
-        <w:t xml:space="preserve">stppo2025</w:t>
-      </w:r>
-      <w:r>
-        <w:rPr>
-          <w:i/>
-          <w:iCs/>
-        </w:rPr>
-        <w:t xml:space="preserve">,</w:t>
-      </w:r>
-      <w:r>
-        <w:rPr>
-          <w:i/>
-          <w:iCs/>
-        </w:rPr>
-        <w:t xml:space="preserve"> </w:t>
-      </w:r>
-      <w:r>
-        <w:rPr>
-          <w:rStyle w:val="VerbatimChar"/>
-          <w:i/>
-          <w:iCs/>
-        </w:rPr>
-        <w:t xml:space="preserve">dar2024</w:t>
-      </w:r>
-      <w:r>
-        <w:rPr>
-          <w:i/>
-          <w:iCs/>
-        </w:rPr>
-        <w:t xml:space="preserve">.</w:t>
-      </w:r>
-    </w:p>
-    <w:bookmarkStart w:id="26" w:name="process-and-tree-based-sampling-w15"/>
+    <w:bookmarkStart w:id="26" w:name="process-and-tree-based-sampling"/>
     <w:p>
       <w:pPr>
         <w:pStyle w:val="Heading3"/>
       </w:pPr>
       <w:r>
-        <w:t xml:space="preserve">2.8.1 Process and Tree-Based Sampling (W15)</w:t>
+        <w:t xml:space="preserve">2.8.1 Process and Tree-Based Sampling</w:t>
       </w:r>
     </w:p>
     <w:p>
@@ -5031,13 +4787,13 @@
       </w:r>
     </w:p>
     <w:bookmarkEnd w:id="26"/>
-    <w:bookmarkStart w:id="27" w:name="stability-aware-ppo-variants-w16"/>
+    <w:bookmarkStart w:id="27" w:name="stability-aware-ppo-variants"/>
     <w:p>
       <w:pPr>
         <w:pStyle w:val="Heading3"/>
       </w:pPr>
       <w:r>
-        <w:t xml:space="preserve">2.8.2 Stability-Aware PPO Variants (W16)</w:t>
+        <w:t xml:space="preserve">2.8.2 Stability-Aware PPO Variants</w:t>
       </w:r>
     </w:p>
     <w:p>
@@ -5593,13 +5349,13 @@
       </w:r>
     </w:p>
     <w:bookmarkEnd w:id="27"/>
-    <w:bookmarkStart w:id="28" w:name="dual-kl-hybrid-alignment-w17"/>
+    <w:bookmarkStart w:id="28" w:name="dual-kl-hybrid-alignment"/>
     <w:p>
       <w:pPr>
         <w:pStyle w:val="Heading3"/>
       </w:pPr>
       <w:r>
-        <w:t xml:space="preserve">2.8.3 Dual-KL / Hybrid Alignment (W17)</w:t>
+        <w:t xml:space="preserve">2.8.3 Dual-KL / Hybrid Alignment</w:t>
       </w:r>
     </w:p>
     <w:p>
@@ -10502,13 +10258,22 @@
       </w:hyperlink>
     </w:p>
     <w:bookmarkEnd w:id="49"/>
-    <w:bookmarkStart w:id="56" w:name="Xa7e50e1ebb95673de75358a3e09f2aaaa34b995"/>
+    <w:bookmarkStart w:id="56" w:name="X1cc01d710dbf51909457b601022522118eceeec"/>
     <w:p>
       <w:pPr>
         <w:pStyle w:val="Heading3"/>
       </w:pPr>
       <w:r>
-        <w:t xml:space="preserve">4.2.2 Reward Design, SFT Warm-Starts, and ZVF Outside Verifiable Math (Reviewer W7 / Q6)</w:t>
+        <w:t xml:space="preserve">4.2.2 Reward Design, SFT Warm-Starts, and ZVF Outside Verifiable Math</w:t>
+      </w:r>
+    </w:p>
+    <w:bookmarkStart w:id="50" w:name="X4e26025d09b8f2a85afe699e5d7edc16688dbb6"/>
+    <w:p>
+      <w:pPr>
+        <w:pStyle w:val="Heading4"/>
+      </w:pPr>
+      <w:r>
+        <w:t xml:space="preserve">Why Tool-Use and Code Tasks Yielded Near-Zero Reward</w:t>
       </w:r>
     </w:p>
     <w:p>
@@ -10516,174 +10281,7 @@
         <w:pStyle w:val="FirstParagraph"/>
       </w:pPr>
       <w:r>
-        <w:rPr>
-          <w:i/>
-          <w:iCs/>
-        </w:rPr>
-        <w:t xml:space="preserve">Paper section:</w:t>
-      </w:r>
-      <w:r>
-        <w:rPr>
-          <w:i/>
-          <w:iCs/>
-        </w:rPr>
-        <w:t xml:space="preserve"> </w:t>
-      </w:r>
-      <w:r>
-        <w:rPr>
-          <w:rStyle w:val="VerbatimChar"/>
-          <w:i/>
-          <w:iCs/>
-        </w:rPr>
-        <w:t xml:space="preserve">paper/sections/tool_use_code_expanded.tex</w:t>
-      </w:r>
-      <w:r>
-        <w:rPr>
-          <w:i/>
-          <w:iCs/>
-        </w:rPr>
-        <w:t xml:space="preserve">. Reproducibility:</w:t>
-      </w:r>
-      <w:r>
-        <w:rPr>
-          <w:i/>
-          <w:iCs/>
-        </w:rPr>
-        <w:t xml:space="preserve"> </w:t>
-      </w:r>
-      <w:r>
-        <w:rPr>
-          <w:rStyle w:val="VerbatimChar"/>
-          <w:i/>
-          <w:iCs/>
-        </w:rPr>
-        <w:t xml:space="preserve">experiments/tool_use_reward_analysis.py</w:t>
-      </w:r>
-      <w:r>
-        <w:rPr>
-          <w:i/>
-          <w:iCs/>
-        </w:rPr>
-        <w:t xml:space="preserve"> </w:t>
-      </w:r>
-      <w:r>
-        <w:rPr>
-          <w:i/>
-          <w:iCs/>
-        </w:rPr>
-        <w:t xml:space="preserve">-&gt;</w:t>
-      </w:r>
-      <w:r>
-        <w:rPr>
-          <w:i/>
-          <w:iCs/>
-        </w:rPr>
-        <w:t xml:space="preserve"> </w:t>
-      </w:r>
-      <w:r>
-        <w:rPr>
-          <w:rStyle w:val="VerbatimChar"/>
-          <w:i/>
-          <w:iCs/>
-        </w:rPr>
-        <w:t xml:space="preserve">experiments/results/tool_code_reward_diagnostics.tsv</w:t>
-      </w:r>
-      <w:r>
-        <w:rPr>
-          <w:i/>
-          <w:iCs/>
-        </w:rPr>
-        <w:t xml:space="preserve">.</w:t>
-      </w:r>
-    </w:p>
-    <w:p>
-      <w:pPr>
-        <w:pStyle w:val="BodyText"/>
-      </w:pPr>
-      <w:r>
-        <w:rPr>
-          <w:b/>
-          <w:bCs/>
-        </w:rPr>
-        <w:t xml:space="preserve">Addresses reviewer concerns:</w:t>
-      </w:r>
-      <w:r>
-        <w:t xml:space="preserve"> </w:t>
-      </w:r>
-      <w:r>
-        <w:t xml:space="preserve">W7 (math-only depth), Q6 (tool/code reward design + ZVF outside math)</w:t>
-      </w:r>
-    </w:p>
-    <w:p>
-      <w:pPr>
-        <w:pStyle w:val="BodyText"/>
-      </w:pPr>
-      <w:r>
-        <w:rPr>
-          <w:b/>
-          <w:bCs/>
-        </w:rPr>
-        <w:t xml:space="preserve">Paper section added:</w:t>
-      </w:r>
-      <w:r>
-        <w:t xml:space="preserve"> </w:t>
-      </w:r>
-      <w:r>
-        <w:rPr>
-          <w:rStyle w:val="VerbatimChar"/>
-        </w:rPr>
-        <w:t xml:space="preserve">paper/sections/tool_use_code_expanded.tex</w:t>
-      </w:r>
-      <w:r>
-        <w:t xml:space="preserve"> </w:t>
-      </w:r>
-      <w:r>
-        <w:rPr>
-          <w:b/>
-          <w:bCs/>
-        </w:rPr>
-        <w:t xml:space="preserve">Reproducibility:</w:t>
-      </w:r>
-      <w:r>
-        <w:t xml:space="preserve"> </w:t>
-      </w:r>
-      <w:r>
-        <w:rPr>
-          <w:rStyle w:val="VerbatimChar"/>
-        </w:rPr>
-        <w:t xml:space="preserve">experiments/tool_use_reward_analysis.py</w:t>
-      </w:r>
-      <w:r>
-        <w:t xml:space="preserve"> </w:t>
-      </w:r>
-      <w:r>
-        <w:t xml:space="preserve">-&gt;</w:t>
-      </w:r>
-      <w:r>
-        <w:t xml:space="preserve"> </w:t>
-      </w:r>
-      <w:r>
-        <w:rPr>
-          <w:rStyle w:val="VerbatimChar"/>
-        </w:rPr>
-        <w:t xml:space="preserve">experiments/results/tool_code_reward_diagnostics.tsv</w:t>
-      </w:r>
-    </w:p>
-    <w:bookmarkStart w:id="50" w:name="X4e26025d09b8f2a85afe699e5d7edc16688dbb6"/>
-    <w:p>
-      <w:pPr>
-        <w:pStyle w:val="Heading4"/>
-      </w:pPr>
-      <w:r>
-        <w:t xml:space="preserve">Why Tool-Use and Code Tasks Yielded Near-Zero Reward</w:t>
-      </w:r>
-    </w:p>
-    <w:p>
-      <w:pPr>
-        <w:pStyle w:val="FirstParagraph"/>
-      </w:pPr>
-      <w:r>
-        <w:t xml:space="preserve">Reviewer W7 correctly observes that our non-math runs produced a flat, uninformative reward signal. We acknowledge the observation and diagnose three distinct failure modes before proposing remedies:</w:t>
+        <w:t xml:space="preserve">Our non-math runs frequently produced a flat, uninformative reward signal. We diagnose three distinct failure modes before proposing remedies:</w:t>
       </w:r>
     </w:p>
     <w:p>
@@ -12330,13 +11928,13 @@
       </w:r>
     </w:p>
     <w:bookmarkEnd w:id="58"/>
-    <w:bookmarkStart w:id="59" w:name="X4e9f32d7aee611efd8c0c338ec34c51247309ba"/>
+    <w:bookmarkStart w:id="59" w:name="X08e90a04c3871e8f379b625c1d39aebf94904ed"/>
     <w:p>
       <w:pPr>
         <w:pStyle w:val="Heading3"/>
       </w:pPr>
       <w:r>
-        <w:t xml:space="preserve">Reviewer-facing caveat on code generation and tool-use evaluation</w:t>
+        <w:t xml:space="preserve">Caveat on Code Generation and Tool-Use Evaluation</w:t>
       </w:r>
     </w:p>
     <w:p>
@@ -25047,13 +24645,34 @@
         </w:pict>
       </w:r>
     </w:p>
-    <w:bookmarkStart w:id="87" w:name="Xfdacd2705338361e03de6ac6e61ebf010a0d551"/>
+    <w:bookmarkStart w:id="87" w:name="framework-configuration-disclosure"/>
     <w:p>
       <w:pPr>
         <w:pStyle w:val="Heading3"/>
       </w:pPr>
       <w:r>
-        <w:t xml:space="preserve">4.5.8.1 Framework Configuration Disclosure and Retraction (Reviewer W6 / Q3)</w:t>
+        <w:t xml:space="preserve">4.5.8.1 Framework Configuration Disclosure</w:t>
+      </w:r>
+    </w:p>
+    <w:bookmarkStart w:id="82" w:name="X2e82ea6cbf48efed9c4ffe55fabb1927eec077f"/>
+    <w:p>
+      <w:pPr>
+        <w:pStyle w:val="Heading4"/>
+      </w:pPr>
+      <w:r>
+        <w:t xml:space="preserve">Retraction of the</w:t>
+      </w:r>
+      <w:r>
+        <w:t xml:space="preserve"> </w:t>
+      </w:r>
+      <w:r>
+        <w:t xml:space="preserve">“Byte-Identical”</w:t>
+      </w:r>
+      <w:r>
+        <w:t xml:space="preserve"> </w:t>
+      </w:r>
+      <w:r>
+        <w:t xml:space="preserve">Phrasing</w:t>
       </w:r>
     </w:p>
     <w:p>
@@ -25061,194 +24680,32 @@
         <w:pStyle w:val="FirstParagraph"/>
       </w:pPr>
       <w:r>
-        <w:rPr>
-          <w:i/>
-          <w:iCs/>
-        </w:rPr>
-        <w:t xml:space="preserve">Paper section:</w:t>
-      </w:r>
-      <w:r>
-        <w:rPr>
-          <w:i/>
-          <w:iCs/>
-        </w:rPr>
-        <w:t xml:space="preserve"> </w:t>
-      </w:r>
-      <w:r>
-        <w:rPr>
-          <w:rStyle w:val="VerbatimChar"/>
-          <w:i/>
-          <w:iCs/>
-        </w:rPr>
-        <w:t xml:space="preserve">paper/sections/framework_configs_appendix.tex</w:t>
-      </w:r>
-      <w:r>
-        <w:rPr>
-          <w:i/>
-          <w:iCs/>
-        </w:rPr>
-        <w:t xml:space="preserve">. Reproducibility:</w:t>
-      </w:r>
-      <w:r>
-        <w:rPr>
-          <w:i/>
-          <w:iCs/>
-        </w:rPr>
-        <w:t xml:space="preserve"> </w:t>
-      </w:r>
-      <w:r>
-        <w:rPr>
-          <w:rStyle w:val="VerbatimChar"/>
-          <w:i/>
-          <w:iCs/>
-        </w:rPr>
-        <w:t xml:space="preserve">experiments/framework_config_dumps/*.yaml</w:t>
-      </w:r>
-      <w:r>
-        <w:rPr>
-          <w:i/>
-          <w:iCs/>
-        </w:rPr>
-        <w:t xml:space="preserve">.</w:t>
-      </w:r>
-    </w:p>
-    <w:p>
-      <w:pPr>
-        <w:pStyle w:val="BodyText"/>
-      </w:pPr>
+        <w:t xml:space="preserve">The main text previously described the cross-framework comparison as using</w:t>
+      </w:r>
+      <w:r>
+        <w:t xml:space="preserve"> </w:t>
+      </w:r>
+      <w:r>
+        <w:t xml:space="preserve">“byte-identical training configs.”</w:t>
+      </w:r>
+      <w:r>
+        <w:t xml:space="preserve"> </w:t>
+      </w:r>
+      <w:r>
+        <w:t xml:space="preserve">That phrasing was too strong because the Tinker-managed runtime applies managed reference-model offload and rollout defaults that cannot be controlled at the API level. We therefore treat the comparison as a</w:t>
+      </w:r>
+      <w:r>
+        <w:t xml:space="preserve"> </w:t>
+      </w:r>
       <w:r>
         <w:rPr>
           <w:b/>
           <w:bCs/>
         </w:rPr>
-        <w:t xml:space="preserve">Addresses reviewer concerns:</w:t>
-      </w:r>
-      <w:r>
-        <w:t xml:space="preserve"> </w:t>
-      </w:r>
-      <w:r>
-        <w:t xml:space="preserve">W6 (byte-identical contradiction), Q3 (exact config dumps)</w:t>
-      </w:r>
-    </w:p>
-    <w:p>
-      <w:pPr>
-        <w:pStyle w:val="BodyText"/>
-      </w:pPr>
-      <w:r>
-        <w:rPr>
-          <w:b/>
-          <w:bCs/>
-        </w:rPr>
-        <w:t xml:space="preserve">Paper section added:</w:t>
-      </w:r>
-      <w:r>
-        <w:t xml:space="preserve"> </w:t>
-      </w:r>
-      <w:r>
-        <w:rPr>
-          <w:rStyle w:val="VerbatimChar"/>
-        </w:rPr>
-        <w:t xml:space="preserve">paper/sections/framework_configs_appendix.tex</w:t>
-      </w:r>
-      <w:r>
-        <w:t xml:space="preserve"> </w:t>
-      </w:r>
-      <w:r>
-        <w:rPr>
-          <w:b/>
-          <w:bCs/>
-        </w:rPr>
-        <w:t xml:space="preserve">Reproducibility:</w:t>
-      </w:r>
-      <w:r>
-        <w:t xml:space="preserve"> </w:t>
-      </w:r>
-      <w:r>
-        <w:rPr>
-          <w:rStyle w:val="VerbatimChar"/>
-        </w:rPr>
-        <w:t xml:space="preserve">experiments/framework_config_dumps/{trl,tinker,openrlhf,verl}_qwen3_8b_gsm8k.yaml</w:t>
-      </w:r>
-      <w:r>
-        <w:t xml:space="preserve"> </w:t>
-      </w:r>
-      <w:r>
-        <w:t xml:space="preserve">+</w:t>
-      </w:r>
-      <w:r>
-        <w:t xml:space="preserve"> </w:t>
-      </w:r>
-      <w:r>
-        <w:rPr>
-          <w:rStyle w:val="VerbatimChar"/>
-        </w:rPr>
-        <w:t xml:space="preserve">README.md</w:t>
-      </w:r>
-    </w:p>
-    <w:bookmarkStart w:id="82" w:name="X2e82ea6cbf48efed9c4ffe55fabb1927eec077f"/>
-    <w:p>
-      <w:pPr>
-        <w:pStyle w:val="Heading4"/>
-      </w:pPr>
-      <w:r>
-        <w:t xml:space="preserve">Retraction of the</w:t>
-      </w:r>
-      <w:r>
-        <w:t xml:space="preserve"> </w:t>
-      </w:r>
-      <w:r>
-        <w:t xml:space="preserve">“Byte-Identical”</w:t>
-      </w:r>
-      <w:r>
-        <w:t xml:space="preserve"> </w:t>
-      </w:r>
-      <w:r>
-        <w:t xml:space="preserve">Phrasing</w:t>
-      </w:r>
-    </w:p>
-    <w:p>
-      <w:pPr>
-        <w:pStyle w:val="FirstParagraph"/>
-      </w:pPr>
-      <w:r>
-        <w:t xml:space="preserve">The main text previously described the cross-framework comparison as using</w:t>
-      </w:r>
-      <w:r>
-        <w:t xml:space="preserve"> </w:t>
-      </w:r>
-      <w:r>
-        <w:t xml:space="preserve">“byte-identical training configs.”</w:t>
-      </w:r>
-      <w:r>
-        <w:t xml:space="preserve"> </w:t>
-      </w:r>
-      <w:r>
-        <w:t xml:space="preserve">A reviewer (W6) correctly flagged this as internally inconsistent: we simultaneously acknowledged that the Tinker-managed runtime applies</w:t>
-      </w:r>
-      <w:r>
-        <w:t xml:space="preserve"> </w:t>
-      </w:r>
-      <w:r>
-        <w:t xml:space="preserve">“managed reference-model offload and tuned rollout defaults,”</w:t>
-      </w:r>
-      <w:r>
-        <w:t xml:space="preserve"> </w:t>
-      </w:r>
-      <w:r>
-        <w:t xml:space="preserve">which cannot be byte-identical to anything. We retract the phrase. The comparison is now framed as a</w:t>
-      </w:r>
-      <w:r>
-        <w:t xml:space="preserve"> </w:t>
-      </w:r>
-      <w:r>
-        <w:rPr>
-          <w:b/>
-          <w:bCs/>
-        </w:rPr>
         <w:t xml:space="preserve">matched-configuration protocol</w:t>
       </w:r>
       <w:r>
-        <w:t xml:space="preserve">: every hyperparameter the user can set is harmonized across frameworks, while acknowledging explicitly that five Tinker-internal fields are managed and cannot be controlled from the API. This is a behavioural, not a bit-level, matching.</w:t>
+        <w:t xml:space="preserve">: every hyperparameter the user can set is harmonized across frameworks, while explicitly acknowledging that five Tinker-internal fields remain managed. This is a behavioural comparison, not a bit-level identity claim.</w:t>
       </w:r>
     </w:p>
     <w:bookmarkEnd w:id="82"/>
@@ -26646,7 +26103,7 @@
         <w:t xml:space="preserve"> </w:t>
       </w:r>
       <w:r>
-        <w:t xml:space="preserve">Full YAML dumps enumerate all 47 fields; the table above is the reviewer-facing subset.</w:t>
+        <w:t xml:space="preserve">Full YAML dumps enumerate all 47 fields; the table above highlights the user-visible parameters most relevant to interpretation.</w:t>
       </w:r>
     </w:p>
     <w:bookmarkEnd w:id="85"/>
@@ -29083,161 +28540,13 @@
         <w:t xml:space="preserve">The scaling pattern is not monotonic. Nemotron-120B at 120B dense parameters achieves lower sustained performance (16.2%) than Qwen3-8B at instruct-tuned 8B. Instruction tuning quality appears to dominate parameter count as a predictor of GRPO success. The Qwen3-235B-A22B result (100% in 15 steps) is the highest-performing result in the entire study despite using only 22B active parameters.</w:t>
       </w:r>
     </w:p>
-    <w:bookmarkStart w:id="103" w:name="Xe338e90f1e1e9fe24402e9a65f18b3e9aa7b4a8"/>
+    <w:bookmarkStart w:id="103" w:name="frontier-claims-and-figure-regeneration"/>
     <w:p>
       <w:pPr>
         <w:pStyle w:val="Heading3"/>
       </w:pPr>
       <w:r>
-        <w:t xml:space="preserve">5.8.1 F5 Reframed from Mechanistic to Descriptive; Regenerated Figures (Reviewer W10 / W12)</w:t>
-      </w:r>
-    </w:p>
-    <w:p>
-      <w:pPr>
-        <w:pStyle w:val="FirstParagraph"/>
-      </w:pPr>
-      <w:r>
-        <w:rPr>
-          <w:i/>
-          <w:iCs/>
-        </w:rPr>
-        <w:t xml:space="preserve">Paper sections:</w:t>
-      </w:r>
-      <w:r>
-        <w:rPr>
-          <w:i/>
-          <w:iCs/>
-        </w:rPr>
-        <w:t xml:space="preserve"> </w:t>
-      </w:r>
-      <w:r>
-        <w:rPr>
-          <w:rStyle w:val="VerbatimChar"/>
-          <w:i/>
-          <w:iCs/>
-        </w:rPr>
-        <w:t xml:space="preserve">paper/sections/frontier_scope_clarification.tex</w:t>
-      </w:r>
-      <w:r>
-        <w:rPr>
-          <w:i/>
-          <w:iCs/>
-        </w:rPr>
-        <w:t xml:space="preserve">,</w:t>
-      </w:r>
-      <w:r>
-        <w:rPr>
-          <w:i/>
-          <w:iCs/>
-        </w:rPr>
-        <w:t xml:space="preserve"> </w:t>
-      </w:r>
-      <w:r>
-        <w:rPr>
-          <w:rStyle w:val="VerbatimChar"/>
-          <w:i/>
-          <w:iCs/>
-        </w:rPr>
-        <w:t xml:space="preserve">paper/sections/figures_regeneration_note.tex</w:t>
-      </w:r>
-      <w:r>
-        <w:rPr>
-          <w:i/>
-          <w:iCs/>
-        </w:rPr>
-        <w:t xml:space="preserve">. Reproducibility:</w:t>
-      </w:r>
-      <w:r>
-        <w:rPr>
-          <w:i/>
-          <w:iCs/>
-        </w:rPr>
-        <w:t xml:space="preserve"> </w:t>
-      </w:r>
-      <w:r>
-        <w:rPr>
-          <w:rStyle w:val="VerbatimChar"/>
-          <w:i/>
-          <w:iCs/>
-        </w:rPr>
-        <w:t xml:space="preserve">scripts/regenerate_missing_figures.py</w:t>
-      </w:r>
-      <w:r>
-        <w:rPr>
-          <w:i/>
-          <w:iCs/>
-        </w:rPr>
-        <w:t xml:space="preserve">.</w:t>
-      </w:r>
-    </w:p>
-    <w:p>
-      <w:pPr>
-        <w:pStyle w:val="BodyText"/>
-      </w:pPr>
-      <w:r>
-        <w:rPr>
-          <w:b/>
-          <w:bCs/>
-        </w:rPr>
-        <w:t xml:space="preserve">Addresses reviewer concerns:</w:t>
-      </w:r>
-      <w:r>
-        <w:t xml:space="preserve"> </w:t>
-      </w:r>
-      <w:r>
-        <w:t xml:space="preserve">W10 (F5 brief runs), W12 (placeholder figures)</w:t>
-      </w:r>
-    </w:p>
-    <w:p>
-      <w:pPr>
-        <w:pStyle w:val="BodyText"/>
-      </w:pPr>
-      <w:r>
-        <w:rPr>
-          <w:b/>
-          <w:bCs/>
-        </w:rPr>
-        <w:t xml:space="preserve">Paper sections added:</w:t>
-      </w:r>
-      <w:r>
-        <w:t xml:space="preserve"> </w:t>
-      </w:r>
-      <w:r>
-        <w:rPr>
-          <w:rStyle w:val="VerbatimChar"/>
-        </w:rPr>
-        <w:t xml:space="preserve">paper/sections/frontier_scope_clarification.tex</w:t>
-      </w:r>
-      <w:r>
-        <w:t xml:space="preserve">,</w:t>
-      </w:r>
-      <w:r>
-        <w:t xml:space="preserve"> </w:t>
-      </w:r>
-      <w:r>
-        <w:rPr>
-          <w:rStyle w:val="VerbatimChar"/>
-        </w:rPr>
-        <w:t xml:space="preserve">paper/sections/figures_regeneration_note.tex</w:t>
-      </w:r>
-      <w:r>
-        <w:t xml:space="preserve"> </w:t>
-      </w:r>
-      <w:r>
-        <w:rPr>
-          <w:b/>
-          <w:bCs/>
-        </w:rPr>
-        <w:t xml:space="preserve">Reproducibility:</w:t>
-      </w:r>
-      <w:r>
-        <w:t xml:space="preserve"> </w:t>
-      </w:r>
-      <w:r>
-        <w:rPr>
-          <w:rStyle w:val="VerbatimChar"/>
-        </w:rPr>
-        <w:t xml:space="preserve">scripts/regenerate_missing_figures.py</w:t>
+        <w:t xml:space="preserve">5.8.1 Frontier Claims and Figure Regeneration</w:t>
       </w:r>
     </w:p>
     <w:p>
@@ -29253,7 +28562,7 @@
         <w:pStyle w:val="Heading4"/>
       </w:pPr>
       <w:r>
-        <w:t xml:space="preserve">10.7.1 F5 Reframed from Mechanistic to Descriptive</w:t>
+        <w:t xml:space="preserve">F5 Reframed from Mechanistic to Descriptive</w:t>
       </w:r>
     </w:p>
     <w:p>
@@ -29261,7 +28570,7 @@
         <w:pStyle w:val="FirstParagraph"/>
       </w:pPr>
       <w:r>
-        <w:t xml:space="preserve">Reviewer feedback (W10) correctly flagged that the earlier phrasing of F5 —</w:t>
+        <w:t xml:space="preserve">The earlier phrasing of F5 —</w:t>
       </w:r>
       <w:r>
         <w:t xml:space="preserve"> </w:t>
@@ -29899,7 +29208,7 @@
         <w:pStyle w:val="Heading4"/>
       </w:pPr>
       <w:r>
-        <w:t xml:space="preserve">10.7.2 Regenerated Figures</w:t>
+        <w:t xml:space="preserve">Regenerated Figures</w:t>
       </w:r>
     </w:p>
     <w:p>
@@ -29907,7 +29216,7 @@
         <w:pStyle w:val="FirstParagraph"/>
       </w:pPr>
       <w:r>
-        <w:t xml:space="preserve">Reviewer W12 flagged that three figure PDFs had shipped as placeholder boxes</w:t>
+        <w:t xml:space="preserve">Three figure PDFs in an earlier draft had shipped as placeholder boxes.</w:t>
       </w:r>
       <w:r>
         <w:t xml:space="preserve"> </w:t>
@@ -33491,262 +32800,80 @@
         </w:pict>
       </w:r>
     </w:p>
-    <w:bookmarkStart w:id="111" w:name="X8d6701f9bc108f176476a0f06a988e0b4e97d42"/>
+    <w:bookmarkStart w:id="111" w:name="X2ff10a0994a08134bd7b80f69380f6ce63c0f64"/>
     <w:p>
       <w:pPr>
         <w:pStyle w:val="Heading3"/>
       </w:pPr>
       <w:r>
-        <w:t xml:space="preserve">5.12.1 Formal Definition, Partial-Correlation Ablation, and Cross-Framework Pipeline (Reviewer W1 / Q1 / W13)</w:t>
+        <w:t xml:space="preserve">5.12.1 Formal Definition, Partial-Correlation Ablation, and Cross-Framework Pipeline</w:t>
+      </w:r>
+    </w:p>
+    <w:bookmarkStart w:id="107" w:name="formal-definition"/>
+    <w:p>
+      <w:pPr>
+        <w:pStyle w:val="Heading4"/>
+      </w:pPr>
+      <w:r>
+        <w:t xml:space="preserve">Formal Definition</w:t>
       </w:r>
     </w:p>
     <w:p>
       <w:pPr>
         <w:pStyle w:val="FirstParagraph"/>
       </w:pPr>
+      <w:r>
+        <w:t xml:space="preserve">Let a GRPO batch B_t at optimizer step t consist of |B_t| prompt-groups, each group g containing K rollouts with scalar outcome rewards r_{g,1}, …, r_{g,K}. The Zero-Variance Fraction is formally defined as</w:t>
+      </w:r>
+    </w:p>
+    <w:p>
+      <w:pPr>
+        <w:pStyle w:val="BlockText"/>
+      </w:pPr>
+      <w:r>
+        <w:t xml:space="preserve">ZVF_t = (1 / |B_t|) · Σ_{g in B_t} 1[ Var̂(r_{g,1}, …, r_{g,K}) &lt;= ε ]</w:t>
+      </w:r>
+    </w:p>
+    <w:p>
+      <w:pPr>
+        <w:pStyle w:val="FirstParagraph"/>
+      </w:pPr>
+      <w:r>
+        <w:t xml:space="preserve">where Var̂ is the unbiased sample variance and ε = 10^-6 for rewards normalized to [0,1]. Intuitively, ZVF_t is the fraction of groups at step t whose rollouts all collapsed to the same outcome; those groups contribute zero group-relative advantage and therefore zero gradient signal to GRPO’s policy update. This extends and makes rigorous the informal treatment in §5.12 of this report.</w:t>
+      </w:r>
+    </w:p>
+    <w:p>
+      <w:pPr>
+        <w:pStyle w:val="BodyText"/>
+      </w:pPr>
+      <w:r>
+        <w:t xml:space="preserve">It is tempting to suspect that under binary outcome rewards and group-relative advantages ZVF is a direct function of batch mean reward r̄_t. This holds only at the extremes r̄</w:t>
+      </w:r>
       <w:r>
         <w:rPr>
           <w:i/>
           <w:iCs/>
         </w:rPr>
-        <w:t xml:space="preserve">Paper sections:</w:t>
+        <w:t xml:space="preserve">t in {0,1}. For K i.i.d. Bernoulli rollouts with prompt-specific success probability p_g, the expected ZVF under the null independence model is E[ZVF_t] = E</w:t>
+      </w:r>
+      <w:r>
+        <w:t xml:space="preserve">{p_g}[p_g^K + (1 − p_g)^K], which depends on the</w:t>
+      </w:r>
+      <w:r>
+        <w:t xml:space="preserve"> </w:t>
       </w:r>
       <w:r>
         <w:rPr>
           <w:i/>
           <w:iCs/>
         </w:rPr>
-        <w:t xml:space="preserve"> </w:t>
-      </w:r>
-      <w:r>
-        <w:rPr>
-          <w:rStyle w:val="VerbatimChar"/>
-          <w:i/>
-          <w:iCs/>
-        </w:rPr>
-        <w:t xml:space="preserve">paper/sections/appendix_zvf_formalization.tex</w:t>
-      </w:r>
-      <w:r>
-        <w:rPr>
-          <w:i/>
-          <w:iCs/>
-        </w:rPr>
-        <w:t xml:space="preserve">,</w:t>
-      </w:r>
-      <w:r>
-        <w:rPr>
-          <w:i/>
-          <w:iCs/>
-        </w:rPr>
-        <w:t xml:space="preserve"> </w:t>
-      </w:r>
-      <w:r>
-        <w:rPr>
-          <w:rStyle w:val="VerbatimChar"/>
-          <w:i/>
-          <w:iCs/>
-        </w:rPr>
-        <w:t xml:space="preserve">paper/sections/zvf_pipeline_spec.tex</w:t>
-      </w:r>
-      <w:r>
-        <w:rPr>
-          <w:i/>
-          <w:iCs/>
-        </w:rPr>
-        <w:t xml:space="preserve">. Reproducibility:</w:t>
-      </w:r>
-      <w:r>
-        <w:rPr>
-          <w:i/>
-          <w:iCs/>
-        </w:rPr>
-        <w:t xml:space="preserve"> </w:t>
-      </w:r>
-      <w:r>
-        <w:rPr>
-          <w:rStyle w:val="VerbatimChar"/>
-          <w:i/>
-          <w:iCs/>
-        </w:rPr>
-        <w:t xml:space="preserve">scripts/partial_correlation_zvf.py</w:t>
-      </w:r>
-      <w:r>
-        <w:rPr>
-          <w:i/>
-          <w:iCs/>
-        </w:rPr>
-        <w:t xml:space="preserve">,</w:t>
-      </w:r>
-      <w:r>
-        <w:rPr>
-          <w:i/>
-          <w:iCs/>
-        </w:rPr>
-        <w:t xml:space="preserve"> </w:t>
-      </w:r>
-      <w:r>
-        <w:rPr>
-          <w:rStyle w:val="VerbatimChar"/>
-          <w:i/>
-          <w:iCs/>
-        </w:rPr>
-        <w:t xml:space="preserve">scripts/zvf_compute_cross_framework.py</w:t>
-      </w:r>
-      <w:r>
-        <w:rPr>
-          <w:i/>
-          <w:iCs/>
-        </w:rPr>
-        <w:t xml:space="preserve">.</w:t>
-      </w:r>
-    </w:p>
-    <w:p>
-      <w:pPr>
-        <w:pStyle w:val="BodyText"/>
-      </w:pPr>
-      <w:r>
-        <w:rPr>
-          <w:b/>
-          <w:bCs/>
-        </w:rPr>
-        <w:t xml:space="preserve">Addresses reviewer concerns:</w:t>
-      </w:r>
-      <w:r>
-        <w:t xml:space="preserve"> </w:t>
-      </w:r>
-      <w:r>
-        <w:t xml:space="preserve">W1 (ZVF tautology), Q1 (formalization), W13 (pipeline underspecification)</w:t>
-      </w:r>
-    </w:p>
-    <w:p>
-      <w:pPr>
-        <w:pStyle w:val="BodyText"/>
-      </w:pPr>
-      <w:r>
-        <w:rPr>
-          <w:b/>
-          <w:bCs/>
-        </w:rPr>
-        <w:t xml:space="preserve">Paper sections added:</w:t>
-      </w:r>
-      <w:r>
-        <w:t xml:space="preserve"> </w:t>
-      </w:r>
-      <w:r>
-        <w:rPr>
-          <w:rStyle w:val="VerbatimChar"/>
-        </w:rPr>
-        <w:t xml:space="preserve">paper/sections/appendix_zvf_formalization.tex</w:t>
-      </w:r>
-      <w:r>
-        <w:t xml:space="preserve">,</w:t>
-      </w:r>
-      <w:r>
-        <w:t xml:space="preserve"> </w:t>
-      </w:r>
-      <w:r>
-        <w:rPr>
-          <w:rStyle w:val="VerbatimChar"/>
-        </w:rPr>
-        <w:t xml:space="preserve">paper/sections/zvf_pipeline_spec.tex</w:t>
-      </w:r>
-      <w:r>
-        <w:t xml:space="preserve"> </w:t>
-      </w:r>
-      <w:r>
-        <w:rPr>
-          <w:b/>
-          <w:bCs/>
-        </w:rPr>
-        <w:t xml:space="preserve">Reproducibility:</w:t>
-      </w:r>
-      <w:r>
-        <w:t xml:space="preserve"> </w:t>
-      </w:r>
-      <w:r>
-        <w:rPr>
-          <w:rStyle w:val="VerbatimChar"/>
-        </w:rPr>
-        <w:t xml:space="preserve">scripts/partial_correlation_zvf.py</w:t>
-      </w:r>
-      <w:r>
-        <w:t xml:space="preserve">,</w:t>
-      </w:r>
-      <w:r>
-        <w:t xml:space="preserve"> </w:t>
-      </w:r>
-      <w:r>
-        <w:rPr>
-          <w:rStyle w:val="VerbatimChar"/>
-        </w:rPr>
-        <w:t xml:space="preserve">scripts/zvf_compute_cross_framework.py</w:t>
-      </w:r>
-    </w:p>
-    <w:bookmarkStart w:id="107" w:name="formal-definition"/>
-    <w:p>
-      <w:pPr>
-        <w:pStyle w:val="Heading4"/>
-      </w:pPr>
-      <w:r>
-        <w:t xml:space="preserve">Formal Definition</w:t>
-      </w:r>
-    </w:p>
-    <w:p>
-      <w:pPr>
-        <w:pStyle w:val="FirstParagraph"/>
-      </w:pPr>
-      <w:r>
-        <w:t xml:space="preserve">Let a GRPO batch B_t at optimizer step t consist of |B_t| prompt-groups, each group g containing K rollouts with scalar outcome rewards r_{g,1}, …, r_{g,K}. The Zero-Variance Fraction is formally defined as</w:t>
-      </w:r>
-    </w:p>
-    <w:p>
-      <w:pPr>
-        <w:pStyle w:val="BlockText"/>
-      </w:pPr>
-      <w:r>
-        <w:t xml:space="preserve">ZVF_t = (1 / |B_t|) · Σ_{g in B_t} 1[ Var̂(r_{g,1}, …, r_{g,K}) &lt;= ε ]</w:t>
-      </w:r>
-    </w:p>
-    <w:p>
-      <w:pPr>
-        <w:pStyle w:val="FirstParagraph"/>
-      </w:pPr>
-      <w:r>
-        <w:t xml:space="preserve">where Var̂ is the unbiased sample variance and ε = 10^-6 for rewards normalized to [0,1]. Intuitively, ZVF_t is the fraction of groups at step t whose rollouts all collapsed to the same outcome; those groups contribute zero group-relative advantage and therefore zero gradient signal to GRPO’s policy update. This extends and makes rigorous the informal treatment in §5.12 of this report.</w:t>
-      </w:r>
-    </w:p>
-    <w:p>
-      <w:pPr>
-        <w:pStyle w:val="BodyText"/>
-      </w:pPr>
-      <w:r>
-        <w:t xml:space="preserve">A reviewer may reasonably suspect that under binary outcome rewards and group-relative advantages ZVF is a direct function of batch mean reward r̄_t. This holds only at the extremes r̄</w:t>
-      </w:r>
-      <w:r>
-        <w:rPr>
-          <w:i/>
-          <w:iCs/>
-        </w:rPr>
-        <w:t xml:space="preserve">t in {0,1}. For K i.i.d. Bernoulli rollouts with prompt-specific success probability p_g, the expected ZVF under the null independence model is E[ZVF_t] = E</w:t>
-      </w:r>
-      <w:r>
-        <w:t xml:space="preserve">{p_g}[p_g^K + (1 − p_g)^K], which depends on the</w:t>
-      </w:r>
-      <w:r>
-        <w:t xml:space="preserve"> </w:t>
-      </w:r>
-      <w:r>
-        <w:rPr>
-          <w:i/>
-          <w:iCs/>
-        </w:rPr>
         <w:t xml:space="preserve">shape</w:t>
       </w:r>
       <w:r>
         <w:t xml:space="preserve"> </w:t>
       </w:r>
       <w:r>
-        <w:t xml:space="preserve">of the difficulty distribution, not only its mean. Concretely, two populations with the same mean reward r̄ = 0.5 can differ dramatically: a bimodal population with p_g in {0, 1} yields ZVF = 1, whereas a uniform-hard population with all p_g = 0.5 and K = 8 yields ZVF ~ 2·(0.5)^8 ~ 0.008. ZVF therefore carries non-trivial information about the higher moments of the per-prompt success distribution, and the claim that it is tautologically equivalent to mean reward is false.</w:t>
+        <w:t xml:space="preserve">of the difficulty distribution, not only its mean. Concretely, two populations with the same mean reward r̄ = 0.5 can differ dramatically: a bimodal population with p_g in {0, 1} yields ZVF = 1, whereas a uniform-hard population with all p_g = 0.5 and K = 8 yields ZVF ~ 2·(0.5)^8 ~ 0.008. ZVF therefore carries non-trivial information about the higher moments of the per-prompt success distribution, and is not tautologically equivalent to mean reward.</w:t>
       </w:r>
     </w:p>
     <w:bookmarkEnd w:id="107"/>
@@ -40454,219 +39581,13 @@
         </w:pict>
       </w:r>
     </w:p>
-    <w:bookmarkStart w:id="121" w:name="Xba3a427ed0b897b80c70b76eacdd53035989350"/>
+    <w:bookmarkStart w:id="121" w:name="X3b50a74bca6fedae6893d702e4a95d200464e4d"/>
     <w:p>
       <w:pPr>
         <w:pStyle w:val="Heading3"/>
       </w:pPr>
       <w:r>
-        <w:t xml:space="preserve">5.16.1 Evidence-Tier Partition and F1–F5 Survival Analysis (Reviewer W4 / W5 / Q5)</w:t>
-      </w:r>
-    </w:p>
-    <w:p>
-      <w:pPr>
-        <w:pStyle w:val="FirstParagraph"/>
-      </w:pPr>
-      <w:r>
-        <w:rPr>
-          <w:i/>
-          <w:iCs/>
-        </w:rPr>
-        <w:t xml:space="preserve">Paper section:</w:t>
-      </w:r>
-      <w:r>
-        <w:rPr>
-          <w:i/>
-          <w:iCs/>
-        </w:rPr>
-        <w:t xml:space="preserve"> </w:t>
-      </w:r>
-      <w:r>
-        <w:rPr>
-          <w:rStyle w:val="VerbatimChar"/>
-          <w:i/>
-          <w:iCs/>
-        </w:rPr>
-        <w:t xml:space="preserve">paper/sections/statistical_rigor_addendum.tex</w:t>
-      </w:r>
-      <w:r>
-        <w:rPr>
-          <w:i/>
-          <w:iCs/>
-        </w:rPr>
-        <w:t xml:space="preserve">. Reproducibility:</w:t>
-      </w:r>
-      <w:r>
-        <w:rPr>
-          <w:i/>
-          <w:iCs/>
-        </w:rPr>
-        <w:t xml:space="preserve"> </w:t>
-      </w:r>
-      <w:r>
-        <w:rPr>
-          <w:rStyle w:val="VerbatimChar"/>
-          <w:i/>
-          <w:iCs/>
-        </w:rPr>
-        <w:t xml:space="preserve">experiments/survival_analysis.py</w:t>
-      </w:r>
-      <w:r>
-        <w:rPr>
-          <w:i/>
-          <w:iCs/>
-        </w:rPr>
-        <w:t xml:space="preserve"> </w:t>
-      </w:r>
-      <w:r>
-        <w:rPr>
-          <w:i/>
-          <w:iCs/>
-        </w:rPr>
-        <w:t xml:space="preserve">-&gt;</w:t>
-      </w:r>
-      <w:r>
-        <w:rPr>
-          <w:i/>
-          <w:iCs/>
-        </w:rPr>
-        <w:t xml:space="preserve"> </w:t>
-      </w:r>
-      <w:r>
-        <w:rPr>
-          <w:rStyle w:val="VerbatimChar"/>
-          <w:i/>
-          <w:iCs/>
-        </w:rPr>
-        <w:t xml:space="preserve">experiments/results/survival_analysis.tsv</w:t>
-      </w:r>
-      <w:r>
-        <w:rPr>
-          <w:i/>
-          <w:iCs/>
-        </w:rPr>
-        <w:t xml:space="preserve">.</w:t>
-      </w:r>
-    </w:p>
-    <w:p>
-      <w:pPr>
-        <w:pStyle w:val="BodyText"/>
-      </w:pPr>
-      <w:r>
-        <w:rPr>
-          <w:b/>
-          <w:bCs/>
-        </w:rPr>
-        <w:t xml:space="preserve">Addresses reviewer concerns:</w:t>
-      </w:r>
-      <w:r>
-        <w:t xml:space="preserve"> </w:t>
-      </w:r>
-      <w:r>
-        <w:t xml:space="preserve">W4 (single-seed short-horizon Tinker/API runs inflate headline numbers), W5 (BH corrections aggregate single-seed rows with multi-seed rows, anti-conservative for the latter), Q5 (which of F1–F5 actually survive when restricted to TRL, &gt;=5 seeds, &gt;=100 steps?).</w:t>
-      </w:r>
-    </w:p>
-    <w:p>
-      <w:pPr>
-        <w:pStyle w:val="BodyText"/>
-      </w:pPr>
-      <w:r>
-        <w:rPr>
-          <w:b/>
-          <w:bCs/>
-        </w:rPr>
-        <w:t xml:space="preserve">Paper section added:</w:t>
-      </w:r>
-      <w:r>
-        <w:t xml:space="preserve"> </w:t>
-      </w:r>
-      <w:r>
-        <w:rPr>
-          <w:rStyle w:val="VerbatimChar"/>
-        </w:rPr>
-        <w:t xml:space="preserve">paper/sections/statistical_rigor_addendum.tex</w:t>
-      </w:r>
-      <w:r>
-        <w:t xml:space="preserve"> </w:t>
-      </w:r>
-      <w:r>
-        <w:t xml:space="preserve">(§App. Statistical Rigor Addendum, label</w:t>
-      </w:r>
-      <w:r>
-        <w:t xml:space="preserve"> </w:t>
-      </w:r>
-      <w:r>
-        <w:rPr>
-          <w:rStyle w:val="VerbatimChar"/>
-        </w:rPr>
-        <w:t xml:space="preserve">app:stat-rigor-addendum</w:t>
-      </w:r>
-      <w:r>
-        <w:t xml:space="preserve">).</w:t>
-      </w:r>
-      <w:r>
-        <w:t xml:space="preserve"> </w:t>
-      </w:r>
-      <w:r>
-        <w:rPr>
-          <w:b/>
-          <w:bCs/>
-        </w:rPr>
-        <w:t xml:space="preserve">Reproducibility:</w:t>
-      </w:r>
-      <w:r>
-        <w:t xml:space="preserve"> </w:t>
-      </w:r>
-      <w:r>
-        <w:rPr>
-          <w:rStyle w:val="VerbatimChar"/>
-        </w:rPr>
-        <w:t xml:space="preserve">experiments/survival_analysis.py</w:t>
-      </w:r>
-      <w:r>
-        <w:t xml:space="preserve"> </w:t>
-      </w:r>
-      <w:r>
-        <w:t xml:space="preserve">-&gt;</w:t>
-      </w:r>
-      <w:r>
-        <w:t xml:space="preserve"> </w:t>
-      </w:r>
-      <w:r>
-        <w:rPr>
-          <w:rStyle w:val="VerbatimChar"/>
-        </w:rPr>
-        <w:t xml:space="preserve">experiments/results/survival_analysis.tsv</w:t>
-      </w:r>
-      <w:r>
-        <w:t xml:space="preserve"> </w:t>
-      </w:r>
-      <w:r>
-        <w:t xml:space="preserve">(deterministic,</w:t>
-      </w:r>
-      <w:r>
-        <w:t xml:space="preserve"> </w:t>
-      </w:r>
-      <w:r>
-        <w:rPr>
-          <w:rStyle w:val="VerbatimChar"/>
-        </w:rPr>
-        <w:t xml:space="preserve">MASTER_SEED = 20260506</w:t>
-      </w:r>
-      <w:r>
-        <w:t xml:space="preserve">, matches</w:t>
-      </w:r>
-      <w:r>
-        <w:t xml:space="preserve"> </w:t>
-      </w:r>
-      <w:r>
-        <w:rPr>
-          <w:rStyle w:val="VerbatimChar"/>
-        </w:rPr>
-        <w:t xml:space="preserve">experiments/compute_statistics.py</w:t>
-      </w:r>
-      <w:r>
-        <w:t xml:space="preserve">). Consistent with the main capstone’s §5.15 (power / BH) and §5.16 (deterministic statistical rigor pass).</w:t>
+        <w:t xml:space="preserve">5.16.1 Evidence-Tier Partition and F1–F5 Survival Analysis</w:t>
       </w:r>
     </w:p>
     <w:bookmarkStart w:id="117" w:name="evidence-tiers"/>
@@ -43246,19 +42167,28 @@
         <w:t xml:space="preserve"> </w:t>
       </w:r>
       <w:r>
-        <w:t xml:space="preserve">F3 is the one finding that clears the Q5 bar. F1, F2, F4, F5 are downgraded to descriptive case studies pending matched multi-seed &gt;=100-step Tier-A evidence in an open framework — the next-step programme flagged in the Conclusion.</w:t>
+        <w:t xml:space="preserve">F3 is the one finding that clears the current inferential bar. F1, F2, F4, and F5 are downgraded to descriptive case studies pending matched multi-seed &gt;=100-step Tier-A evidence in an open framework — the next-step programme flagged in the Conclusion.</w:t>
       </w:r>
     </w:p>
     <w:bookmarkEnd w:id="120"/>
     <w:bookmarkEnd w:id="121"/>
     <w:bookmarkEnd w:id="122"/>
-    <w:bookmarkStart w:id="128" w:name="X9d176739f1fc798cbb8b1f0ab4d9f3b772ae8bf"/>
+    <w:bookmarkStart w:id="128" w:name="Xadeec8c14b287e55daaf46f96ab0fa0be1f1265"/>
     <w:p>
       <w:pPr>
         <w:pStyle w:val="Heading2"/>
       </w:pPr>
       <w:r>
-        <w:t xml:space="preserve">5.17 Group-Size Reconciliation: Token-Budget-Normalized Sweep (Reviewer W2 / W3 / Q2)</w:t>
+        <w:t xml:space="preserve">5.17 Group-Size Reconciliation: Token-Budget-Normalized Sweep</w:t>
+      </w:r>
+    </w:p>
+    <w:bookmarkStart w:id="123" w:name="the-apparent-contradiction"/>
+    <w:p>
+      <w:pPr>
+        <w:pStyle w:val="Heading4"/>
+      </w:pPr>
+      <w:r>
+        <w:t xml:space="preserve">The Apparent Contradiction</w:t>
       </w:r>
     </w:p>
     <w:p>
@@ -43266,123 +42196,39 @@
         <w:pStyle w:val="FirstParagraph"/>
       </w:pPr>
       <w:r>
-        <w:rPr>
-          <w:i/>
-          <w:iCs/>
-        </w:rPr>
-        <w:t xml:space="preserve">Paper section:</w:t>
-      </w:r>
-      <w:r>
-        <w:rPr>
-          <w:i/>
-          <w:iCs/>
-        </w:rPr>
-        <w:t xml:space="preserve"> </w:t>
-      </w:r>
-      <w:r>
-        <w:rPr>
-          <w:rStyle w:val="VerbatimChar"/>
-          <w:i/>
-          <w:iCs/>
-        </w:rPr>
-        <w:t xml:space="preserve">paper/sections/group_size_reconcile.tex</w:t>
-      </w:r>
-      <w:r>
-        <w:rPr>
-          <w:i/>
-          <w:iCs/>
-        </w:rPr>
-        <w:t xml:space="preserve">. Reproducibility:</w:t>
-      </w:r>
-      <w:r>
-        <w:rPr>
-          <w:i/>
-          <w:iCs/>
-        </w:rPr>
-        <w:t xml:space="preserve"> </w:t>
-      </w:r>
-      <w:r>
-        <w:rPr>
-          <w:rStyle w:val="VerbatimChar"/>
-          <w:i/>
-          <w:iCs/>
-        </w:rPr>
-        <w:t xml:space="preserve">experiments/group_size_token_normalized.py</w:t>
-      </w:r>
-      <w:r>
-        <w:rPr>
-          <w:i/>
-          <w:iCs/>
-        </w:rPr>
-        <w:t xml:space="preserve"> </w:t>
-      </w:r>
-      <w:r>
-        <w:rPr>
-          <w:i/>
-          <w:iCs/>
-        </w:rPr>
-        <w:t xml:space="preserve">-&gt;</w:t>
-      </w:r>
-      <w:r>
-        <w:rPr>
-          <w:i/>
-          <w:iCs/>
-        </w:rPr>
-        <w:t xml:space="preserve"> </w:t>
-      </w:r>
-      <w:r>
-        <w:rPr>
-          <w:rStyle w:val="VerbatimChar"/>
-          <w:i/>
-          <w:iCs/>
-        </w:rPr>
-        <w:t xml:space="preserve">experiments/results/group_size_token_normalized.tsv</w:t>
-      </w:r>
-      <w:r>
-        <w:rPr>
-          <w:i/>
-          <w:iCs/>
-        </w:rPr>
-        <w:t xml:space="preserve">.</w:t>
-      </w:r>
-    </w:p>
-    <w:p>
-      <w:pPr>
-        <w:pStyle w:val="BodyText"/>
-      </w:pPr>
+        <w:t xml:space="preserve">An apparent inconsistency arises because Table 6 reports</w:t>
+      </w:r>
+      <w:r>
+        <w:t xml:space="preserve"> </w:t>
+      </w:r>
       <w:r>
         <w:rPr>
           <w:b/>
           <w:bCs/>
         </w:rPr>
-        <w:t xml:space="preserve">Addresses reviewer concerns:</w:t>
-      </w:r>
-      <w:r>
-        <w:t xml:space="preserve"> </w:t>
-      </w:r>
-      <w:r>
-        <w:t xml:space="preserve">W2 (G=32 vs G=8 contradiction), W3 (gradient utilization undefined), Q2 (token-normalized sweeps)</w:t>
-      </w:r>
-    </w:p>
-    <w:p>
-      <w:pPr>
-        <w:pStyle w:val="BodyText"/>
-      </w:pPr>
+        <w:t xml:space="preserve">G=8</w:t>
+      </w:r>
+      <w:r>
+        <w:t xml:space="preserve"> </w:t>
+      </w:r>
+      <w:r>
+        <w:t xml:space="preserve">as the highest last-10 reward under a</w:t>
+      </w:r>
+      <w:r>
+        <w:t xml:space="preserve"> </w:t>
+      </w:r>
       <w:r>
         <w:rPr>
           <w:b/>
           <w:bCs/>
         </w:rPr>
-        <w:t xml:space="preserve">Paper section added:</w:t>
-      </w:r>
-      <w:r>
-        <w:t xml:space="preserve"> </w:t>
-      </w:r>
-      <w:r>
-        <w:rPr>
-          <w:rStyle w:val="VerbatimChar"/>
-        </w:rPr>
-        <w:t xml:space="preserve">paper/sections/group_size_reconcile.tex</w:t>
+        <w:t xml:space="preserve">fixed-step</w:t>
+      </w:r>
+      <w:r>
+        <w:t xml:space="preserve"> </w:t>
+      </w:r>
+      <w:r>
+        <w:t xml:space="preserve">budget, while elsewhere we claim that</w:t>
       </w:r>
       <w:r>
         <w:t xml:space="preserve"> </w:t>
@@ -43392,87 +42238,13 @@
           <w:b/>
           <w:bCs/>
         </w:rPr>
-        <w:t xml:space="preserve">Reproducibility:</w:t>
-      </w:r>
-      <w:r>
-        <w:t xml:space="preserve"> </w:t>
-      </w:r>
-      <w:r>
-        <w:rPr>
-          <w:rStyle w:val="VerbatimChar"/>
-        </w:rPr>
-        <w:t xml:space="preserve">experiments/group_size_token_normalized.py</w:t>
-      </w:r>
-    </w:p>
-    <w:bookmarkStart w:id="123" w:name="the-apparent-contradiction"/>
-    <w:p>
-      <w:pPr>
-        <w:pStyle w:val="Heading4"/>
-      </w:pPr>
-      <w:r>
-        <w:t xml:space="preserve">The Apparent Contradiction</w:t>
-      </w:r>
-    </w:p>
-    <w:p>
-      <w:pPr>
-        <w:pStyle w:val="FirstParagraph"/>
-      </w:pPr>
-      <w:r>
-        <w:t xml:space="preserve">A reviewer correctly identified an apparent inconsistency: Table 6 of the main text reports</w:t>
-      </w:r>
-      <w:r>
-        <w:t xml:space="preserve"> </w:t>
-      </w:r>
-      <w:r>
-        <w:rPr>
-          <w:b/>
-          <w:bCs/>
-        </w:rPr>
-        <w:t xml:space="preserve">G=8</w:t>
-      </w:r>
-      <w:r>
-        <w:t xml:space="preserve"> </w:t>
-      </w:r>
-      <w:r>
-        <w:t xml:space="preserve">as the highest last-10 reward under a</w:t>
-      </w:r>
-      <w:r>
-        <w:t xml:space="preserve"> </w:t>
-      </w:r>
-      <w:r>
-        <w:rPr>
-          <w:b/>
-          <w:bCs/>
-        </w:rPr>
-        <w:t xml:space="preserve">fixed-step</w:t>
-      </w:r>
-      <w:r>
-        <w:t xml:space="preserve"> </w:t>
-      </w:r>
-      <w:r>
-        <w:t xml:space="preserve">budget, while elsewhere we claim that</w:t>
-      </w:r>
-      <w:r>
-        <w:t xml:space="preserve"> </w:t>
-      </w:r>
-      <w:r>
-        <w:rPr>
-          <w:b/>
-          <w:bCs/>
-        </w:rPr>
         <w:t xml:space="preserve">G~32</w:t>
       </w:r>
       <w:r>
         <w:t xml:space="preserve"> </w:t>
       </w:r>
       <w:r>
-        <w:t xml:space="preserve">“maximizes gradient utilization.”</w:t>
-      </w:r>
-      <w:r>
-        <w:t xml:space="preserve"> </w:t>
-      </w:r>
-      <w:r>
-        <w:t xml:space="preserve">These observations are compatible once the axis of comparison is made explicit. Under a</w:t>
+        <w:t xml:space="preserve">maximizes gradient utilization. These observations are compatible once the axis of comparison is made explicit. Under a</w:t>
       </w:r>
       <w:r>
         <w:t xml:space="preserve"> </w:t>
@@ -44730,7 +43502,7 @@
         <w:pStyle w:val="FirstParagraph"/>
       </w:pPr>
       <w:r>
-        <w:t xml:space="preserve">The reviewer’s concern is taken seriously: the</w:t>
+        <w:t xml:space="preserve">The important conclusion is that the</w:t>
       </w:r>
       <w:r>
         <w:t xml:space="preserve"> </w:t>
@@ -44775,111 +43547,18 @@
     </w:p>
     <w:bookmarkEnd w:id="127"/>
     <w:bookmarkEnd w:id="128"/>
-    <w:bookmarkStart w:id="130" w:name="X74e64c73a3b06dae78d083d8c33783da58192a0"/>
+    <w:bookmarkStart w:id="130" w:name="held-out-sampling-protocols-p1-p2-p3"/>
     <w:p>
       <w:pPr>
         <w:pStyle w:val="Heading2"/>
       </w:pPr>
       <w:r>
-        <w:t xml:space="preserve">5.18 Held-Out Sampling Protocols: P1 / P2 / P3 (Reviewer W8)</w:t>
+        <w:t xml:space="preserve">5.18 Held-Out Sampling Protocols: P1 / P2 / P3</w:t>
       </w:r>
     </w:p>
     <w:p>
       <w:pPr>
         <w:pStyle w:val="FirstParagraph"/>
-      </w:pPr>
-      <w:r>
-        <w:rPr>
-          <w:i/>
-          <w:iCs/>
-        </w:rPr>
-        <w:t xml:space="preserve">Paper section:</w:t>
-      </w:r>
-      <w:r>
-        <w:rPr>
-          <w:i/>
-          <w:iCs/>
-        </w:rPr>
-        <w:t xml:space="preserve"> </w:t>
-      </w:r>
-      <w:r>
-        <w:rPr>
-          <w:rStyle w:val="VerbatimChar"/>
-          <w:i/>
-          <w:iCs/>
-        </w:rPr>
-        <w:t xml:space="preserve">paper/sections/heldout_stratified.tex</w:t>
-      </w:r>
-      <w:r>
-        <w:rPr>
-          <w:i/>
-          <w:iCs/>
-        </w:rPr>
-        <w:t xml:space="preserve">. Reproducibility:</w:t>
-      </w:r>
-      <w:r>
-        <w:rPr>
-          <w:i/>
-          <w:iCs/>
-        </w:rPr>
-        <w:t xml:space="preserve"> </w:t>
-      </w:r>
-      <w:r>
-        <w:rPr>
-          <w:rStyle w:val="VerbatimChar"/>
-          <w:i/>
-          <w:iCs/>
-        </w:rPr>
-        <w:t xml:space="preserve">experiments/stratified_heldout.py</w:t>
-      </w:r>
-      <w:r>
-        <w:rPr>
-          <w:i/>
-          <w:iCs/>
-        </w:rPr>
-        <w:t xml:space="preserve"> </w:t>
-      </w:r>
-      <w:r>
-        <w:rPr>
-          <w:i/>
-          <w:iCs/>
-        </w:rPr>
-        <w:t xml:space="preserve">-&gt;</w:t>
-      </w:r>
-      <w:r>
-        <w:rPr>
-          <w:i/>
-          <w:iCs/>
-        </w:rPr>
-        <w:t xml:space="preserve"> </w:t>
-      </w:r>
-      <w:r>
-        <w:rPr>
-          <w:rStyle w:val="VerbatimChar"/>
-          <w:i/>
-          <w:iCs/>
-        </w:rPr>
-        <w:t xml:space="preserve">experiments/results/heldout_stratified.tsv</w:t>
-      </w:r>
-      <w:r>
-        <w:rPr>
-          <w:i/>
-          <w:iCs/>
-        </w:rPr>
-        <w:t xml:space="preserve">.</w:t>
-      </w:r>
-    </w:p>
-    <w:p>
-      <w:pPr>
-        <w:pStyle w:val="BodyText"/>
-      </w:pPr>
-      <w:r>
-        <w:t xml:space="preserve">10.6.1 Held-Out Sampling Protocols (W8)</w:t>
-      </w:r>
-    </w:p>
-    <w:p>
-      <w:pPr>
-        <w:pStyle w:val="BodyText"/>
       </w:pPr>
       <w:r>
         <w:t xml:space="preserve">Three sampling protocols were applied to GSM8K-500 held-out accuracy for every condition:</w:t>
@@ -45146,7 +43825,7 @@
               <w:pStyle w:val="Compact"/>
             </w:pPr>
             <w:r>
-              <w:t xml:space="preserve">Qwen3-8B-Base (W1)</w:t>
+              <w:t xml:space="preserve">Qwen3-8B-Base</w:t>
             </w:r>
           </w:p>
         </w:tc>
@@ -45282,7 +43961,7 @@
               <w:pStyle w:val="Compact"/>
             </w:pPr>
             <w:r>
-              <w:t xml:space="preserve">DeepSeek-V3.1 (W3)</w:t>
+              <w:t xml:space="preserve">DeepSeek-V3.1</w:t>
             </w:r>
           </w:p>
         </w:tc>
@@ -45350,7 +44029,7 @@
               <w:pStyle w:val="Compact"/>
             </w:pPr>
             <w:r>
-              <w:t xml:space="preserve">gpt-oss-120b (W1)</w:t>
+              <w:t xml:space="preserve">gpt-oss-120b</w:t>
             </w:r>
           </w:p>
         </w:tc>
@@ -45988,118 +44667,25 @@
     </w:p>
     <w:bookmarkEnd w:id="129"/>
     <w:bookmarkEnd w:id="130"/>
-    <w:bookmarkStart w:id="132" w:name="Xb31afa2ac17f61b99d63558b0ab10318c430907"/>
+    <w:bookmarkStart w:id="132" w:name="base-vs-instruct-paired-evaluation"/>
     <w:p>
       <w:pPr>
         <w:pStyle w:val="Heading2"/>
       </w:pPr>
       <w:r>
-        <w:t xml:space="preserve">5.19 Base vs Instruct Paired Evaluation (Reviewer W9 / W11 / Q4)</w:t>
+        <w:t xml:space="preserve">5.19 Base vs Instruct Paired Evaluation</w:t>
       </w:r>
     </w:p>
     <w:p>
       <w:pPr>
         <w:pStyle w:val="FirstParagraph"/>
-      </w:pPr>
-      <w:r>
-        <w:rPr>
-          <w:i/>
-          <w:iCs/>
-        </w:rPr>
-        <w:t xml:space="preserve">Paper section:</w:t>
-      </w:r>
-      <w:r>
-        <w:rPr>
-          <w:i/>
-          <w:iCs/>
-        </w:rPr>
-        <w:t xml:space="preserve"> </w:t>
-      </w:r>
-      <w:r>
-        <w:rPr>
-          <w:rStyle w:val="VerbatimChar"/>
-          <w:i/>
-          <w:iCs/>
-        </w:rPr>
-        <w:t xml:space="preserve">paper/sections/base_vs_instruct_paired.tex</w:t>
-      </w:r>
-      <w:r>
-        <w:rPr>
-          <w:i/>
-          <w:iCs/>
-        </w:rPr>
-        <w:t xml:space="preserve">. Reproducibility:</w:t>
-      </w:r>
-      <w:r>
-        <w:rPr>
-          <w:i/>
-          <w:iCs/>
-        </w:rPr>
-        <w:t xml:space="preserve"> </w:t>
-      </w:r>
-      <w:r>
-        <w:rPr>
-          <w:rStyle w:val="VerbatimChar"/>
-          <w:i/>
-          <w:iCs/>
-        </w:rPr>
-        <w:t xml:space="preserve">experiments/base_instruct_paired.py</w:t>
-      </w:r>
-      <w:r>
-        <w:rPr>
-          <w:i/>
-          <w:iCs/>
-        </w:rPr>
-        <w:t xml:space="preserve"> </w:t>
-      </w:r>
-      <w:r>
-        <w:rPr>
-          <w:i/>
-          <w:iCs/>
-        </w:rPr>
-        <w:t xml:space="preserve">-&gt;</w:t>
-      </w:r>
-      <w:r>
-        <w:rPr>
-          <w:i/>
-          <w:iCs/>
-        </w:rPr>
-        <w:t xml:space="preserve"> </w:t>
-      </w:r>
-      <w:r>
-        <w:rPr>
-          <w:rStyle w:val="VerbatimChar"/>
-          <w:i/>
-          <w:iCs/>
-        </w:rPr>
-        <w:t xml:space="preserve">experiments/results/base_instruct_paired.tsv</w:t>
-      </w:r>
-      <w:r>
-        <w:rPr>
-          <w:i/>
-          <w:iCs/>
-        </w:rPr>
-        <w:t xml:space="preserve">.</w:t>
-      </w:r>
-    </w:p>
-    <w:p>
-      <w:pPr>
-        <w:pStyle w:val="BodyText"/>
-      </w:pPr>
-      <w:r>
-        <w:t xml:space="preserve">10.6.2 Base vs Instruct Paired Evaluation (W9, W11, Q4)</w:t>
-      </w:r>
-    </w:p>
-    <w:p>
-      <w:pPr>
-        <w:pStyle w:val="BodyText"/>
       </w:pPr>
       <w:r>
         <w:rPr>
           <w:b/>
           <w:bCs/>
         </w:rPr>
-        <w:t xml:space="preserve">Reconciling the</w:t>
+        <w:t xml:space="preserve">Aligning the</w:t>
       </w:r>
       <w:r>
         <w:rPr>
@@ -46114,7 +44700,7 @@
           <w:b/>
           <w:bCs/>
         </w:rPr>
-        <w:t xml:space="preserve">+0.922 vs 84.4 percent</w:t>
+        <w:t xml:space="preserve">+0.922</w:t>
       </w:r>
       <w:r>
         <w:rPr>
@@ -46128,152 +44714,151 @@
           <w:b/>
           <w:bCs/>
         </w:rPr>
-        <w:t xml:space="preserve">flag (W9).</w:t>
-      </w:r>
-      <w:r>
-        <w:t xml:space="preserve"> </w:t>
-      </w:r>
-      <w:r>
-        <w:t xml:space="preserve">The reviewer read</w:t>
-      </w:r>
-      <w:r>
-        <w:t xml:space="preserve"> </w:t>
-      </w:r>
-      <w:r>
-        <w:rPr>
-          <w:rStyle w:val="VerbatimChar"/>
-        </w:rPr>
-        <w:t xml:space="preserve">+0.922</w:t>
-      </w:r>
-      <w:r>
-        <w:t xml:space="preserve"> </w:t>
-      </w:r>
-      <w:r>
         <w:t xml:space="preserve">and</w:t>
-      </w:r>
-      <w:r>
-        <w:t xml:space="preserve"> </w:t>
-      </w:r>
-      <w:r>
-        <w:rPr>
-          <w:rStyle w:val="VerbatimChar"/>
-        </w:rPr>
-        <w:t xml:space="preserve">84.4 percent</w:t>
-      </w:r>
-      <w:r>
-        <w:t xml:space="preserve"> </w:t>
-      </w:r>
-      <w:r>
-        <w:t xml:space="preserve">as contradicting held-out numbers. They are not comparable quantities:</w:t>
-      </w:r>
-      <w:r>
-        <w:t xml:space="preserve"> </w:t>
-      </w:r>
-      <w:r>
-        <w:rPr>
-          <w:rStyle w:val="VerbatimChar"/>
-        </w:rPr>
-        <w:t xml:space="preserve">+0.922</w:t>
-      </w:r>
-      <w:r>
-        <w:t xml:space="preserve"> </w:t>
-      </w:r>
-      <w:r>
-        <w:t xml:space="preserve">is the</w:t>
-      </w:r>
-      <w:r>
-        <w:t xml:space="preserve"> </w:t>
       </w:r>
       <w:r>
         <w:rPr>
           <w:b/>
           <w:bCs/>
         </w:rPr>
-        <w:t xml:space="preserve">training-reward peak</w:t>
-      </w:r>
-      <w:r>
-        <w:t xml:space="preserve"> </w:t>
-      </w:r>
-      <w:r>
-        <w:t xml:space="preserve">of the</w:t>
-      </w:r>
-      <w:r>
         <w:t xml:space="preserve"> </w:t>
       </w:r>
       <w:r>
         <w:rPr>
           <w:rStyle w:val="VerbatimChar"/>
-        </w:rPr>
-        <w:t xml:space="preserve">campaign_v2_w1_qwen3-8b-base</w:t>
-      </w:r>
-      <w:r>
-        <w:t xml:space="preserve"> </w:t>
-      </w:r>
-      <w:r>
-        <w:t xml:space="preserve">run on</w:t>
-      </w:r>
-      <w:r>
-        <w:t xml:space="preserve"> </w:t>
-      </w:r>
-      <w:r>
-        <w:rPr>
-          <w:rStyle w:val="VerbatimChar"/>
-        </w:rPr>
-        <w:t xml:space="preserve">Qwen/Qwen3-8B-Base</w:t>
-      </w:r>
-      <w:r>
-        <w:t xml:space="preserve"> </w:t>
-      </w:r>
-      <w:r>
-        <w:t xml:space="preserve">(peak = 1.00, last-10 = 0.856, single seed, GRPO</w:t>
-      </w:r>
-      <w:r>
-        <w:t xml:space="preserve"> </w:t>
-      </w:r>
-      <w:r>
-        <w:rPr>
-          <w:rStyle w:val="VerbatimChar"/>
-        </w:rPr>
-        <w:t xml:space="preserve">G=8</w:t>
-      </w:r>
-      <w:r>
-        <w:t xml:space="preserve">,</w:t>
-      </w:r>
-      <w:r>
-        <w:t xml:space="preserve"> </w:t>
-      </w:r>
-      <w:r>
-        <w:rPr>
-          <w:rStyle w:val="VerbatimChar"/>
-        </w:rPr>
-        <w:t xml:space="preserve">lr=1e-5</w:t>
-      </w:r>
-      <w:r>
-        <w:t xml:space="preserve">, 30 steps).</w:t>
-      </w:r>
-      <w:r>
-        <w:t xml:space="preserve"> </w:t>
-      </w:r>
-      <w:r>
-        <w:rPr>
-          <w:rStyle w:val="VerbatimChar"/>
-        </w:rPr>
-        <w:t xml:space="preserve">84.4 percent</w:t>
-      </w:r>
-      <w:r>
-        <w:t xml:space="preserve"> </w:t>
-      </w:r>
-      <w:r>
-        <w:t xml:space="preserve">is the</w:t>
-      </w:r>
-      <w:r>
-        <w:t xml:space="preserve"> </w:t>
-      </w:r>
-      <w:r>
-        <w:rPr>
           <w:b/>
           <w:bCs/>
         </w:rPr>
+        <w:t xml:space="preserve">84.4 percent</w:t>
+      </w:r>
+      <w:r>
+        <w:rPr>
+          <w:b/>
+          <w:bCs/>
+        </w:rPr>
+        <w:t xml:space="preserve"> </w:t>
+      </w:r>
+      <w:r>
+        <w:rPr>
+          <w:b/>
+          <w:bCs/>
+        </w:rPr>
+        <w:t xml:space="preserve">metrics.</w:t>
+      </w:r>
+      <w:r>
+        <w:t xml:space="preserve"> </w:t>
+      </w:r>
+      <w:r>
+        <w:t xml:space="preserve">These figures do not contradict one another because they are not comparable quantities:</w:t>
+      </w:r>
+      <w:r>
+        <w:t xml:space="preserve"> </w:t>
+      </w:r>
+      <w:r>
+        <w:rPr>
+          <w:rStyle w:val="VerbatimChar"/>
+        </w:rPr>
+        <w:t xml:space="preserve">+0.922</w:t>
+      </w:r>
+      <w:r>
+        <w:t xml:space="preserve"> </w:t>
+      </w:r>
+      <w:r>
+        <w:t xml:space="preserve">is the</w:t>
+      </w:r>
+      <w:r>
+        <w:t xml:space="preserve"> </w:t>
+      </w:r>
+      <w:r>
+        <w:rPr>
+          <w:b/>
+          <w:bCs/>
+        </w:rPr>
+        <w:t xml:space="preserve">training-reward peak</w:t>
+      </w:r>
+      <w:r>
+        <w:t xml:space="preserve"> </w:t>
+      </w:r>
+      <w:r>
+        <w:t xml:space="preserve">of the</w:t>
+      </w:r>
+      <w:r>
+        <w:t xml:space="preserve"> </w:t>
+      </w:r>
+      <w:r>
+        <w:rPr>
+          <w:rStyle w:val="VerbatimChar"/>
+        </w:rPr>
+        <w:t xml:space="preserve">campaign_v2_w1_qwen3-8b-base</w:t>
+      </w:r>
+      <w:r>
+        <w:t xml:space="preserve"> </w:t>
+      </w:r>
+      <w:r>
+        <w:t xml:space="preserve">run on</w:t>
+      </w:r>
+      <w:r>
+        <w:t xml:space="preserve"> </w:t>
+      </w:r>
+      <w:r>
+        <w:rPr>
+          <w:rStyle w:val="VerbatimChar"/>
+        </w:rPr>
+        <w:t xml:space="preserve">Qwen/Qwen3-8B-Base</w:t>
+      </w:r>
+      <w:r>
+        <w:t xml:space="preserve"> </w:t>
+      </w:r>
+      <w:r>
+        <w:t xml:space="preserve">(peak = 1.00, last-10 = 0.856, single seed, GRPO</w:t>
+      </w:r>
+      <w:r>
+        <w:t xml:space="preserve"> </w:t>
+      </w:r>
+      <w:r>
+        <w:rPr>
+          <w:rStyle w:val="VerbatimChar"/>
+        </w:rPr>
+        <w:t xml:space="preserve">G=8</w:t>
+      </w:r>
+      <w:r>
+        <w:t xml:space="preserve">,</w:t>
+      </w:r>
+      <w:r>
+        <w:t xml:space="preserve"> </w:t>
+      </w:r>
+      <w:r>
+        <w:rPr>
+          <w:rStyle w:val="VerbatimChar"/>
+        </w:rPr>
+        <w:t xml:space="preserve">lr=1e-5</w:t>
+      </w:r>
+      <w:r>
+        <w:t xml:space="preserve">, 30 steps).</w:t>
+      </w:r>
+      <w:r>
+        <w:t xml:space="preserve"> </w:t>
+      </w:r>
+      <w:r>
+        <w:rPr>
+          <w:rStyle w:val="VerbatimChar"/>
+        </w:rPr>
+        <w:t xml:space="preserve">84.4 percent</w:t>
+      </w:r>
+      <w:r>
+        <w:t xml:space="preserve"> </w:t>
+      </w:r>
+      <w:r>
+        <w:t xml:space="preserve">is the</w:t>
+      </w:r>
+      <w:r>
+        <w:t xml:space="preserve"> </w:t>
+      </w:r>
+      <w:r>
+        <w:rPr>
+          <w:b/>
+          <w:bCs/>
+        </w:rPr>
         <w:t xml:space="preserve">training-reward last-10 mean</w:t>
       </w:r>
       <w:r>
@@ -46307,7 +44892,7 @@
         <w:t xml:space="preserve">lr=3e-5</w:t>
       </w:r>
       <w:r>
-        <w:t xml:space="preserve">. Different checkpoints, different learning rates, different aggregation statistics (peak vs last-10), both are training-stream quantities — neither is a held-out accuracy delta.</w:t>
+        <w:t xml:space="preserve">. Different checkpoints, different learning rates, and different aggregation statistics are involved; neither number is a held-out accuracy delta.</w:t>
       </w:r>
     </w:p>
     <w:p>
@@ -47749,13 +46334,13 @@
           <w:b/>
           <w:bCs/>
         </w:rPr>
-        <w:t xml:space="preserve">W9 (the contradiction):</w:t>
-      </w:r>
-      <w:r>
-        <w:t xml:space="preserve"> </w:t>
-      </w:r>
-      <w:r>
-        <w:t xml:space="preserve">resolved as an accounting error across checkpoint state × metric. On the one comparable axis — held-out GSM8K-500 post-RL — the Qwen3-8B-Base row moves 0.820 -&gt; 0.909 (</w:t>
+        <w:t xml:space="preserve">Metric alignment.</w:t>
+      </w:r>
+      <w:r>
+        <w:t xml:space="preserve"> </w:t>
+      </w:r>
+      <w:r>
+        <w:t xml:space="preserve">On the one comparable axis — held-out GSM8K-500 post-RL — the Qwen3-8B-Base row moves 0.820 -&gt; 0.909 (</w:t>
       </w:r>
       <w:r>
         <w:rPr>
@@ -47848,7 +46433,7 @@
         <w:t xml:space="preserve"> </w:t>
       </w:r>
       <w:r>
-        <w:t xml:space="preserve">in favour of base, but is not statistically supportable at the current seed budget.</w:t>
+        <w:t xml:space="preserve">in favour of base, but it is not statistically supportable at the current seed budget.</w:t>
       </w:r>
     </w:p>
     <w:p>
@@ -47864,13 +46449,13 @@
           <w:b/>
           <w:bCs/>
         </w:rPr>
-        <w:t xml:space="preserve">W11 (base/instruct mixing):</w:t>
-      </w:r>
-      <w:r>
-        <w:t xml:space="preserve"> </w:t>
-      </w:r>
-      <w:r>
-        <w:t xml:space="preserve">pre-RL held-out accuracy is identical between the two rows at 0.820. The entire delta story lives in the post-RL column and is confounded by the extreme seed asymmetry (</w:t>
+        <w:t xml:space="preserve">Base vs. instruct mixing.</w:t>
+      </w:r>
+      <w:r>
+        <w:t xml:space="preserve"> </w:t>
+      </w:r>
+      <w:r>
+        <w:t xml:space="preserve">Pre-RL held-out accuracy is identical between the two Qwen rows at 0.820. The entire delta story therefore lives in the post-RL column and is confounded by the extreme seed asymmetry (</w:t>
       </w:r>
       <w:r>
         <w:rPr>
@@ -47913,13 +46498,13 @@
           <w:b/>
           <w:bCs/>
         </w:rPr>
-        <w:t xml:space="preserve">Q4 (identical conditions):</w:t>
-      </w:r>
-      <w:r>
-        <w:t xml:space="preserve"> </w:t>
-      </w:r>
-      <w:r>
-        <w:t xml:space="preserve">base dominates on training-reward peak (0.856 vs 0.311), instruct dominates on training stability (Llama-3.1-8B Inst train last-10 0.963 vs Base 0.115, ZVF@100 0.285 for Qwen3-8B-Inst vs NA for Base with</w:t>
+        <w:t xml:space="preserve">Matched-condition interpretation.</w:t>
+      </w:r>
+      <w:r>
+        <w:t xml:space="preserve"> </w:t>
+      </w:r>
+      <w:r>
+        <w:t xml:space="preserve">Base dominates on training-reward peak (0.856 vs 0.311), while instruct dominates on training stability (Llama-3.1-8B Inst train last-10 0.963 vs Base 0.115, ZVF@100 0.285 for Qwen3-8B-Inst vs NA for Base with</w:t>
       </w:r>
       <w:r>
         <w:t xml:space="preserve"> </w:t>
@@ -47931,7 +46516,7 @@
         <w:t xml:space="preserve">n = 1</w:t>
       </w:r>
       <w:r>
-        <w:t xml:space="preserve">). The bitter-lesson narrative is rephrased from</w:t>
+        <w:t xml:space="preserve">). The narrative is therefore narrowed from</w:t>
       </w:r>
       <w:r>
         <w:t xml:space="preserve"> </w:t>
@@ -47943,13 +46528,7 @@
         <w:t xml:space="preserve"> </w:t>
       </w:r>
       <w:r>
-        <w:t xml:space="preserve">to the narrower and supportable</w:t>
-      </w:r>
-      <w:r>
-        <w:t xml:space="preserve"> </w:t>
-      </w:r>
-      <w:r>
-        <w:t xml:space="preserve">“base has more headroom on the training-reward peak metric; held-out post-RL gain is not demonstrated at</w:t>
+        <w:t xml:space="preserve">to the more supportable claim that base shows more headroom on the training-reward peak metric, while held-out post-RL gain is not demonstrated at</w:t>
       </w:r>
       <w:r>
         <w:t xml:space="preserve"> </w:t>
@@ -47961,7 +46540,7 @@
         <w:t xml:space="preserve">n &gt;= 5</w:t>
       </w:r>
       <w:r>
-        <w:t xml:space="preserve">.”</w:t>
+        <w:t xml:space="preserve">.</w:t>
       </w:r>
     </w:p>
     <w:p>
@@ -48061,7 +46640,7 @@
         <w:pStyle w:val="Heading4"/>
       </w:pPr>
       <w:r>
-        <w:t xml:space="preserve">10.6.3 Summary</w:t>
+        <w:t xml:space="preserve">Summary</w:t>
       </w:r>
     </w:p>
     <w:p>
@@ -48073,17 +46652,7 @@
         </w:numPr>
       </w:pPr>
       <w:r>
-        <w:rPr>
-          <w:b/>
-          <w:bCs/>
-        </w:rPr>
-        <w:t xml:space="preserve">W8</w:t>
-      </w:r>
-      <w:r>
-        <w:t xml:space="preserve"> </w:t>
-      </w:r>
-      <w:r>
-        <w:t xml:space="preserve">— resolved. P1 top-10 selection bias quantified at a mean of</w:t>
+        <w:t xml:space="preserve">P1 top-10 selection bias is quantified at a mean of</w:t>
       </w:r>
       <w:r>
         <w:t xml:space="preserve"> </w:t>
@@ -48125,7 +46694,7 @@
         <w:t xml:space="preserve"> </w:t>
       </w:r>
       <w:r>
-        <w:t xml:space="preserve">on the high-variance Wave-6 batch-1 condition); 34 of 36 pairwise orderings (94.4 percent) preserved P1 -&gt; P2; headline numbers restated in random-deployment (P2) terms.</w:t>
+        <w:t xml:space="preserve">on the high-variance Wave-6 batch-1 condition); 34 of 36 pairwise orderings (94.4 percent) are preserved P1 -&gt; P2, so headline numbers are restated in random-deployment (P2) terms.</w:t>
       </w:r>
     </w:p>
     <w:p>
@@ -48137,17 +46706,7 @@
         </w:numPr>
       </w:pPr>
       <w:r>
-        <w:rPr>
-          <w:b/>
-          <w:bCs/>
-        </w:rPr>
-        <w:t xml:space="preserve">W9</w:t>
-      </w:r>
-      <w:r>
-        <w:t xml:space="preserve"> </w:t>
-      </w:r>
-      <w:r>
-        <w:t xml:space="preserve">— resolved.</w:t>
+        <w:t xml:space="preserve">The</w:t>
       </w:r>
       <w:r>
         <w:t xml:space="preserve"> </w:t>
@@ -48177,7 +46736,7 @@
         <w:t xml:space="preserve"> </w:t>
       </w:r>
       <w:r>
-        <w:t xml:space="preserve">are different metrics on different checkpoints; paired grid gives the aligned comparison.</w:t>
+        <w:t xml:space="preserve">figures refer to different metrics on different checkpoints; the paired grid provides the aligned comparison.</w:t>
       </w:r>
     </w:p>
     <w:p>
@@ -48189,17 +46748,7 @@
         </w:numPr>
       </w:pPr>
       <w:r>
-        <w:rPr>
-          <w:b/>
-          <w:bCs/>
-        </w:rPr>
-        <w:t xml:space="preserve">W11</w:t>
-      </w:r>
-      <w:r>
-        <w:t xml:space="preserve"> </w:t>
-      </w:r>
-      <w:r>
-        <w:t xml:space="preserve">— resolved. Explicit</w:t>
+        <w:t xml:space="preserve">An explicit</w:t>
       </w:r>
       <w:r>
         <w:t xml:space="preserve"> </w:t>
@@ -48229,7 +46778,7 @@
         <w:t xml:space="preserve"> </w:t>
       </w:r>
       <w:r>
-        <w:t xml:space="preserve">notation contract in force; three implicit-mixing claims retracted.</w:t>
+        <w:t xml:space="preserve">notation contract is now in force, and earlier implicit mixing between checkpoint types has been removed.</w:t>
       </w:r>
     </w:p>
     <w:p>
@@ -48241,17 +46790,7 @@
         </w:numPr>
       </w:pPr>
       <w:r>
-        <w:rPr>
-          <w:b/>
-          <w:bCs/>
-        </w:rPr>
-        <w:t xml:space="preserve">Q4</w:t>
-      </w:r>
-      <w:r>
-        <w:t xml:space="preserve"> </w:t>
-      </w:r>
-      <w:r>
-        <w:t xml:space="preserve">— partially resolved. Qwen3-8B and Llama-3.1-8B base/instruct pairs complete; Qwen3-1.7B and Qwen3-0.6B flagged</w:t>
+        <w:t xml:space="preserve">Qwen3-8B and Llama-3.1-8B base/instruct pairs are complete; Qwen3-1.7B and Qwen3-0.6B remain</w:t>
       </w:r>
       <w:r>
         <w:t xml:space="preserve"> </w:t>
@@ -48266,7 +46805,7 @@
         <w:t xml:space="preserve"> </w:t>
       </w:r>
       <w:r>
-        <w:t xml:space="preserve">in the TSV and listed as the remaining audit gap pending compute allocation.</w:t>
+        <w:t xml:space="preserve">in the TSV and are listed as audit gaps pending further compute.</w:t>
       </w:r>
     </w:p>
     <w:bookmarkEnd w:id="131"/>
@@ -48279,48 +46818,6 @@
       </w:pPr>
       <w:r>
         <w:t xml:space="preserve">6. Summary of Findings</w:t>
-      </w:r>
-    </w:p>
-    <w:p>
-      <w:pPr>
-        <w:pStyle w:val="BlockText"/>
-      </w:pPr>
-      <w:r>
-        <w:rPr>
-          <w:b/>
-          <w:bCs/>
-        </w:rPr>
-        <w:t xml:space="preserve">Revision note (2026-04-19).</w:t>
-      </w:r>
-      <w:r>
-        <w:t xml:space="preserve"> </w:t>
-      </w:r>
-      <w:r>
-        <w:t xml:space="preserve">The findings below have been audited against NeurIPS 2026 reviewer feedback. Concerns that required scope or wording changes are flagged in the rightmost column; full rebuttal detail is in §§5.8.1, 5.12.1, 5.16.1, 5.17–5.19 and §§2.7–2.8. A mechanical registry of all 24 weaknesses is at</w:t>
-      </w:r>
-      <w:r>
-        <w:t xml:space="preserve"> </w:t>
-      </w:r>
-      <w:r>
-        <w:rPr>
-          <w:rStyle w:val="VerbatimChar"/>
-        </w:rPr>
-        <w:t xml:space="preserve">paper/reviewer_points.yaml</w:t>
-      </w:r>
-      <w:r>
-        <w:t xml:space="preserve">, scored by</w:t>
-      </w:r>
-      <w:r>
-        <w:t xml:space="preserve"> </w:t>
-      </w:r>
-      <w:r>
-        <w:rPr>
-          <w:rStyle w:val="VerbatimChar"/>
-        </w:rPr>
-        <w:t xml:space="preserve">scripts/reviewer_response_score.sh</w:t>
-      </w:r>
-      <w:r>
-        <w:t xml:space="preserve">.</w:t>
       </w:r>
     </w:p>
     <w:tbl>
@@ -51209,13 +49706,13 @@
           <w:b/>
           <w:bCs/>
         </w:rPr>
-        <w:t xml:space="preserve">NeurIPS 2026 reviewer rebuttal (all 24 items).</w:t>
-      </w:r>
-      <w:r>
-        <w:t xml:space="preserve"> </w:t>
-      </w:r>
-      <w:r>
-        <w:t xml:space="preserve">ZVF formalization + partial-correlation ablation (W1/Q1), cross-framework pipeline (W13), group-size token-normalization and gradient-utilization formalization (W2/W3/Q2), framework-gap config dumps (W6/Q3), evidence-tier partition + F1–F5 survival (W4/W5/Q5), tool-use/code reward-design analysis and ERF surrogate (W7/Q6), held-out stratified sampling P1/P2/P3 (W8), base-vs-instruct paired evaluation (W9/W11/Q4), F5 scope downgrade (W10), regenerated figures (W12), AERO/CPPO/NGRPO/Scaf-GRPO head-to-head (W14/Q7), Tree-GRPO/PRM (W15), ST-PPO (W16), DAR/dual-KL (W17). See §§2.7–2.8 and §§5.8.1, 5.12.1, 5.16.1, 5.17–5.19.</w:t>
+        <w:t xml:space="preserve">Statistical and reporting hardening across the report.</w:t>
+      </w:r>
+      <w:r>
+        <w:t xml:space="preserve"> </w:t>
+      </w:r>
+      <w:r>
+        <w:t xml:space="preserve">This version adds formal ZVF definitions and partial-correlation analysis, a cross-framework pipeline specification, token-budget-normalized group-size analysis, framework configuration disclosure, evidence-tier partitioning for F1–F5, tool-use/code reward-design analysis with ERF, held-out sampling protocols (P1/P2/P3), base-vs-instruct paired evaluation, tighter frontier-scope wording, regenerated figures, and expanded related work on AERO/CPPO/NGRPO/Scaf-GRPO, Tree-GRPO/PRM, ST-PPO, and DAR. See §§2.7–2.8 and §§5.8.1, 5.12.1, 5.16.1, 5.17–5.19.</w:t>
       </w:r>
     </w:p>
     <w:p>

</xml_diff>

<commit_message>
Fix SRNs in group 6 capstone report; make build script portable
Correct Arvind's SRN (DS006 -> DS140) and add the missing SRNs for
Sandhya, Arumugam, Dhruva, and Mohammad in the canonical capstone .md
and staging copy. Regenerate .tex and .docx via pandoc. Switch the
build script fonts from macOS-only (Times New Roman / STIX Two Math /
Menlo) to portable equivalents (TeX Gyre Termes / Latin Modern Math /
DejaVu Sans Mono) so the script builds on Linux and Mac.

Co-Authored-By: Claude Opus 4.7 (1M context) <noreply@anthropic.com>
</commit_message>
<xml_diff>
--- a/reports/final/group6_final_report.docx
+++ b/reports/final/group6_final_report.docx
@@ -87,7 +87,7 @@
         <w:pStyle w:val="BodyText"/>
       </w:pPr>
       <w:r>
-        <w:t xml:space="preserve">Arvind C R (PES2PGE24DS006), Sandhya Jeyaraj, Arumugam Chetty K, Madhu Kumara L (PES2PGE24DS176), Dhruva N Murthy, Mohammad Rafi, Anwesh Reddy Paduri, Prof. Narayana Darapaneni</w:t>
+        <w:t xml:space="preserve">Arvind C R (PES2PGE24DS140), Sandhya Jeyaraj (PES2PGE24DS144), Arumugam Chetty K (PES2PGE24DS137), Madhu Kumara L (PES2PGE24DS176), Dhruva N Murthy (PES2PGE23DS169), Mohammad Rafi (PES2PGE24DS157), Anwesh Reddy Paduri, Prof. Narayana Darapaneni</w:t>
       </w:r>
     </w:p>
     <w:p>
@@ -569,6 +569,15 @@
     <w:bookmarkStart w:id="11" w:name="introduction"/>
     <w:p>
       <w:pPr>
+        <w:sectPr>
+          <w:footnotePr>
+            <w:numRestart w:val="eachSect"/>
+          </w:footnotePr>
+        </w:sectPr>
+      </w:pPr>
+    </w:p>
+    <w:p>
+      <w:pPr>
         <w:pStyle w:val="Heading1"/>
       </w:pPr>
       <w:r>
@@ -700,6 +709,15 @@
     <w:bookmarkEnd w:id="10"/>
     <w:bookmarkEnd w:id="11"/>
     <w:bookmarkStart w:id="37" w:name="related-work"/>
+    <w:p>
+      <w:pPr>
+        <w:sectPr>
+          <w:footnotePr>
+            <w:numRestart w:val="eachSect"/>
+          </w:footnotePr>
+        </w:sectPr>
+      </w:pPr>
+    </w:p>
     <w:p>
       <w:pPr>
         <w:pStyle w:val="Heading1"/>
@@ -7243,6 +7261,15 @@
     <w:bookmarkStart w:id="91" w:name="experiments"/>
     <w:p>
       <w:pPr>
+        <w:sectPr>
+          <w:footnotePr>
+            <w:numRestart w:val="eachSect"/>
+          </w:footnotePr>
+        </w:sectPr>
+      </w:pPr>
+    </w:p>
+    <w:p>
+      <w:pPr>
         <w:pStyle w:val="Heading1"/>
       </w:pPr>
       <w:r>
@@ -25893,6 +25920,15 @@
     <w:bookmarkEnd w:id="90"/>
     <w:bookmarkEnd w:id="91"/>
     <w:bookmarkStart w:id="133" w:name="results-and-analysis"/>
+    <w:p>
+      <w:pPr>
+        <w:sectPr>
+          <w:footnotePr>
+            <w:numRestart w:val="eachSect"/>
+          </w:footnotePr>
+        </w:sectPr>
+      </w:pPr>
+    </w:p>
     <w:p>
       <w:pPr>
         <w:pStyle w:val="Heading1"/>
@@ -45861,6 +45897,15 @@
     <w:bookmarkStart w:id="136" w:name="summary-of-findings"/>
     <w:p>
       <w:pPr>
+        <w:sectPr>
+          <w:footnotePr>
+            <w:numRestart w:val="eachSect"/>
+          </w:footnotePr>
+        </w:sectPr>
+      </w:pPr>
+    </w:p>
+    <w:p>
+      <w:pPr>
         <w:pStyle w:val="Heading1"/>
       </w:pPr>
       <w:r>
@@ -48545,6 +48590,15 @@
     <w:bookmarkStart w:id="140" w:name="remaining-gaps-and-future-work"/>
     <w:p>
       <w:pPr>
+        <w:sectPr>
+          <w:footnotePr>
+            <w:numRestart w:val="eachSect"/>
+          </w:footnotePr>
+        </w:sectPr>
+      </w:pPr>
+    </w:p>
+    <w:p>
+      <w:pPr>
         <w:pStyle w:val="Heading1"/>
       </w:pPr>
       <w:r>
@@ -49317,6 +49371,15 @@
     <w:bookmarkEnd w:id="139"/>
     <w:bookmarkEnd w:id="140"/>
     <w:bookmarkStart w:id="149" w:name="experimental-details"/>
+    <w:p>
+      <w:pPr>
+        <w:sectPr>
+          <w:footnotePr>
+            <w:numRestart w:val="eachSect"/>
+          </w:footnotePr>
+        </w:sectPr>
+      </w:pPr>
+    </w:p>
     <w:p>
       <w:pPr>
         <w:pStyle w:val="Heading1"/>
@@ -56272,6 +56335,15 @@
     <w:bookmarkStart w:id="150" w:name="author-contributions"/>
     <w:p>
       <w:pPr>
+        <w:sectPr>
+          <w:footnotePr>
+            <w:numRestart w:val="eachSect"/>
+          </w:footnotePr>
+        </w:sectPr>
+      </w:pPr>
+    </w:p>
+    <w:p>
+      <w:pPr>
         <w:pStyle w:val="Heading1"/>
       </w:pPr>
       <w:r>
@@ -56493,6 +56565,15 @@
     </w:p>
     <w:bookmarkEnd w:id="150"/>
     <w:bookmarkStart w:id="151" w:name="conclusion"/>
+    <w:p>
+      <w:pPr>
+        <w:sectPr>
+          <w:footnotePr>
+            <w:numRestart w:val="eachSect"/>
+          </w:footnotePr>
+        </w:sectPr>
+      </w:pPr>
+    </w:p>
     <w:p>
       <w:pPr>
         <w:pStyle w:val="Heading1"/>
@@ -56691,6 +56772,15 @@
     </w:p>
     <w:bookmarkEnd w:id="151"/>
     <w:bookmarkStart w:id="152" w:name="references"/>
+    <w:p>
+      <w:pPr>
+        <w:sectPr>
+          <w:footnotePr>
+            <w:numRestart w:val="eachSect"/>
+          </w:footnotePr>
+        </w:sectPr>
+      </w:pPr>
+    </w:p>
     <w:p>
       <w:pPr>
         <w:pStyle w:val="Heading1"/>

</xml_diff>